<commit_message>
Fix Batch 4 Word units, slurry labels and zero spacer dosage
</commit_message>
<xml_diff>
--- a/master_template.docx
+++ b/master_template.docx
@@ -8237,7 +8237,7 @@
             </w:r>
             <w:proofErr w:type="gramEnd"/>
             <w:r>
-              <w:t>} m</w:t>
+              <w:t>}</w:t>
             </w:r>
           </w:p>
         </w:tc>
@@ -8299,7 +8299,7 @@
             </w:r>
             <w:proofErr w:type="gramEnd"/>
             <w:r>
-              <w:t>} m</w:t>
+              <w:t>}</w:t>
             </w:r>
           </w:p>
         </w:tc>

</xml_diff>

<commit_message>
feat(lab): implement Round 5-1 rheology
</commit_message>
<xml_diff>
--- a/master_template.docx
+++ b/master_template.docx
@@ -14793,7 +14793,7 @@
             </w:r>
             <w:proofErr w:type="spellStart"/>
             <w:r>
-              <w:t>degF</w:t>
+              <w:t>{{ s.lab.bhct }} degF</w:t>
             </w:r>
             <w:proofErr w:type="spellEnd"/>
           </w:p>
@@ -14968,7 +14968,7 @@
                 <w:szCs w:val="20"/>
                 <w:lang w:bidi="fa-IR"/>
               </w:rPr>
-              <w:t>-</w:t>
+              <w:t>{{ s.lab.rheology.get('surface_down', {}).get('300', '-') }}</w:t>
             </w:r>
           </w:p>
         </w:tc>
@@ -14982,7 +14982,7 @@
               <w:pStyle w:val="NormalTab"/>
             </w:pPr>
             <w:r>
-              <w:t>-</w:t>
+              <w:t>{{ s.lab.rheology.get('bhct_up', {}).get('300', '-') }}</w:t>
             </w:r>
           </w:p>
         </w:tc>
@@ -14997,7 +14997,7 @@
               <w:pStyle w:val="NormalTab"/>
             </w:pPr>
             <w:r>
-              <w:t>-</w:t>
+              <w:t>{{ s.lab.rheology.get('bhct_down', {}).get('300', '-') }}</w:t>
             </w:r>
           </w:p>
         </w:tc>
@@ -15051,7 +15051,7 @@
                 <w:szCs w:val="20"/>
                 <w:lang w:bidi="fa-IR"/>
               </w:rPr>
-              <w:t>-</w:t>
+              <w:t>{{ s.lab.rheology.get('surface_down', {}).get('200', '-') }}</w:t>
             </w:r>
           </w:p>
         </w:tc>
@@ -15065,7 +15065,7 @@
               <w:pStyle w:val="NormalTab"/>
             </w:pPr>
             <w:r>
-              <w:t>-</w:t>
+              <w:t>{{ s.lab.rheology.get('bhct_up', {}).get('200', '-') }}</w:t>
             </w:r>
           </w:p>
         </w:tc>
@@ -15080,7 +15080,7 @@
               <w:pStyle w:val="NormalTab"/>
             </w:pPr>
             <w:r>
-              <w:t>-</w:t>
+              <w:t>{{ s.lab.rheology.get('bhct_down', {}).get('200', '-') }}</w:t>
             </w:r>
           </w:p>
         </w:tc>
@@ -15134,7 +15134,7 @@
                 <w:szCs w:val="20"/>
                 <w:lang w:bidi="fa-IR"/>
               </w:rPr>
-              <w:t>-</w:t>
+              <w:t>{{ s.lab.rheology.get('surface_down', {}).get('100', '-') }}</w:t>
             </w:r>
           </w:p>
         </w:tc>
@@ -15148,7 +15148,7 @@
               <w:pStyle w:val="NormalTab"/>
             </w:pPr>
             <w:r>
-              <w:t>-</w:t>
+              <w:t>{{ s.lab.rheology.get('bhct_up', {}).get('100', '-') }}</w:t>
             </w:r>
           </w:p>
         </w:tc>
@@ -15163,7 +15163,7 @@
               <w:pStyle w:val="NormalTab"/>
             </w:pPr>
             <w:r>
-              <w:t>-</w:t>
+              <w:t>{{ s.lab.rheology.get('bhct_down', {}).get('100', '-') }}</w:t>
             </w:r>
           </w:p>
         </w:tc>
@@ -15217,7 +15217,7 @@
                 <w:szCs w:val="20"/>
                 <w:lang w:bidi="fa-IR"/>
               </w:rPr>
-              <w:t>-</w:t>
+              <w:t>{{ s.lab.rheology.get('surface_down', {}).get('60', '-') }}</w:t>
             </w:r>
           </w:p>
         </w:tc>
@@ -15231,7 +15231,7 @@
               <w:pStyle w:val="NormalTab"/>
             </w:pPr>
             <w:r>
-              <w:t>-</w:t>
+              <w:t>{{ s.lab.rheology.get('bhct_up', {}).get('60', '-') }}</w:t>
             </w:r>
           </w:p>
         </w:tc>
@@ -15246,7 +15246,7 @@
               <w:pStyle w:val="NormalTab"/>
             </w:pPr>
             <w:r>
-              <w:t>-</w:t>
+              <w:t>{{ s.lab.rheology.get('bhct_down', {}).get('60', '-') }}</w:t>
             </w:r>
           </w:p>
         </w:tc>
@@ -15300,7 +15300,7 @@
                 <w:szCs w:val="20"/>
                 <w:lang w:bidi="fa-IR"/>
               </w:rPr>
-              <w:t>-</w:t>
+              <w:t>{{ s.lab.rheology.get('surface_down', {}).get('30', '-') }}</w:t>
             </w:r>
           </w:p>
         </w:tc>
@@ -15314,7 +15314,7 @@
               <w:pStyle w:val="NormalTab"/>
             </w:pPr>
             <w:r>
-              <w:t>-</w:t>
+              <w:t>{{ s.lab.rheology.get('bhct_up', {}).get('30', '-') }}</w:t>
             </w:r>
           </w:p>
         </w:tc>
@@ -15329,7 +15329,7 @@
               <w:pStyle w:val="NormalTab"/>
             </w:pPr>
             <w:r>
-              <w:t>-</w:t>
+              <w:t>{{ s.lab.rheology.get('bhct_down', {}).get('30', '-') }}</w:t>
             </w:r>
           </w:p>
         </w:tc>
@@ -15383,7 +15383,7 @@
                 <w:szCs w:val="20"/>
                 <w:lang w:bidi="fa-IR"/>
               </w:rPr>
-              <w:t>-</w:t>
+              <w:t>{{ s.lab.rheology.get('surface_down', {}).get('6', '-') }}</w:t>
             </w:r>
           </w:p>
         </w:tc>
@@ -15397,7 +15397,7 @@
               <w:pStyle w:val="NormalTab"/>
             </w:pPr>
             <w:r>
-              <w:t>-</w:t>
+              <w:t>{{ s.lab.rheology.get('bhct_up', {}).get('6', '-') }}</w:t>
             </w:r>
           </w:p>
         </w:tc>
@@ -15412,7 +15412,7 @@
               <w:pStyle w:val="NormalTab"/>
             </w:pPr>
             <w:r>
-              <w:t>-</w:t>
+              <w:t>{{ s.lab.rheology.get('bhct_down', {}).get('6', '-') }}</w:t>
             </w:r>
           </w:p>
         </w:tc>
@@ -15466,7 +15466,7 @@
                 <w:szCs w:val="20"/>
                 <w:lang w:bidi="fa-IR"/>
               </w:rPr>
-              <w:t>-</w:t>
+              <w:t>{{ s.lab.rheology.get('surface_down', {}).get('3', '-') }}</w:t>
             </w:r>
           </w:p>
         </w:tc>
@@ -15480,7 +15480,7 @@
               <w:pStyle w:val="NormalTab"/>
             </w:pPr>
             <w:r>
-              <w:t>-</w:t>
+              <w:t>{{ s.lab.rheology.get('bhct_up', {}).get('3', '-') }}</w:t>
             </w:r>
           </w:p>
         </w:tc>
@@ -15495,7 +15495,7 @@
               <w:pStyle w:val="NormalTab"/>
             </w:pPr>
             <w:r>
-              <w:t>-</w:t>
+              <w:t>{{ s.lab.rheology.get('bhct_down', {}).get('3', '-') }}</w:t>
             </w:r>
           </w:p>
         </w:tc>
@@ -15562,7 +15562,7 @@
                 <w:szCs w:val="20"/>
                 <w:lang w:bidi="fa-IR"/>
               </w:rPr>
-              <w:t>-</w:t>
+              <w:t>{{ s.lab.rheology.get('surface_down', {}).get('pv_cp', '-') }}</w:t>
             </w:r>
           </w:p>
         </w:tc>
@@ -15576,7 +15576,7 @@
               <w:pStyle w:val="NormalTab"/>
             </w:pPr>
             <w:r>
-              <w:t>-</w:t>
+              <w:t>{{ s.lab.rheology.get('bhct_up', {}).get('pv_cp', '-') }}</w:t>
             </w:r>
           </w:p>
         </w:tc>
@@ -15591,7 +15591,7 @@
               <w:pStyle w:val="NormalTab"/>
             </w:pPr>
             <w:r>
-              <w:t>-</w:t>
+              <w:t>{{ s.lab.rheology.get('bhct_down', {}).get('pv_cp', '-') }}</w:t>
             </w:r>
           </w:p>
         </w:tc>
@@ -15662,7 +15662,7 @@
                 <w:szCs w:val="20"/>
                 <w:lang w:bidi="fa-IR"/>
               </w:rPr>
-              <w:t>-</w:t>
+              <w:t>{{ s.lab.rheology.get('surface_down', {}).get('ty_lbf_100ft2', '-') }}</w:t>
             </w:r>
           </w:p>
         </w:tc>
@@ -15676,7 +15676,7 @@
               <w:pStyle w:val="NormalTab"/>
             </w:pPr>
             <w:r>
-              <w:t>-</w:t>
+              <w:t>{{ s.lab.rheology.get('bhct_up', {}).get('ty_lbf_100ft2', '-') }}</w:t>
             </w:r>
           </w:p>
         </w:tc>
@@ -15691,7 +15691,7 @@
               <w:pStyle w:val="NormalTab"/>
             </w:pPr>
             <w:r>
-              <w:t>-</w:t>
+              <w:t>{{ s.lab.rheology.get('bhct_down', {}).get('ty_lbf_100ft2', '-') }}</w:t>
             </w:r>
           </w:p>
         </w:tc>
@@ -15729,7 +15729,7 @@
               <w:pStyle w:val="NormalTab"/>
             </w:pPr>
             <w:r>
-              <w:t>-</w:t>
+              <w:t>{{ s.lab.rheology.get('surface_down', {}).get('gel_10_sec', '-') }}</w:t>
             </w:r>
           </w:p>
         </w:tc>
@@ -15744,7 +15744,7 @@
               <w:pStyle w:val="NormalTab"/>
             </w:pPr>
             <w:r>
-              <w:t>-</w:t>
+              <w:t>{{ s.lab.rheology.get('bhct_up', {}).get('gel_10_sec', '-') }}</w:t>
             </w:r>
           </w:p>
         </w:tc>
@@ -15759,7 +15759,7 @@
               <w:pStyle w:val="NormalTab"/>
             </w:pPr>
             <w:r>
-              <w:t>-</w:t>
+              <w:t>{{ s.lab.rheology.get('bhct_down', {}).get('gel_10_sec', '-') }}</w:t>
             </w:r>
           </w:p>
         </w:tc>
@@ -15797,7 +15797,7 @@
               <w:pStyle w:val="NormalTab"/>
             </w:pPr>
             <w:r>
-              <w:t>-</w:t>
+              <w:t>{{ s.lab.rheology.get('surface_down', {}).get('gel_10_min', '-') }}</w:t>
             </w:r>
           </w:p>
         </w:tc>
@@ -15812,7 +15812,7 @@
               <w:pStyle w:val="NormalTab"/>
             </w:pPr>
             <w:r>
-              <w:t>-</w:t>
+              <w:t>{{ s.lab.rheology.get('bhct_up', {}).get('gel_10_min', '-') }}</w:t>
             </w:r>
           </w:p>
         </w:tc>
@@ -15827,7 +15827,7 @@
               <w:pStyle w:val="NormalTab"/>
             </w:pPr>
             <w:r>
-              <w:t>-</w:t>
+              <w:t>{{ s.lab.rheology.get('bhct_down', {}).get('gel_10_min', '-') }}</w:t>
             </w:r>
           </w:p>
         </w:tc>

</xml_diff>

<commit_message>
feat(lab): implement Round 5-2 thickening test
</commit_message>
<xml_diff>
--- a/master_template.docx
+++ b/master_template.docx
@@ -16766,19 +16766,19 @@
               <w:pStyle w:val="NormalTab"/>
             </w:pPr>
             <w:r>
-              <w:t>Initial Temp</w:t>
+              <w:t>Enter Time</w:t>
             </w:r>
             <w:r>
               <w:br/>
-              <w:t xml:space="preserve"> (</w:t>
+              <w:t xml:space="preserve"/>
             </w:r>
             <w:proofErr w:type="spellStart"/>
             <w:r>
-              <w:t>degF</w:t>
+              <w:t>hr:mm</w:t>
             </w:r>
             <w:proofErr w:type="spellEnd"/>
             <w:r>
-              <w:t>)</w:t>
+              <w:t/>
             </w:r>
           </w:p>
         </w:tc>
@@ -16882,7 +16882,7 @@
               <w:pStyle w:val="NormalTab"/>
             </w:pPr>
             <w:r>
-              <w:t>{{ s.lab.thickening_endpoint_label }}</w:t>
+              <w:t>70 Bc</w:t>
             </w:r>
             <w:r>
               <w:br/>
@@ -16968,27 +16968,27 @@
               <w:pStyle w:val="NormalTab"/>
             </w:pPr>
             <w:r>
+              <w:t xml:space="preserve">{{ s.lab.thickening_enter_time }}</w:t>
+            </w:r>
+          </w:p>
+        </w:tc>
+        <w:tc>
+          <w:tcPr>
+            <w:tcW w:w="1274" w:type="dxa"/>
+            <w:vAlign w:val="center"/>
+            <w:hideMark/>
+          </w:tcPr>
+          <w:p>
+            <w:pPr>
+              <w:pStyle w:val="NormalTab"/>
+            </w:pPr>
+            <w:r>
               <w:t xml:space="preserve">-</w:t>
             </w:r>
           </w:p>
         </w:tc>
         <w:tc>
           <w:tcPr>
-            <w:tcW w:w="1274" w:type="dxa"/>
-            <w:vAlign w:val="center"/>
-            <w:hideMark/>
-          </w:tcPr>
-          <w:p>
-            <w:pPr>
-              <w:pStyle w:val="NormalTab"/>
-            </w:pPr>
-            <w:r>
-              <w:t xml:space="preserve">-</w:t>
-            </w:r>
-          </w:p>
-        </w:tc>
-        <w:tc>
-          <w:tcPr>
             <w:tcW w:w="947" w:type="dxa"/>
             <w:vAlign w:val="center"/>
           </w:tcPr>
@@ -16997,7 +16997,7 @@
               <w:pStyle w:val="NormalTab"/>
             </w:pPr>
             <w:r>
-              <w:t xml:space="preserve">-</w:t>
+              <w:t xml:space="preserve">{{ s.lab.thickening_test_start }}</w:t>
             </w:r>
           </w:p>
         </w:tc>
@@ -17011,7 +17011,7 @@
               <w:pStyle w:val="NormalTab"/>
             </w:pPr>
             <w:r>
-              <w:t xml:space="preserve">-</w:t>
+              <w:t xml:space="preserve">{{ s.lab.thickening_cell }}</w:t>
             </w:r>
           </w:p>
         </w:tc>
@@ -17025,7 +17025,7 @@
               <w:pStyle w:val="NormalTab"/>
             </w:pPr>
             <w:r>
-              <w:t xml:space="preserve">-</w:t>
+              <w:t xml:space="preserve">{{ s.lab.thickening_30_bc }}</w:t>
             </w:r>
           </w:p>
         </w:tc>
@@ -17039,7 +17039,7 @@
               <w:pStyle w:val="NormalTab"/>
             </w:pPr>
             <w:r>
-              <w:t xml:space="preserve">-</w:t>
+              <w:t xml:space="preserve">{{ s.lab.thickening_50_bc }}</w:t>
             </w:r>
           </w:p>
         </w:tc>

</xml_diff>

<commit_message>
feat(lab): implement Round 5-3 compressive strength
</commit_message>
<xml_diff>
--- a/master_template.docx
+++ b/master_template.docx
@@ -17622,7 +17622,7 @@
               <w:pStyle w:val="NormalTab"/>
             </w:pPr>
             <w:r>
-              <w:t xml:space="preserve">-</w:t>
+              <w:t xml:space="preserve">08:00</w:t>
             </w:r>
           </w:p>
         </w:tc>
@@ -17644,7 +17644,7 @@
               <w:pStyle w:val="NormalTab"/>
             </w:pPr>
             <w:r>
-              <w:t xml:space="preserve">-</w:t>
+              <w:t xml:space="preserve">12:00</w:t>
             </w:r>
           </w:p>
         </w:tc>
@@ -17666,7 +17666,7 @@
               <w:pStyle w:val="NormalTab"/>
             </w:pPr>
             <w:r>
-              <w:t xml:space="preserve">-</w:t>
+              <w:t xml:space="preserve">24:00</w:t>
             </w:r>
           </w:p>
         </w:tc>
@@ -17717,7 +17717,7 @@
               <w:pStyle w:val="NormalTab"/>
             </w:pPr>
             <w:r>
-              <w:t xml:space="preserve">-</w:t>
+              <w:t xml:space="preserve">{{ s.lab.crush_force_1 }}</w:t>
             </w:r>
           </w:p>
         </w:tc>
@@ -17738,7 +17738,7 @@
               <w:pStyle w:val="NormalTab"/>
             </w:pPr>
             <w:r>
-              <w:t xml:space="preserve">-</w:t>
+              <w:t xml:space="preserve">{{ s.lab.crush_force_2 }}</w:t>
             </w:r>
           </w:p>
         </w:tc>
@@ -17759,7 +17759,7 @@
               <w:pStyle w:val="NormalTab"/>
             </w:pPr>
             <w:r>
-              <w:t xml:space="preserve">-</w:t>
+              <w:t xml:space="preserve">{{ s.lab.crush_force_3 }}</w:t>
             </w:r>
           </w:p>
         </w:tc>
@@ -17780,7 +17780,7 @@
               <w:pStyle w:val="NormalTab"/>
             </w:pPr>
             <w:r>
-              <w:t xml:space="preserve">-</w:t>
+              <w:t xml:space="preserve">{{ s.lab.crush_force_4 }}</w:t>
             </w:r>
           </w:p>
         </w:tc>
@@ -17829,7 +17829,7 @@
               <w:pStyle w:val="NormalTab"/>
             </w:pPr>
             <w:r>
-              <w:t xml:space="preserve">-</w:t>
+              <w:t xml:space="preserve">{{ s.lab.uca_cs_8 }}</w:t>
             </w:r>
           </w:p>
         </w:tc>
@@ -17850,7 +17850,7 @@
               <w:pStyle w:val="NormalTab"/>
             </w:pPr>
             <w:r>
-              <w:t xml:space="preserve">-</w:t>
+              <w:t xml:space="preserve">{{ s.lab.uca_cs_12 }}</w:t>
             </w:r>
           </w:p>
         </w:tc>
@@ -17871,7 +17871,7 @@
               <w:pStyle w:val="NormalTab"/>
             </w:pPr>
             <w:r>
-              <w:t xml:space="preserve">-</w:t>
+              <w:t xml:space="preserve">{{ s.lab.uca_cs_24 }}</w:t>
             </w:r>
           </w:p>
         </w:tc>
@@ -17915,7 +17915,7 @@
               <w:pStyle w:val="NormalTab"/>
             </w:pPr>
             <w:r>
-              <w:t xml:space="preserve">-</w:t>
+              <w:t xml:space="preserve">4</w:t>
             </w:r>
           </w:p>
         </w:tc>
@@ -17937,7 +17937,7 @@
               <w:pStyle w:val="NormalTab"/>
             </w:pPr>
             <w:r>
-              <w:t xml:space="preserve">-</w:t>
+              <w:t xml:space="preserve">4</w:t>
             </w:r>
           </w:p>
         </w:tc>
@@ -17959,7 +17959,7 @@
               <w:pStyle w:val="NormalTab"/>
             </w:pPr>
             <w:r>
-              <w:t xml:space="preserve">-</w:t>
+              <w:t xml:space="preserve">4</w:t>
             </w:r>
           </w:p>
         </w:tc>
@@ -17981,7 +17981,7 @@
               <w:pStyle w:val="NormalTab"/>
             </w:pPr>
             <w:r>
-              <w:t xml:space="preserve">-</w:t>
+              <w:t xml:space="preserve">4</w:t>
             </w:r>
           </w:p>
         </w:tc>
@@ -18010,7 +18010,7 @@
             </w:pPr>
             <w:proofErr w:type="gramStart"/>
             <w:r>
-              <w:t xml:space="preserve">Compressive strength results: Not provided.</w:t>
+              <w:t xml:space="preserve">{{ s.lab.compressive_result }}</w:t>
             </w:r>
             <w:proofErr w:type="gramEnd"/>
             <w:r>

</xml_diff>

<commit_message>
feat(uat): implement Round 6 Scavenger and shared BHCT
</commit_message>
<xml_diff>
--- a/master_template.docx
+++ b/master_template.docx
@@ -11484,6 +11484,1906 @@
     <w:p>
       <w:r>
         <w:t>{%p endif %}</w:t>
+      </w:r>
+    </w:p>
+    <w:p>
+      <w:r>
+        <w:t xml:space="preserve">{%p if has_scavenger %}</w:t>
+      </w:r>
+    </w:p>
+    <w:tbl>
+      <w:tblPr>
+        <w:tblW w:w="10206" w:type="dxa"/>
+        <w:jc w:val="center"/>
+        <w:tblLook w:val="04A0" w:firstRow="1" w:lastRow="0" w:firstColumn="1" w:lastColumn="0" w:noHBand="0" w:noVBand="1"/>
+      </w:tblPr>
+      <w:tblGrid>
+        <w:gridCol w:w="2670"/>
+        <w:gridCol w:w="2314"/>
+        <w:gridCol w:w="2901"/>
+        <w:gridCol w:w="2321"/>
+      </w:tblGrid>
+      <w:tr>
+        <w:trPr>
+          <w:trHeight w:val="285"/>
+          <w:jc w:val="center"/>
+        </w:trPr>
+        <w:tc>
+          <w:tcPr>
+            <w:tcW w:w="9500" w:type="dxa"/>
+            <w:gridSpan w:val="4"/>
+            <w:tcBorders>
+              <w:top w:val="single" w:sz="4" w:space="0" w:color="auto"/>
+              <w:left w:val="single" w:sz="4" w:space="0" w:color="auto"/>
+              <w:bottom w:val="single" w:sz="4" w:space="0" w:color="auto"/>
+              <w:right w:val="single" w:sz="4" w:space="0" w:color="auto"/>
+            </w:tcBorders>
+            <w:shd w:val="clear" w:color="auto" w:fill="003D83"/>
+            <w:noWrap/>
+            <w:vAlign w:val="center"/>
+            <w:hideMark/>
+          </w:tcPr>
+          <w:p>
+            <w:pPr>
+              <w:spacing w:after="0" w:line="240" w:lineRule="auto"/>
+              <w:ind w:firstLine="0"/>
+              <w:rPr>
+                <w:rFonts w:asciiTheme="minorBidi" w:eastAsia="Times New Roman" w:hAnsiTheme="minorBidi"/>
+                <w:b/>
+                <w:bCs/>
+                <w:noProof/>
+                <w:color w:val="003D83"/>
+                <w:sz w:val="20"/>
+                <w:szCs w:val="20"/>
+              </w:rPr>
+            </w:pPr>
+            <w:r>
+              <w:rPr>
+                <w:rFonts w:asciiTheme="minorBidi" w:eastAsia="Times New Roman" w:hAnsiTheme="minorBidi"/>
+                <w:b/>
+                <w:bCs/>
+                <w:noProof/>
+                <w:color w:val="FFFFFF" w:themeColor="background1"/>
+                <w:sz w:val="20"/>
+                <w:szCs w:val="20"/>
+              </w:rPr>
+              <w:t>Scavenger Cement Slurry Data</w:t>
+            </w:r>
+          </w:p>
+        </w:tc>
+      </w:tr>
+      <w:tr>
+        <w:trPr>
+          <w:trHeight w:val="285"/>
+          <w:jc w:val="center"/>
+        </w:trPr>
+        <w:tc>
+          <w:tcPr>
+            <w:tcW w:w="2486" w:type="dxa"/>
+            <w:tcBorders>
+              <w:top w:val="nil"/>
+              <w:left w:val="single" w:sz="4" w:space="0" w:color="auto"/>
+              <w:bottom w:val="single" w:sz="4" w:space="0" w:color="auto"/>
+              <w:right w:val="single" w:sz="4" w:space="0" w:color="auto"/>
+            </w:tcBorders>
+            <w:noWrap/>
+            <w:vAlign w:val="center"/>
+            <w:hideMark/>
+          </w:tcPr>
+          <w:p>
+            <w:pPr>
+              <w:pStyle w:val="NormalTab"/>
+            </w:pPr>
+            <w:r>
+              <w:t>Volume</w:t>
+            </w:r>
+          </w:p>
+        </w:tc>
+        <w:tc>
+          <w:tcPr>
+            <w:tcW w:w="2154" w:type="dxa"/>
+            <w:tcBorders>
+              <w:top w:val="nil"/>
+              <w:left w:val="nil"/>
+              <w:bottom w:val="single" w:sz="4" w:space="0" w:color="auto"/>
+              <w:right w:val="single" w:sz="4" w:space="0" w:color="auto"/>
+            </w:tcBorders>
+            <w:noWrap/>
+            <w:vAlign w:val="center"/>
+            <w:hideMark/>
+          </w:tcPr>
+          <w:p>
+            <w:pPr>
+              <w:pStyle w:val="NormalTab"/>
+            </w:pPr>
+            <w:proofErr w:type="gramStart"/>
+            <w:r>
+              <w:t xml:space="preserve">{{ scavenger.volume_bbl }} bbl</w:t>
+            </w:r>
+            <w:proofErr w:type="spellStart"/>
+            <w:r>
+              <w:t/>
+            </w:r>
+            <w:proofErr w:type="gramEnd"/>
+            <w:r>
+              <w:t/>
+            </w:r>
+            <w:proofErr w:type="gramStart"/>
+            <w:r>
+              <w:t/>
+            </w:r>
+            <w:proofErr w:type="spellEnd"/>
+            <w:r>
+              <w:t xml:space="preserve"/>
+            </w:r>
+            <w:proofErr w:type="gramEnd"/>
+            <w:r>
+              <w:t xml:space="preserve"/>
+            </w:r>
+            <w:proofErr w:type="spellStart"/>
+            <w:r>
+              <w:t/>
+            </w:r>
+            <w:proofErr w:type="spellEnd"/>
+          </w:p>
+        </w:tc>
+        <w:tc>
+          <w:tcPr>
+            <w:tcW w:w="2700" w:type="dxa"/>
+            <w:tcBorders>
+              <w:top w:val="nil"/>
+              <w:left w:val="nil"/>
+              <w:bottom w:val="single" w:sz="4" w:space="0" w:color="auto"/>
+              <w:right w:val="single" w:sz="4" w:space="0" w:color="auto"/>
+            </w:tcBorders>
+            <w:noWrap/>
+            <w:vAlign w:val="center"/>
+            <w:hideMark/>
+          </w:tcPr>
+          <w:p>
+            <w:pPr>
+              <w:pStyle w:val="NormalTab"/>
+            </w:pPr>
+            <w:r>
+              <w:t>Slurry Weight</w:t>
+            </w:r>
+          </w:p>
+        </w:tc>
+        <w:tc>
+          <w:tcPr>
+            <w:tcW w:w="2160" w:type="dxa"/>
+            <w:tcBorders>
+              <w:top w:val="nil"/>
+              <w:left w:val="nil"/>
+              <w:bottom w:val="single" w:sz="4" w:space="0" w:color="auto"/>
+              <w:right w:val="single" w:sz="4" w:space="0" w:color="auto"/>
+            </w:tcBorders>
+            <w:noWrap/>
+            <w:vAlign w:val="center"/>
+            <w:hideMark/>
+          </w:tcPr>
+          <w:p>
+            <w:pPr>
+              <w:pStyle w:val="NormalTab"/>
+            </w:pPr>
+            <w:proofErr w:type="gramStart"/>
+            <w:r>
+              <w:t xml:space="preserve">{{ scavenger.density_pcf }} pcf</w:t>
+            </w:r>
+            <w:proofErr w:type="spellStart"/>
+            <w:r>
+              <w:t/>
+            </w:r>
+            <w:proofErr w:type="gramEnd"/>
+            <w:r>
+              <w:t/>
+            </w:r>
+            <w:proofErr w:type="gramStart"/>
+            <w:r>
+              <w:t/>
+            </w:r>
+            <w:proofErr w:type="spellEnd"/>
+            <w:r>
+              <w:t xml:space="preserve"/>
+            </w:r>
+            <w:proofErr w:type="gramEnd"/>
+            <w:r>
+              <w:t/>
+            </w:r>
+          </w:p>
+        </w:tc>
+      </w:tr>
+      <w:tr>
+        <w:trPr>
+          <w:trHeight w:val="285"/>
+          <w:jc w:val="center"/>
+        </w:trPr>
+        <w:tc>
+          <w:tcPr>
+            <w:tcW w:w="2486" w:type="dxa"/>
+            <w:tcBorders>
+              <w:top w:val="nil"/>
+              <w:left w:val="single" w:sz="4" w:space="0" w:color="auto"/>
+              <w:bottom w:val="single" w:sz="4" w:space="0" w:color="auto"/>
+              <w:right w:val="single" w:sz="4" w:space="0" w:color="auto"/>
+            </w:tcBorders>
+            <w:noWrap/>
+            <w:vAlign w:val="center"/>
+            <w:hideMark/>
+          </w:tcPr>
+          <w:p>
+            <w:pPr>
+              <w:pStyle w:val="NormalTab"/>
+            </w:pPr>
+            <w:r>
+              <w:t>Yield</w:t>
+            </w:r>
+          </w:p>
+        </w:tc>
+        <w:tc>
+          <w:tcPr>
+            <w:tcW w:w="2154" w:type="dxa"/>
+            <w:tcBorders>
+              <w:top w:val="nil"/>
+              <w:left w:val="nil"/>
+              <w:bottom w:val="single" w:sz="4" w:space="0" w:color="auto"/>
+              <w:right w:val="single" w:sz="4" w:space="0" w:color="auto"/>
+            </w:tcBorders>
+            <w:noWrap/>
+            <w:vAlign w:val="center"/>
+            <w:hideMark/>
+          </w:tcPr>
+          <w:p>
+            <w:pPr>
+              <w:pStyle w:val="NormalTab"/>
+            </w:pPr>
+            <w:proofErr w:type="gramStart"/>
+            <w:r>
+              <w:t xml:space="preserve">{{ scavenger.yield_cuft_sk }} cuft/sk</w:t>
+            </w:r>
+            <w:proofErr w:type="spellStart"/>
+            <w:r>
+              <w:t/>
+            </w:r>
+            <w:proofErr w:type="gramEnd"/>
+            <w:r>
+              <w:t/>
+            </w:r>
+            <w:proofErr w:type="gramStart"/>
+            <w:r>
+              <w:t/>
+            </w:r>
+            <w:proofErr w:type="spellEnd"/>
+            <w:r>
+              <w:t xml:space="preserve"/>
+            </w:r>
+            <w:proofErr w:type="gramEnd"/>
+            <w:r>
+              <w:t xml:space="preserve"/>
+            </w:r>
+            <w:proofErr w:type="spellStart"/>
+            <w:r>
+              <w:t/>
+            </w:r>
+            <w:proofErr w:type="spellEnd"/>
+            <w:r>
+              <w:t/>
+            </w:r>
+            <w:proofErr w:type="spellStart"/>
+            <w:r>
+              <w:t/>
+            </w:r>
+            <w:proofErr w:type="spellEnd"/>
+          </w:p>
+        </w:tc>
+        <w:tc>
+          <w:tcPr>
+            <w:tcW w:w="2700" w:type="dxa"/>
+            <w:tcBorders>
+              <w:top w:val="nil"/>
+              <w:left w:val="nil"/>
+              <w:bottom w:val="single" w:sz="4" w:space="0" w:color="auto"/>
+              <w:right w:val="single" w:sz="4" w:space="0" w:color="auto"/>
+            </w:tcBorders>
+            <w:noWrap/>
+            <w:vAlign w:val="center"/>
+            <w:hideMark/>
+          </w:tcPr>
+          <w:p>
+            <w:pPr>
+              <w:pStyle w:val="NormalTab"/>
+            </w:pPr>
+            <w:r>
+              <w:t>Solution</w:t>
+            </w:r>
+          </w:p>
+        </w:tc>
+        <w:tc>
+          <w:tcPr>
+            <w:tcW w:w="2160" w:type="dxa"/>
+            <w:tcBorders>
+              <w:top w:val="nil"/>
+              <w:left w:val="nil"/>
+              <w:bottom w:val="single" w:sz="4" w:space="0" w:color="auto"/>
+              <w:right w:val="single" w:sz="4" w:space="0" w:color="auto"/>
+            </w:tcBorders>
+            <w:noWrap/>
+            <w:vAlign w:val="center"/>
+            <w:hideMark/>
+          </w:tcPr>
+          <w:p>
+            <w:pPr>
+              <w:pStyle w:val="NormalTab"/>
+            </w:pPr>
+            <w:proofErr w:type="gramStart"/>
+            <w:r>
+              <w:t xml:space="preserve">{{ scavenger.solution }} bbl</w:t>
+            </w:r>
+            <w:proofErr w:type="spellStart"/>
+            <w:r>
+              <w:t/>
+            </w:r>
+            <w:proofErr w:type="gramEnd"/>
+            <w:r>
+              <w:t/>
+            </w:r>
+            <w:proofErr w:type="gramStart"/>
+            <w:r>
+              <w:t/>
+            </w:r>
+            <w:proofErr w:type="spellEnd"/>
+            <w:r>
+              <w:t xml:space="preserve"/>
+            </w:r>
+            <w:proofErr w:type="gramEnd"/>
+            <w:r>
+              <w:t xml:space="preserve"/>
+            </w:r>
+            <w:proofErr w:type="spellStart"/>
+            <w:r>
+              <w:t/>
+            </w:r>
+            <w:proofErr w:type="spellEnd"/>
+          </w:p>
+        </w:tc>
+      </w:tr>
+    </w:tbl>
+    <w:p>
+      <w:pPr>
+        <w:pStyle w:val="NormalTab"/>
+        <w:rPr>
+          <w:noProof/>
+        </w:rPr>
+      </w:pPr>
+    </w:p>
+    <w:tbl>
+      <w:tblPr>
+        <w:tblW w:w="10206" w:type="dxa"/>
+        <w:jc w:val="center"/>
+        <w:tblLook w:val="04A0" w:firstRow="1" w:lastRow="0" w:firstColumn="1" w:lastColumn="0" w:noHBand="0" w:noVBand="1"/>
+      </w:tblPr>
+      <w:tblGrid>
+        <w:gridCol w:w="1128"/>
+        <w:gridCol w:w="2704"/>
+        <w:gridCol w:w="2474"/>
+        <w:gridCol w:w="2288"/>
+        <w:gridCol w:w="1612"/>
+      </w:tblGrid>
+      <w:tr>
+        <w:trPr>
+          <w:trHeight w:val="285"/>
+          <w:jc w:val="center"/>
+        </w:trPr>
+        <w:tc>
+          <w:tcPr>
+            <w:tcW w:w="10206" w:type="dxa"/>
+            <w:gridSpan w:val="5"/>
+            <w:tcBorders>
+              <w:top w:val="single" w:sz="4" w:space="0" w:color="auto"/>
+              <w:left w:val="single" w:sz="4" w:space="0" w:color="auto"/>
+              <w:bottom w:val="single" w:sz="4" w:space="0" w:color="auto"/>
+              <w:right w:val="single" w:sz="4" w:space="0" w:color="auto"/>
+            </w:tcBorders>
+            <w:shd w:val="clear" w:color="000000" w:fill="003D83"/>
+            <w:vAlign w:val="center"/>
+            <w:hideMark/>
+          </w:tcPr>
+          <w:p>
+            <w:pPr>
+              <w:spacing w:after="0" w:line="240" w:lineRule="auto"/>
+              <w:ind w:firstLine="0"/>
+              <w:rPr>
+                <w:rFonts w:ascii="Arial" w:eastAsia="Times New Roman" w:hAnsi="Arial" w:cs="Arial"/>
+                <w:b/>
+                <w:bCs/>
+                <w:color w:val="FFFFFF"/>
+                <w:sz w:val="20"/>
+                <w:szCs w:val="20"/>
+                <w:lang w:bidi="fa-IR"/>
+              </w:rPr>
+            </w:pPr>
+            <w:r>
+              <w:rPr>
+                <w:rFonts w:asciiTheme="minorBidi" w:eastAsia="Times New Roman" w:hAnsiTheme="minorBidi"/>
+                <w:b/>
+                <w:bCs/>
+                <w:noProof/>
+                <w:color w:val="FFFFFF" w:themeColor="background1"/>
+                <w:sz w:val="20"/>
+                <w:szCs w:val="20"/>
+              </w:rPr>
+              <w:t>Scavenger Cement Slurry Blend Data</w:t>
+            </w:r>
+          </w:p>
+        </w:tc>
+      </w:tr>
+      <w:tr>
+        <w:trPr>
+          <w:trHeight w:val="285"/>
+          <w:jc w:val="center"/>
+        </w:trPr>
+        <w:tc>
+          <w:tcPr>
+            <w:tcW w:w="590" w:type="dxa"/>
+            <w:tcBorders>
+              <w:top w:val="nil"/>
+              <w:left w:val="single" w:sz="4" w:space="0" w:color="auto"/>
+              <w:bottom w:val="single" w:sz="4" w:space="0" w:color="auto"/>
+              <w:right w:val="single" w:sz="4" w:space="0" w:color="auto"/>
+            </w:tcBorders>
+            <w:shd w:val="clear" w:color="000000" w:fill="FFFFFF"/>
+            <w:vAlign w:val="center"/>
+            <w:hideMark/>
+          </w:tcPr>
+          <w:p>
+            <w:pPr>
+              <w:pStyle w:val="NormalTab"/>
+            </w:pPr>
+            <w:r>
+              <w:t>Item</w:t>
+            </w:r>
+          </w:p>
+        </w:tc>
+        <w:tc>
+          <w:tcPr>
+            <w:tcW w:w="2875" w:type="dxa"/>
+            <w:tcBorders>
+              <w:top w:val="nil"/>
+              <w:left w:val="nil"/>
+              <w:bottom w:val="single" w:sz="4" w:space="0" w:color="auto"/>
+              <w:right w:val="single" w:sz="4" w:space="0" w:color="auto"/>
+            </w:tcBorders>
+            <w:shd w:val="clear" w:color="000000" w:fill="FFFFFF"/>
+            <w:vAlign w:val="center"/>
+            <w:hideMark/>
+          </w:tcPr>
+          <w:p>
+            <w:pPr>
+              <w:pStyle w:val="NormalTab"/>
+            </w:pPr>
+            <w:r>
+              <w:t>Name</w:t>
+            </w:r>
+          </w:p>
+        </w:tc>
+        <w:tc>
+          <w:tcPr>
+            <w:tcW w:w="2602" w:type="dxa"/>
+            <w:tcBorders>
+              <w:top w:val="nil"/>
+              <w:left w:val="nil"/>
+              <w:bottom w:val="single" w:sz="4" w:space="0" w:color="auto"/>
+              <w:right w:val="single" w:sz="4" w:space="0" w:color="auto"/>
+            </w:tcBorders>
+            <w:shd w:val="clear" w:color="000000" w:fill="FFFFFF"/>
+            <w:vAlign w:val="center"/>
+            <w:hideMark/>
+          </w:tcPr>
+          <w:p>
+            <w:pPr>
+              <w:pStyle w:val="NormalTab"/>
+            </w:pPr>
+            <w:r>
+              <w:t>Material Type</w:t>
+            </w:r>
+          </w:p>
+        </w:tc>
+        <w:tc>
+          <w:tcPr>
+            <w:tcW w:w="2438" w:type="dxa"/>
+            <w:tcBorders>
+              <w:top w:val="nil"/>
+              <w:left w:val="nil"/>
+              <w:bottom w:val="single" w:sz="4" w:space="0" w:color="auto"/>
+              <w:right w:val="single" w:sz="4" w:space="0" w:color="auto"/>
+            </w:tcBorders>
+            <w:shd w:val="clear" w:color="000000" w:fill="FFFFFF"/>
+            <w:vAlign w:val="center"/>
+            <w:hideMark/>
+          </w:tcPr>
+          <w:p>
+            <w:pPr>
+              <w:pStyle w:val="NormalTab"/>
+            </w:pPr>
+            <w:proofErr w:type="spellStart"/>
+            <w:r>
+              <w:t>sks</w:t>
+            </w:r>
+            <w:proofErr w:type="spellEnd"/>
+            <w:r>
+              <w:t xml:space="preserve"> or </w:t>
+            </w:r>
+            <w:proofErr w:type="spellStart"/>
+            <w:r>
+              <w:t>lbs</w:t>
+            </w:r>
+            <w:proofErr w:type="spellEnd"/>
+          </w:p>
+        </w:tc>
+        <w:tc>
+          <w:tcPr>
+            <w:tcW w:w="1701" w:type="dxa"/>
+            <w:tcBorders>
+              <w:top w:val="nil"/>
+              <w:left w:val="nil"/>
+              <w:bottom w:val="single" w:sz="4" w:space="0" w:color="auto"/>
+              <w:right w:val="single" w:sz="4" w:space="0" w:color="auto"/>
+            </w:tcBorders>
+            <w:shd w:val="clear" w:color="000000" w:fill="FFFFFF"/>
+            <w:vAlign w:val="center"/>
+            <w:hideMark/>
+          </w:tcPr>
+          <w:p>
+            <w:pPr>
+              <w:pStyle w:val="NormalTab"/>
+            </w:pPr>
+            <w:proofErr w:type="spellStart"/>
+            <w:r>
+              <w:t>lbs</w:t>
+            </w:r>
+            <w:proofErr w:type="spellEnd"/>
+            <w:r>
+              <w:t xml:space="preserve"> / </w:t>
+            </w:r>
+            <w:proofErr w:type="spellStart"/>
+            <w:r>
+              <w:t>sk</w:t>
+            </w:r>
+            <w:proofErr w:type="spellEnd"/>
+          </w:p>
+        </w:tc>
+      </w:tr>
+      <w:tr>
+        <w:trPr>
+          <w:trHeight w:val="285"/>
+          <w:jc w:val="center"/>
+        </w:trPr>
+        <w:tc>
+          <w:tcPr>
+            <w:tcW w:w="590" w:type="dxa"/>
+            <w:tcBorders>
+              <w:top w:val="nil"/>
+              <w:left w:val="single" w:sz="4" w:space="0" w:color="auto"/>
+              <w:bottom w:val="single" w:sz="4" w:space="0" w:color="auto"/>
+              <w:right w:val="single" w:sz="4" w:space="0" w:color="auto"/>
+            </w:tcBorders>
+            <w:vAlign w:val="center"/>
+            <w:hideMark/>
+          </w:tcPr>
+          <w:p>
+            <w:pPr>
+              <w:pStyle w:val="NormalTab"/>
+            </w:pPr>
+            <w:r>
+              <w:t xml:space="preserve">{%tr for b in scavenger.blends %}</w:t>
+            </w:r>
+            <w:proofErr w:type="spellStart"/>
+            <w:proofErr w:type="gramStart"/>
+            <w:r>
+              <w:t/>
+            </w:r>
+            <w:proofErr w:type="spellEnd"/>
+            <w:proofErr w:type="gramEnd"/>
+            <w:r>
+              <w:t xml:space="preserve"/>
+            </w:r>
+          </w:p>
+        </w:tc>
+        <w:tc>
+          <w:tcPr>
+            <w:tcW w:w="2875" w:type="dxa"/>
+            <w:tcBorders>
+              <w:top w:val="nil"/>
+              <w:left w:val="nil"/>
+              <w:bottom w:val="single" w:sz="4" w:space="0" w:color="auto"/>
+              <w:right w:val="single" w:sz="4" w:space="0" w:color="auto"/>
+            </w:tcBorders>
+            <w:vAlign w:val="center"/>
+            <w:hideMark/>
+          </w:tcPr>
+          <w:p>
+            <w:pPr>
+              <w:pStyle w:val="NormalTab"/>
+            </w:pPr>
+          </w:p>
+        </w:tc>
+        <w:tc>
+          <w:tcPr>
+            <w:tcW w:w="2602" w:type="dxa"/>
+            <w:tcBorders>
+              <w:top w:val="nil"/>
+              <w:left w:val="nil"/>
+              <w:bottom w:val="single" w:sz="4" w:space="0" w:color="auto"/>
+              <w:right w:val="single" w:sz="4" w:space="0" w:color="auto"/>
+            </w:tcBorders>
+            <w:vAlign w:val="center"/>
+            <w:hideMark/>
+          </w:tcPr>
+          <w:p>
+            <w:pPr>
+              <w:pStyle w:val="NormalTab"/>
+            </w:pPr>
+          </w:p>
+        </w:tc>
+        <w:tc>
+          <w:tcPr>
+            <w:tcW w:w="2438" w:type="dxa"/>
+            <w:tcBorders>
+              <w:top w:val="nil"/>
+              <w:left w:val="nil"/>
+              <w:bottom w:val="single" w:sz="4" w:space="0" w:color="auto"/>
+              <w:right w:val="single" w:sz="4" w:space="0" w:color="auto"/>
+            </w:tcBorders>
+            <w:vAlign w:val="center"/>
+            <w:hideMark/>
+          </w:tcPr>
+          <w:p>
+            <w:pPr>
+              <w:pStyle w:val="NormalTab"/>
+            </w:pPr>
+          </w:p>
+        </w:tc>
+        <w:tc>
+          <w:tcPr>
+            <w:tcW w:w="1701" w:type="dxa"/>
+            <w:tcBorders>
+              <w:top w:val="nil"/>
+              <w:left w:val="nil"/>
+              <w:bottom w:val="single" w:sz="4" w:space="0" w:color="auto"/>
+              <w:right w:val="single" w:sz="4" w:space="0" w:color="auto"/>
+            </w:tcBorders>
+            <w:vAlign w:val="center"/>
+            <w:hideMark/>
+          </w:tcPr>
+          <w:p>
+            <w:pPr>
+              <w:pStyle w:val="NormalTab"/>
+            </w:pPr>
+          </w:p>
+        </w:tc>
+      </w:tr>
+      <w:tr>
+        <w:trPr>
+          <w:trHeight w:val="285"/>
+          <w:jc w:val="center"/>
+        </w:trPr>
+        <w:tc>
+          <w:tcPr>
+            <w:tcW w:w="590" w:type="dxa"/>
+            <w:tcBorders>
+              <w:top w:val="nil"/>
+              <w:left w:val="single" w:sz="4" w:space="0" w:color="auto"/>
+              <w:bottom w:val="single" w:sz="4" w:space="0" w:color="auto"/>
+              <w:right w:val="single" w:sz="4" w:space="0" w:color="auto"/>
+            </w:tcBorders>
+            <w:vAlign w:val="center"/>
+            <w:hideMark/>
+          </w:tcPr>
+          <w:p>
+            <w:pPr>
+              <w:pStyle w:val="NormalTab"/>
+            </w:pPr>
+            <w:proofErr w:type="gramStart"/>
+            <w:r>
+              <w:t xml:space="preserve">{{ </w:t>
+            </w:r>
+            <w:proofErr w:type="spellStart"/>
+            <w:r>
+              <w:t>loop</w:t>
+            </w:r>
+            <w:proofErr w:type="gramEnd"/>
+            <w:r>
+              <w:t>.index</w:t>
+            </w:r>
+            <w:proofErr w:type="spellEnd"/>
+            <w:r>
+              <w:t xml:space="preserve"> }}</w:t>
+            </w:r>
+          </w:p>
+        </w:tc>
+        <w:tc>
+          <w:tcPr>
+            <w:tcW w:w="2875" w:type="dxa"/>
+            <w:tcBorders>
+              <w:top w:val="nil"/>
+              <w:left w:val="nil"/>
+              <w:bottom w:val="single" w:sz="4" w:space="0" w:color="auto"/>
+              <w:right w:val="single" w:sz="4" w:space="0" w:color="auto"/>
+            </w:tcBorders>
+            <w:vAlign w:val="center"/>
+            <w:hideMark/>
+          </w:tcPr>
+          <w:p>
+            <w:pPr>
+              <w:pStyle w:val="NormalTab"/>
+            </w:pPr>
+            <w:proofErr w:type="gramStart"/>
+            <w:r>
+              <w:t xml:space="preserve">{{ </w:t>
+            </w:r>
+            <w:proofErr w:type="spellStart"/>
+            <w:r>
+              <w:t>b</w:t>
+            </w:r>
+            <w:proofErr w:type="gramEnd"/>
+            <w:r>
+              <w:t>.Name</w:t>
+            </w:r>
+            <w:proofErr w:type="spellEnd"/>
+            <w:r>
+              <w:t xml:space="preserve"> }}</w:t>
+            </w:r>
+          </w:p>
+        </w:tc>
+        <w:tc>
+          <w:tcPr>
+            <w:tcW w:w="2602" w:type="dxa"/>
+            <w:tcBorders>
+              <w:top w:val="nil"/>
+              <w:left w:val="nil"/>
+              <w:bottom w:val="single" w:sz="4" w:space="0" w:color="auto"/>
+              <w:right w:val="single" w:sz="4" w:space="0" w:color="auto"/>
+            </w:tcBorders>
+            <w:vAlign w:val="center"/>
+            <w:hideMark/>
+          </w:tcPr>
+          <w:p>
+            <w:pPr>
+              <w:pStyle w:val="NormalTab"/>
+            </w:pPr>
+            <w:proofErr w:type="gramStart"/>
+            <w:r>
+              <w:t>{{ b</w:t>
+            </w:r>
+            <w:proofErr w:type="gramEnd"/>
+            <w:r>
+              <w:t>['Material Type'] }}</w:t>
+            </w:r>
+          </w:p>
+        </w:tc>
+        <w:tc>
+          <w:tcPr>
+            <w:tcW w:w="2438" w:type="dxa"/>
+            <w:tcBorders>
+              <w:top w:val="nil"/>
+              <w:left w:val="nil"/>
+              <w:bottom w:val="single" w:sz="4" w:space="0" w:color="auto"/>
+              <w:right w:val="single" w:sz="4" w:space="0" w:color="auto"/>
+            </w:tcBorders>
+            <w:vAlign w:val="center"/>
+            <w:hideMark/>
+          </w:tcPr>
+          <w:p>
+            <w:pPr>
+              <w:pStyle w:val="NormalTab"/>
+            </w:pPr>
+            <w:proofErr w:type="gramStart"/>
+            <w:r>
+              <w:t>{{ b</w:t>
+            </w:r>
+            <w:proofErr w:type="gramEnd"/>
+            <w:r>
+              <w:t>['</w:t>
+            </w:r>
+            <w:proofErr w:type="spellStart"/>
+            <w:r>
+              <w:t>sks</w:t>
+            </w:r>
+            <w:proofErr w:type="spellEnd"/>
+            <w:r>
+              <w:t xml:space="preserve"> or </w:t>
+            </w:r>
+            <w:proofErr w:type="spellStart"/>
+            <w:r>
+              <w:t>lbs</w:t>
+            </w:r>
+            <w:proofErr w:type="spellEnd"/>
+            <w:r>
+              <w:t>'] }}</w:t>
+            </w:r>
+          </w:p>
+        </w:tc>
+        <w:tc>
+          <w:tcPr>
+            <w:tcW w:w="1701" w:type="dxa"/>
+            <w:tcBorders>
+              <w:top w:val="nil"/>
+              <w:left w:val="nil"/>
+              <w:bottom w:val="single" w:sz="4" w:space="0" w:color="auto"/>
+              <w:right w:val="single" w:sz="4" w:space="0" w:color="auto"/>
+            </w:tcBorders>
+            <w:vAlign w:val="center"/>
+            <w:hideMark/>
+          </w:tcPr>
+          <w:p>
+            <w:pPr>
+              <w:pStyle w:val="NormalTab"/>
+            </w:pPr>
+            <w:proofErr w:type="gramStart"/>
+            <w:r>
+              <w:t>{{ b</w:t>
+            </w:r>
+            <w:proofErr w:type="gramEnd"/>
+            <w:r>
+              <w:t>['</w:t>
+            </w:r>
+            <w:proofErr w:type="spellStart"/>
+            <w:r>
+              <w:t>lbs</w:t>
+            </w:r>
+            <w:proofErr w:type="spellEnd"/>
+            <w:r>
+              <w:t xml:space="preserve"> / </w:t>
+            </w:r>
+            <w:proofErr w:type="spellStart"/>
+            <w:r>
+              <w:t>sk</w:t>
+            </w:r>
+            <w:proofErr w:type="spellEnd"/>
+            <w:r>
+              <w:t>'] }}</w:t>
+            </w:r>
+          </w:p>
+        </w:tc>
+      </w:tr>
+      <w:tr>
+        <w:trPr>
+          <w:trHeight w:val="285"/>
+          <w:jc w:val="center"/>
+        </w:trPr>
+        <w:tc>
+          <w:tcPr>
+            <w:tcW w:w="590" w:type="dxa"/>
+            <w:tcBorders>
+              <w:top w:val="nil"/>
+              <w:left w:val="single" w:sz="4" w:space="0" w:color="auto"/>
+              <w:bottom w:val="single" w:sz="4" w:space="0" w:color="auto"/>
+              <w:right w:val="single" w:sz="4" w:space="0" w:color="auto"/>
+            </w:tcBorders>
+            <w:vAlign w:val="center"/>
+            <w:hideMark/>
+          </w:tcPr>
+          <w:p>
+            <w:pPr>
+              <w:pStyle w:val="NormalTab"/>
+            </w:pPr>
+            <w:r>
+              <w:t xml:space="preserve">{%tr </w:t>
+            </w:r>
+            <w:proofErr w:type="spellStart"/>
+            <w:r>
+              <w:t>endfor</w:t>
+            </w:r>
+            <w:proofErr w:type="spellEnd"/>
+            <w:r>
+              <w:t xml:space="preserve"> %}</w:t>
+            </w:r>
+          </w:p>
+        </w:tc>
+        <w:tc>
+          <w:tcPr>
+            <w:tcW w:w="2875" w:type="dxa"/>
+            <w:tcBorders>
+              <w:top w:val="nil"/>
+              <w:left w:val="nil"/>
+              <w:bottom w:val="single" w:sz="4" w:space="0" w:color="auto"/>
+              <w:right w:val="single" w:sz="4" w:space="0" w:color="auto"/>
+            </w:tcBorders>
+            <w:vAlign w:val="center"/>
+            <w:hideMark/>
+          </w:tcPr>
+          <w:p>
+            <w:pPr>
+              <w:pStyle w:val="NormalTab"/>
+            </w:pPr>
+          </w:p>
+        </w:tc>
+        <w:tc>
+          <w:tcPr>
+            <w:tcW w:w="2602" w:type="dxa"/>
+            <w:tcBorders>
+              <w:top w:val="nil"/>
+              <w:left w:val="nil"/>
+              <w:bottom w:val="single" w:sz="4" w:space="0" w:color="auto"/>
+              <w:right w:val="single" w:sz="4" w:space="0" w:color="auto"/>
+            </w:tcBorders>
+            <w:vAlign w:val="center"/>
+            <w:hideMark/>
+          </w:tcPr>
+          <w:p>
+            <w:pPr>
+              <w:pStyle w:val="NormalTab"/>
+            </w:pPr>
+          </w:p>
+        </w:tc>
+        <w:tc>
+          <w:tcPr>
+            <w:tcW w:w="2438" w:type="dxa"/>
+            <w:tcBorders>
+              <w:top w:val="nil"/>
+              <w:left w:val="nil"/>
+              <w:bottom w:val="single" w:sz="4" w:space="0" w:color="auto"/>
+              <w:right w:val="single" w:sz="4" w:space="0" w:color="auto"/>
+            </w:tcBorders>
+            <w:vAlign w:val="center"/>
+            <w:hideMark/>
+          </w:tcPr>
+          <w:p>
+            <w:pPr>
+              <w:pStyle w:val="NormalTab"/>
+            </w:pPr>
+          </w:p>
+        </w:tc>
+        <w:tc>
+          <w:tcPr>
+            <w:tcW w:w="1701" w:type="dxa"/>
+            <w:tcBorders>
+              <w:top w:val="nil"/>
+              <w:left w:val="nil"/>
+              <w:bottom w:val="single" w:sz="4" w:space="0" w:color="auto"/>
+              <w:right w:val="single" w:sz="4" w:space="0" w:color="auto"/>
+            </w:tcBorders>
+            <w:vAlign w:val="center"/>
+            <w:hideMark/>
+          </w:tcPr>
+          <w:p>
+            <w:pPr>
+              <w:pStyle w:val="NormalTab"/>
+            </w:pPr>
+          </w:p>
+        </w:tc>
+      </w:tr>
+    </w:tbl>
+    <w:p>
+      <w:pPr>
+        <w:spacing w:after="0" w:line="240" w:lineRule="auto"/>
+        <w:ind w:left="142" w:hanging="142"/>
+        <w:rPr>
+          <w:rFonts w:asciiTheme="minorBidi" w:eastAsia="Times New Roman" w:hAnsiTheme="minorBidi"/>
+          <w:b/>
+          <w:bCs/>
+          <w:noProof/>
+          <w:color w:val="003D83"/>
+          <w:sz w:val="20"/>
+          <w:szCs w:val="20"/>
+        </w:rPr>
+      </w:pPr>
+    </w:p>
+    <w:tbl>
+      <w:tblPr>
+        <w:tblW w:w="10200" w:type="dxa"/>
+        <w:jc w:val="center"/>
+        <w:tblLook w:val="04A0" w:firstRow="1" w:lastRow="0" w:firstColumn="1" w:lastColumn="0" w:noHBand="0" w:noVBand="1"/>
+      </w:tblPr>
+      <w:tblGrid>
+        <w:gridCol w:w="1162"/>
+        <w:gridCol w:w="1545"/>
+        <w:gridCol w:w="1807"/>
+        <w:gridCol w:w="1227"/>
+        <w:gridCol w:w="1377"/>
+        <w:gridCol w:w="1512"/>
+        <w:gridCol w:w="1554"/>
+        <w:gridCol w:w="16"/>
+      </w:tblGrid>
+      <w:tr>
+        <w:trPr>
+          <w:trHeight w:val="284"/>
+          <w:jc w:val="center"/>
+        </w:trPr>
+        <w:tc>
+          <w:tcPr>
+            <w:tcW w:w="10200" w:type="dxa"/>
+            <w:gridSpan w:val="8"/>
+            <w:tcBorders>
+              <w:top w:val="single" w:sz="4" w:space="0" w:color="auto"/>
+              <w:left w:val="single" w:sz="4" w:space="0" w:color="auto"/>
+              <w:bottom w:val="single" w:sz="4" w:space="0" w:color="auto"/>
+              <w:right w:val="single" w:sz="4" w:space="0" w:color="auto"/>
+            </w:tcBorders>
+            <w:shd w:val="clear" w:color="000000" w:fill="003D83"/>
+            <w:vAlign w:val="center"/>
+            <w:hideMark/>
+          </w:tcPr>
+          <w:p>
+            <w:pPr>
+              <w:spacing w:after="0" w:line="240" w:lineRule="auto"/>
+              <w:ind w:firstLine="0"/>
+              <w:rPr>
+                <w:rFonts w:ascii="Arial" w:eastAsia="Times New Roman" w:hAnsi="Arial" w:cs="Arial"/>
+                <w:b/>
+                <w:bCs/>
+                <w:color w:val="FFFFFF"/>
+                <w:sz w:val="20"/>
+                <w:szCs w:val="20"/>
+                <w:lang w:bidi="fa-IR"/>
+              </w:rPr>
+            </w:pPr>
+            <w:proofErr w:type="gramStart"/>
+            <w:r>
+              <w:rPr>
+                <w:rFonts w:ascii="Arial" w:eastAsia="Times New Roman" w:hAnsi="Arial" w:cs="Arial"/>
+                <w:b/>
+                <w:bCs/>
+                <w:color w:val="FFFFFF"/>
+                <w:sz w:val="20"/>
+                <w:szCs w:val="20"/>
+                <w:lang w:bidi="fa-IR"/>
+              </w:rPr>
+              <w:t>Scavenger Cement Slurry Additives Data</w:t>
+            </w:r>
+            <w:proofErr w:type="gramEnd"/>
+            <w:r>
+              <w:rPr>
+                <w:rFonts w:ascii="Arial" w:eastAsia="Times New Roman" w:hAnsi="Arial" w:cs="Arial"/>
+                <w:b/>
+                <w:bCs/>
+                <w:color w:val="FFFFFF"/>
+                <w:sz w:val="20"/>
+                <w:szCs w:val="20"/>
+                <w:lang w:bidi="fa-IR"/>
+              </w:rPr>
+              <w:t/>
+            </w:r>
+            <w:proofErr w:type="gramStart"/>
+            <w:r>
+              <w:rPr>
+                <w:rFonts w:ascii="Arial" w:eastAsia="Times New Roman" w:hAnsi="Arial" w:cs="Arial"/>
+                <w:b/>
+                <w:bCs/>
+                <w:color w:val="FFFFFF"/>
+                <w:sz w:val="20"/>
+                <w:szCs w:val="20"/>
+                <w:lang w:bidi="fa-IR"/>
+              </w:rPr>
+              <w:t/>
+            </w:r>
+            <w:proofErr w:type="gramEnd"/>
+            <w:r>
+              <w:rPr>
+                <w:rFonts w:ascii="Arial" w:eastAsia="Times New Roman" w:hAnsi="Arial" w:cs="Arial"/>
+                <w:b/>
+                <w:bCs/>
+                <w:color w:val="FFFFFF"/>
+                <w:sz w:val="20"/>
+                <w:szCs w:val="20"/>
+                <w:lang w:bidi="fa-IR"/>
+              </w:rPr>
+              <w:t/>
+            </w:r>
+          </w:p>
+        </w:tc>
+      </w:tr>
+      <w:tr>
+        <w:trPr>
+          <w:gridAfter w:val="1"/>
+          <w:wAfter w:w="18" w:type="dxa"/>
+          <w:trHeight w:val="284"/>
+          <w:jc w:val="center"/>
+        </w:trPr>
+        <w:tc>
+          <w:tcPr>
+            <w:tcW w:w="605" w:type="dxa"/>
+            <w:tcBorders>
+              <w:top w:val="nil"/>
+              <w:left w:val="single" w:sz="4" w:space="0" w:color="auto"/>
+              <w:bottom w:val="single" w:sz="4" w:space="0" w:color="auto"/>
+              <w:right w:val="single" w:sz="4" w:space="0" w:color="auto"/>
+            </w:tcBorders>
+            <w:shd w:val="clear" w:color="000000" w:fill="FFFFFF"/>
+            <w:vAlign w:val="center"/>
+            <w:hideMark/>
+          </w:tcPr>
+          <w:p>
+            <w:pPr>
+              <w:pStyle w:val="NormalTab"/>
+            </w:pPr>
+            <w:r>
+              <w:t>Item</w:t>
+            </w:r>
+          </w:p>
+        </w:tc>
+        <w:tc>
+          <w:tcPr>
+            <w:tcW w:w="1639" w:type="dxa"/>
+            <w:tcBorders>
+              <w:top w:val="nil"/>
+              <w:left w:val="nil"/>
+              <w:bottom w:val="single" w:sz="4" w:space="0" w:color="auto"/>
+              <w:right w:val="single" w:sz="4" w:space="0" w:color="auto"/>
+            </w:tcBorders>
+            <w:shd w:val="clear" w:color="000000" w:fill="FFFFFF"/>
+            <w:vAlign w:val="center"/>
+            <w:hideMark/>
+          </w:tcPr>
+          <w:p>
+            <w:pPr>
+              <w:pStyle w:val="NormalTab"/>
+            </w:pPr>
+            <w:r>
+              <w:t>Name</w:t>
+            </w:r>
+          </w:p>
+        </w:tc>
+        <w:tc>
+          <w:tcPr>
+            <w:tcW w:w="1908" w:type="dxa"/>
+            <w:tcBorders>
+              <w:top w:val="nil"/>
+              <w:left w:val="nil"/>
+              <w:bottom w:val="single" w:sz="4" w:space="0" w:color="auto"/>
+              <w:right w:val="single" w:sz="4" w:space="0" w:color="auto"/>
+            </w:tcBorders>
+            <w:shd w:val="clear" w:color="000000" w:fill="FFFFFF"/>
+            <w:vAlign w:val="center"/>
+            <w:hideMark/>
+          </w:tcPr>
+          <w:p>
+            <w:pPr>
+              <w:pStyle w:val="NormalTab"/>
+            </w:pPr>
+            <w:r>
+              <w:t>Material Type</w:t>
+            </w:r>
+          </w:p>
+        </w:tc>
+        <w:tc>
+          <w:tcPr>
+            <w:tcW w:w="1309" w:type="dxa"/>
+            <w:tcBorders>
+              <w:top w:val="nil"/>
+              <w:left w:val="nil"/>
+              <w:bottom w:val="single" w:sz="4" w:space="0" w:color="auto"/>
+              <w:right w:val="single" w:sz="4" w:space="0" w:color="auto"/>
+            </w:tcBorders>
+            <w:shd w:val="clear" w:color="000000" w:fill="FFFFFF"/>
+            <w:vAlign w:val="center"/>
+            <w:hideMark/>
+          </w:tcPr>
+          <w:p>
+            <w:pPr>
+              <w:pStyle w:val="NormalTab"/>
+            </w:pPr>
+            <w:proofErr w:type="spellStart"/>
+            <w:r>
+              <w:t>lbs</w:t>
+            </w:r>
+            <w:proofErr w:type="spellEnd"/>
+            <w:r>
+              <w:t xml:space="preserve"> or gal</w:t>
+            </w:r>
+          </w:p>
+        </w:tc>
+        <w:tc>
+          <w:tcPr>
+            <w:tcW w:w="1448" w:type="dxa"/>
+            <w:tcBorders>
+              <w:top w:val="nil"/>
+              <w:left w:val="nil"/>
+              <w:bottom w:val="single" w:sz="4" w:space="0" w:color="auto"/>
+              <w:right w:val="single" w:sz="4" w:space="0" w:color="auto"/>
+            </w:tcBorders>
+            <w:shd w:val="clear" w:color="000000" w:fill="FFFFFF"/>
+            <w:vAlign w:val="center"/>
+            <w:hideMark/>
+          </w:tcPr>
+          <w:p>
+            <w:pPr>
+              <w:pStyle w:val="NormalTab"/>
+            </w:pPr>
+            <w:r>
+              <w:t>(</w:t>
+            </w:r>
+            <w:proofErr w:type="spellStart"/>
+            <w:r>
+              <w:t>lbs</w:t>
+            </w:r>
+            <w:proofErr w:type="spellEnd"/>
+            <w:r>
+              <w:t xml:space="preserve"> or gal)/</w:t>
+            </w:r>
+            <w:proofErr w:type="spellStart"/>
+            <w:r>
+              <w:t>sk</w:t>
+            </w:r>
+            <w:proofErr w:type="spellEnd"/>
+          </w:p>
+        </w:tc>
+        <w:tc>
+          <w:tcPr>
+            <w:tcW w:w="1594" w:type="dxa"/>
+            <w:tcBorders>
+              <w:top w:val="nil"/>
+              <w:left w:val="nil"/>
+              <w:bottom w:val="single" w:sz="4" w:space="0" w:color="auto"/>
+              <w:right w:val="single" w:sz="4" w:space="0" w:color="auto"/>
+            </w:tcBorders>
+            <w:shd w:val="clear" w:color="000000" w:fill="FFFFFF"/>
+            <w:vAlign w:val="center"/>
+            <w:hideMark/>
+          </w:tcPr>
+          <w:p>
+            <w:pPr>
+              <w:pStyle w:val="NormalTab"/>
+            </w:pPr>
+            <w:r>
+              <w:t>(</w:t>
+            </w:r>
+            <w:proofErr w:type="spellStart"/>
+            <w:r>
+              <w:t>lbs</w:t>
+            </w:r>
+            <w:proofErr w:type="spellEnd"/>
+            <w:r>
+              <w:t xml:space="preserve"> or gal)/</w:t>
+            </w:r>
+            <w:proofErr w:type="spellStart"/>
+            <w:r>
+              <w:t>bbl</w:t>
+            </w:r>
+            <w:proofErr w:type="spellEnd"/>
+          </w:p>
+        </w:tc>
+        <w:tc>
+          <w:tcPr>
+            <w:tcW w:w="1679" w:type="dxa"/>
+            <w:tcBorders>
+              <w:top w:val="nil"/>
+              <w:left w:val="nil"/>
+              <w:bottom w:val="single" w:sz="4" w:space="0" w:color="auto"/>
+              <w:right w:val="single" w:sz="4" w:space="0" w:color="auto"/>
+            </w:tcBorders>
+            <w:shd w:val="clear" w:color="000000" w:fill="FFFFFF"/>
+            <w:vAlign w:val="center"/>
+            <w:hideMark/>
+          </w:tcPr>
+          <w:p>
+            <w:pPr>
+              <w:pStyle w:val="NormalTab"/>
+            </w:pPr>
+            <w:proofErr w:type="spellStart"/>
+            <w:r>
+              <w:t>lbs</w:t>
+            </w:r>
+            <w:proofErr w:type="spellEnd"/>
+            <w:r>
+              <w:t xml:space="preserve"> or gal</w:t>
+            </w:r>
+            <w:r>
+              <w:br/>
+              <w:t>(with dead Vol.)</w:t>
+            </w:r>
+          </w:p>
+        </w:tc>
+      </w:tr>
+      <w:tr>
+        <w:trPr>
+          <w:gridAfter w:val="1"/>
+          <w:wAfter w:w="18" w:type="dxa"/>
+          <w:trHeight w:val="284"/>
+          <w:jc w:val="center"/>
+        </w:trPr>
+        <w:tc>
+          <w:tcPr>
+            <w:tcW w:w="605" w:type="dxa"/>
+            <w:tcBorders>
+              <w:top w:val="nil"/>
+              <w:left w:val="single" w:sz="4" w:space="0" w:color="auto"/>
+              <w:bottom w:val="single" w:sz="4" w:space="0" w:color="auto"/>
+              <w:right w:val="single" w:sz="4" w:space="0" w:color="auto"/>
+            </w:tcBorders>
+            <w:vAlign w:val="center"/>
+          </w:tcPr>
+          <w:p>
+            <w:pPr>
+              <w:pStyle w:val="NormalTab"/>
+            </w:pPr>
+            <w:r>
+              <w:t xml:space="preserve">{%tr for a in scavenger.additives %}</w:t>
+            </w:r>
+            <w:proofErr w:type="spellStart"/>
+            <w:proofErr w:type="gramStart"/>
+            <w:r>
+              <w:t/>
+            </w:r>
+            <w:proofErr w:type="spellEnd"/>
+            <w:proofErr w:type="gramEnd"/>
+            <w:r>
+              <w:t xml:space="preserve"/>
+            </w:r>
+          </w:p>
+        </w:tc>
+        <w:tc>
+          <w:tcPr>
+            <w:tcW w:w="1639" w:type="dxa"/>
+            <w:tcBorders>
+              <w:top w:val="nil"/>
+              <w:left w:val="nil"/>
+              <w:bottom w:val="single" w:sz="4" w:space="0" w:color="auto"/>
+              <w:right w:val="single" w:sz="4" w:space="0" w:color="auto"/>
+            </w:tcBorders>
+            <w:vAlign w:val="center"/>
+          </w:tcPr>
+          <w:p>
+            <w:pPr>
+              <w:pStyle w:val="NormalTab"/>
+            </w:pPr>
+          </w:p>
+        </w:tc>
+        <w:tc>
+          <w:tcPr>
+            <w:tcW w:w="1908" w:type="dxa"/>
+            <w:tcBorders>
+              <w:top w:val="nil"/>
+              <w:left w:val="nil"/>
+              <w:bottom w:val="single" w:sz="4" w:space="0" w:color="auto"/>
+              <w:right w:val="single" w:sz="4" w:space="0" w:color="auto"/>
+            </w:tcBorders>
+            <w:vAlign w:val="center"/>
+          </w:tcPr>
+          <w:p>
+            <w:pPr>
+              <w:pStyle w:val="NormalTab"/>
+            </w:pPr>
+          </w:p>
+        </w:tc>
+        <w:tc>
+          <w:tcPr>
+            <w:tcW w:w="1309" w:type="dxa"/>
+            <w:tcBorders>
+              <w:top w:val="nil"/>
+              <w:left w:val="nil"/>
+              <w:bottom w:val="single" w:sz="4" w:space="0" w:color="auto"/>
+              <w:right w:val="single" w:sz="4" w:space="0" w:color="auto"/>
+            </w:tcBorders>
+            <w:vAlign w:val="center"/>
+          </w:tcPr>
+          <w:p>
+            <w:pPr>
+              <w:pStyle w:val="NormalTab"/>
+            </w:pPr>
+          </w:p>
+        </w:tc>
+        <w:tc>
+          <w:tcPr>
+            <w:tcW w:w="1448" w:type="dxa"/>
+            <w:tcBorders>
+              <w:top w:val="nil"/>
+              <w:left w:val="nil"/>
+              <w:bottom w:val="single" w:sz="4" w:space="0" w:color="auto"/>
+              <w:right w:val="single" w:sz="4" w:space="0" w:color="auto"/>
+            </w:tcBorders>
+            <w:vAlign w:val="center"/>
+          </w:tcPr>
+          <w:p>
+            <w:pPr>
+              <w:pStyle w:val="NormalTab"/>
+            </w:pPr>
+          </w:p>
+        </w:tc>
+        <w:tc>
+          <w:tcPr>
+            <w:tcW w:w="1594" w:type="dxa"/>
+            <w:tcBorders>
+              <w:top w:val="nil"/>
+              <w:left w:val="nil"/>
+              <w:bottom w:val="single" w:sz="4" w:space="0" w:color="auto"/>
+              <w:right w:val="single" w:sz="4" w:space="0" w:color="auto"/>
+            </w:tcBorders>
+            <w:vAlign w:val="center"/>
+          </w:tcPr>
+          <w:p>
+            <w:pPr>
+              <w:pStyle w:val="NormalTab"/>
+            </w:pPr>
+          </w:p>
+        </w:tc>
+        <w:tc>
+          <w:tcPr>
+            <w:tcW w:w="1679" w:type="dxa"/>
+            <w:tcBorders>
+              <w:top w:val="nil"/>
+              <w:left w:val="nil"/>
+              <w:bottom w:val="single" w:sz="4" w:space="0" w:color="auto"/>
+              <w:right w:val="single" w:sz="4" w:space="0" w:color="auto"/>
+            </w:tcBorders>
+            <w:vAlign w:val="center"/>
+          </w:tcPr>
+          <w:p>
+            <w:pPr>
+              <w:pStyle w:val="NormalTab"/>
+            </w:pPr>
+          </w:p>
+        </w:tc>
+      </w:tr>
+      <w:tr>
+        <w:trPr>
+          <w:gridAfter w:val="1"/>
+          <w:wAfter w:w="18" w:type="dxa"/>
+          <w:trHeight w:val="284"/>
+          <w:jc w:val="center"/>
+        </w:trPr>
+        <w:tc>
+          <w:tcPr>
+            <w:tcW w:w="605" w:type="dxa"/>
+            <w:tcBorders>
+              <w:top w:val="nil"/>
+              <w:left w:val="single" w:sz="4" w:space="0" w:color="auto"/>
+              <w:bottom w:val="single" w:sz="4" w:space="0" w:color="auto"/>
+              <w:right w:val="single" w:sz="4" w:space="0" w:color="auto"/>
+            </w:tcBorders>
+            <w:vAlign w:val="center"/>
+          </w:tcPr>
+          <w:p>
+            <w:pPr>
+              <w:pStyle w:val="NormalTab"/>
+            </w:pPr>
+            <w:proofErr w:type="gramStart"/>
+            <w:r>
+              <w:t xml:space="preserve">{{ </w:t>
+            </w:r>
+            <w:proofErr w:type="spellStart"/>
+            <w:r>
+              <w:t>loop</w:t>
+            </w:r>
+            <w:proofErr w:type="gramEnd"/>
+            <w:r>
+              <w:t>.index</w:t>
+            </w:r>
+            <w:proofErr w:type="spellEnd"/>
+            <w:r>
+              <w:t xml:space="preserve"> }}</w:t>
+            </w:r>
+          </w:p>
+        </w:tc>
+        <w:tc>
+          <w:tcPr>
+            <w:tcW w:w="1639" w:type="dxa"/>
+            <w:tcBorders>
+              <w:top w:val="nil"/>
+              <w:left w:val="nil"/>
+              <w:bottom w:val="single" w:sz="4" w:space="0" w:color="auto"/>
+              <w:right w:val="single" w:sz="4" w:space="0" w:color="auto"/>
+            </w:tcBorders>
+            <w:vAlign w:val="center"/>
+          </w:tcPr>
+          <w:p>
+            <w:pPr>
+              <w:pStyle w:val="NormalTab"/>
+            </w:pPr>
+            <w:proofErr w:type="gramStart"/>
+            <w:r>
+              <w:t xml:space="preserve">{{ </w:t>
+            </w:r>
+            <w:proofErr w:type="spellStart"/>
+            <w:r>
+              <w:t>a</w:t>
+            </w:r>
+            <w:proofErr w:type="gramEnd"/>
+            <w:r>
+              <w:t>.Name</w:t>
+            </w:r>
+            <w:proofErr w:type="spellEnd"/>
+            <w:r>
+              <w:t xml:space="preserve"> }}</w:t>
+            </w:r>
+          </w:p>
+        </w:tc>
+        <w:tc>
+          <w:tcPr>
+            <w:tcW w:w="1908" w:type="dxa"/>
+            <w:tcBorders>
+              <w:top w:val="nil"/>
+              <w:left w:val="nil"/>
+              <w:bottom w:val="single" w:sz="4" w:space="0" w:color="auto"/>
+              <w:right w:val="single" w:sz="4" w:space="0" w:color="auto"/>
+            </w:tcBorders>
+            <w:vAlign w:val="center"/>
+          </w:tcPr>
+          <w:p>
+            <w:pPr>
+              <w:pStyle w:val="NormalTab"/>
+            </w:pPr>
+            <w:proofErr w:type="gramStart"/>
+            <w:r>
+              <w:t>{{ a</w:t>
+            </w:r>
+            <w:proofErr w:type="gramEnd"/>
+            <w:r>
+              <w:t>['Material Type'] }}</w:t>
+            </w:r>
+          </w:p>
+        </w:tc>
+        <w:tc>
+          <w:tcPr>
+            <w:tcW w:w="1309" w:type="dxa"/>
+            <w:tcBorders>
+              <w:top w:val="nil"/>
+              <w:left w:val="nil"/>
+              <w:bottom w:val="single" w:sz="4" w:space="0" w:color="auto"/>
+              <w:right w:val="single" w:sz="4" w:space="0" w:color="auto"/>
+            </w:tcBorders>
+            <w:vAlign w:val="center"/>
+          </w:tcPr>
+          <w:p>
+            <w:pPr>
+              <w:pStyle w:val="NormalTab"/>
+            </w:pPr>
+            <w:proofErr w:type="gramStart"/>
+            <w:r>
+              <w:t>{{ a</w:t>
+            </w:r>
+            <w:proofErr w:type="gramEnd"/>
+            <w:r>
+              <w:t>['</w:t>
+            </w:r>
+            <w:proofErr w:type="spellStart"/>
+            <w:r>
+              <w:t>lbs</w:t>
+            </w:r>
+            <w:proofErr w:type="spellEnd"/>
+            <w:r>
+              <w:t xml:space="preserve"> or gal'] }}</w:t>
+            </w:r>
+          </w:p>
+        </w:tc>
+        <w:tc>
+          <w:tcPr>
+            <w:tcW w:w="1448" w:type="dxa"/>
+            <w:tcBorders>
+              <w:top w:val="nil"/>
+              <w:left w:val="nil"/>
+              <w:bottom w:val="single" w:sz="4" w:space="0" w:color="auto"/>
+              <w:right w:val="single" w:sz="4" w:space="0" w:color="auto"/>
+            </w:tcBorders>
+            <w:vAlign w:val="center"/>
+          </w:tcPr>
+          <w:p>
+            <w:pPr>
+              <w:pStyle w:val="NormalTab"/>
+            </w:pPr>
+            <w:proofErr w:type="gramStart"/>
+            <w:r>
+              <w:t>{{ a</w:t>
+            </w:r>
+            <w:proofErr w:type="gramEnd"/>
+            <w:r>
+              <w:t>['(</w:t>
+            </w:r>
+            <w:proofErr w:type="spellStart"/>
+            <w:r>
+              <w:t>lbs</w:t>
+            </w:r>
+            <w:proofErr w:type="spellEnd"/>
+            <w:r>
+              <w:t xml:space="preserve"> or gal)/</w:t>
+            </w:r>
+            <w:proofErr w:type="spellStart"/>
+            <w:r>
+              <w:t>sk</w:t>
+            </w:r>
+            <w:proofErr w:type="spellEnd"/>
+            <w:r>
+              <w:t>'] }}</w:t>
+            </w:r>
+          </w:p>
+        </w:tc>
+        <w:tc>
+          <w:tcPr>
+            <w:tcW w:w="1594" w:type="dxa"/>
+            <w:tcBorders>
+              <w:top w:val="nil"/>
+              <w:left w:val="nil"/>
+              <w:bottom w:val="single" w:sz="4" w:space="0" w:color="auto"/>
+              <w:right w:val="single" w:sz="4" w:space="0" w:color="auto"/>
+            </w:tcBorders>
+            <w:vAlign w:val="center"/>
+          </w:tcPr>
+          <w:p>
+            <w:pPr>
+              <w:pStyle w:val="NormalTab"/>
+            </w:pPr>
+            <w:proofErr w:type="gramStart"/>
+            <w:r>
+              <w:t>{{ a</w:t>
+            </w:r>
+            <w:proofErr w:type="gramEnd"/>
+            <w:r>
+              <w:t>['(</w:t>
+            </w:r>
+            <w:proofErr w:type="spellStart"/>
+            <w:r>
+              <w:t>lbs</w:t>
+            </w:r>
+            <w:proofErr w:type="spellEnd"/>
+            <w:r>
+              <w:t xml:space="preserve"> or gal)/</w:t>
+            </w:r>
+            <w:proofErr w:type="spellStart"/>
+            <w:r>
+              <w:t>bbl</w:t>
+            </w:r>
+            <w:proofErr w:type="spellEnd"/>
+            <w:r>
+              <w:t>'] }}</w:t>
+            </w:r>
+          </w:p>
+        </w:tc>
+        <w:tc>
+          <w:tcPr>
+            <w:tcW w:w="1679" w:type="dxa"/>
+            <w:tcBorders>
+              <w:top w:val="nil"/>
+              <w:left w:val="nil"/>
+              <w:bottom w:val="single" w:sz="4" w:space="0" w:color="auto"/>
+              <w:right w:val="single" w:sz="4" w:space="0" w:color="auto"/>
+            </w:tcBorders>
+            <w:vAlign w:val="center"/>
+          </w:tcPr>
+          <w:p>
+            <w:pPr>
+              <w:pStyle w:val="NormalTab"/>
+            </w:pPr>
+            <w:proofErr w:type="gramStart"/>
+            <w:r>
+              <w:t>{{ a</w:t>
+            </w:r>
+            <w:proofErr w:type="gramEnd"/>
+            <w:r>
+              <w:t>['</w:t>
+            </w:r>
+            <w:proofErr w:type="spellStart"/>
+            <w:r>
+              <w:t>lbs</w:t>
+            </w:r>
+            <w:proofErr w:type="spellEnd"/>
+            <w:r>
+              <w:t xml:space="preserve"> or gal (with dead Vol.)'] }}</w:t>
+            </w:r>
+          </w:p>
+        </w:tc>
+      </w:tr>
+      <w:tr>
+        <w:trPr>
+          <w:gridAfter w:val="1"/>
+          <w:wAfter w:w="18" w:type="dxa"/>
+          <w:trHeight w:val="284"/>
+          <w:jc w:val="center"/>
+        </w:trPr>
+        <w:tc>
+          <w:tcPr>
+            <w:tcW w:w="605" w:type="dxa"/>
+            <w:tcBorders>
+              <w:top w:val="nil"/>
+              <w:left w:val="single" w:sz="4" w:space="0" w:color="auto"/>
+              <w:bottom w:val="single" w:sz="4" w:space="0" w:color="auto"/>
+              <w:right w:val="single" w:sz="4" w:space="0" w:color="auto"/>
+            </w:tcBorders>
+            <w:vAlign w:val="center"/>
+          </w:tcPr>
+          <w:p>
+            <w:pPr>
+              <w:pStyle w:val="NormalTab"/>
+            </w:pPr>
+            <w:r>
+              <w:t xml:space="preserve">{%tr </w:t>
+            </w:r>
+            <w:proofErr w:type="spellStart"/>
+            <w:r>
+              <w:t>endfor</w:t>
+            </w:r>
+            <w:proofErr w:type="spellEnd"/>
+            <w:r>
+              <w:t xml:space="preserve"> %}</w:t>
+            </w:r>
+          </w:p>
+        </w:tc>
+        <w:tc>
+          <w:tcPr>
+            <w:tcW w:w="1639" w:type="dxa"/>
+            <w:tcBorders>
+              <w:top w:val="nil"/>
+              <w:left w:val="nil"/>
+              <w:bottom w:val="single" w:sz="4" w:space="0" w:color="auto"/>
+              <w:right w:val="single" w:sz="4" w:space="0" w:color="auto"/>
+            </w:tcBorders>
+            <w:vAlign w:val="center"/>
+          </w:tcPr>
+          <w:p>
+            <w:pPr>
+              <w:pStyle w:val="NormalTab"/>
+            </w:pPr>
+          </w:p>
+        </w:tc>
+        <w:tc>
+          <w:tcPr>
+            <w:tcW w:w="1908" w:type="dxa"/>
+            <w:tcBorders>
+              <w:top w:val="nil"/>
+              <w:left w:val="nil"/>
+              <w:bottom w:val="single" w:sz="4" w:space="0" w:color="auto"/>
+              <w:right w:val="single" w:sz="4" w:space="0" w:color="auto"/>
+            </w:tcBorders>
+            <w:vAlign w:val="center"/>
+          </w:tcPr>
+          <w:p>
+            <w:pPr>
+              <w:pStyle w:val="NormalTab"/>
+            </w:pPr>
+          </w:p>
+        </w:tc>
+        <w:tc>
+          <w:tcPr>
+            <w:tcW w:w="1309" w:type="dxa"/>
+            <w:tcBorders>
+              <w:top w:val="nil"/>
+              <w:left w:val="nil"/>
+              <w:bottom w:val="single" w:sz="4" w:space="0" w:color="auto"/>
+              <w:right w:val="single" w:sz="4" w:space="0" w:color="auto"/>
+            </w:tcBorders>
+            <w:vAlign w:val="center"/>
+          </w:tcPr>
+          <w:p>
+            <w:pPr>
+              <w:pStyle w:val="NormalTab"/>
+            </w:pPr>
+          </w:p>
+        </w:tc>
+        <w:tc>
+          <w:tcPr>
+            <w:tcW w:w="1448" w:type="dxa"/>
+            <w:tcBorders>
+              <w:top w:val="nil"/>
+              <w:left w:val="nil"/>
+              <w:bottom w:val="single" w:sz="4" w:space="0" w:color="auto"/>
+              <w:right w:val="single" w:sz="4" w:space="0" w:color="auto"/>
+            </w:tcBorders>
+            <w:vAlign w:val="center"/>
+          </w:tcPr>
+          <w:p>
+            <w:pPr>
+              <w:pStyle w:val="NormalTab"/>
+            </w:pPr>
+          </w:p>
+        </w:tc>
+        <w:tc>
+          <w:tcPr>
+            <w:tcW w:w="1594" w:type="dxa"/>
+            <w:tcBorders>
+              <w:top w:val="nil"/>
+              <w:left w:val="nil"/>
+              <w:bottom w:val="single" w:sz="4" w:space="0" w:color="auto"/>
+              <w:right w:val="single" w:sz="4" w:space="0" w:color="auto"/>
+            </w:tcBorders>
+            <w:vAlign w:val="center"/>
+          </w:tcPr>
+          <w:p>
+            <w:pPr>
+              <w:pStyle w:val="NormalTab"/>
+            </w:pPr>
+          </w:p>
+        </w:tc>
+        <w:tc>
+          <w:tcPr>
+            <w:tcW w:w="1679" w:type="dxa"/>
+            <w:tcBorders>
+              <w:top w:val="nil"/>
+              <w:left w:val="nil"/>
+              <w:bottom w:val="single" w:sz="4" w:space="0" w:color="auto"/>
+              <w:right w:val="single" w:sz="4" w:space="0" w:color="auto"/>
+            </w:tcBorders>
+            <w:vAlign w:val="center"/>
+          </w:tcPr>
+          <w:p>
+            <w:pPr>
+              <w:pStyle w:val="NormalTab"/>
+            </w:pPr>
+          </w:p>
+        </w:tc>
+      </w:tr>
+    </w:tbl>
+    <w:p>
+      <w:pPr>
+        <w:spacing w:after="0" w:line="240" w:lineRule="auto"/>
+        <w:ind w:firstLine="0"/>
+        <w:rPr>
+          <w:rFonts w:asciiTheme="minorBidi" w:hAnsiTheme="minorBidi"/>
+          <w:color w:val="003D83"/>
+          <w:sz w:val="20"/>
+          <w:szCs w:val="20"/>
+        </w:rPr>
+      </w:pPr>
+      <w:proofErr w:type="gramStart"/>
+      <w:r>
+        <w:rPr>
+          <w:rFonts w:asciiTheme="minorBidi" w:hAnsiTheme="minorBidi"/>
+          <w:color w:val="003D83"/>
+          <w:sz w:val="20"/>
+          <w:szCs w:val="20"/>
+        </w:rPr>
+        <w:t xml:space="preserve">{{ scavenger.note_mix }}</w:t>
+      </w:r>
+      <w:proofErr w:type="spellStart"/>
+      <w:r>
+        <w:rPr>
+          <w:rFonts w:asciiTheme="minorBidi" w:hAnsiTheme="minorBidi"/>
+          <w:color w:val="003D83"/>
+          <w:sz w:val="20"/>
+          <w:szCs w:val="20"/>
+        </w:rPr>
+        <w:t/>
+      </w:r>
+      <w:proofErr w:type="gramEnd"/>
+      <w:r>
+        <w:rPr>
+          <w:rFonts w:asciiTheme="minorBidi" w:hAnsiTheme="minorBidi"/>
+          <w:color w:val="003D83"/>
+          <w:sz w:val="20"/>
+          <w:szCs w:val="20"/>
+        </w:rPr>
+        <w:t/>
+      </w:r>
+      <w:proofErr w:type="gramStart"/>
+      <w:r>
+        <w:rPr>
+          <w:rFonts w:asciiTheme="minorBidi" w:hAnsiTheme="minorBidi"/>
+          <w:color w:val="003D83"/>
+          <w:sz w:val="20"/>
+          <w:szCs w:val="20"/>
+        </w:rPr>
+        <w:t/>
+      </w:r>
+      <w:proofErr w:type="spellEnd"/>
+      <w:r>
+        <w:rPr>
+          <w:rFonts w:asciiTheme="minorBidi" w:hAnsiTheme="minorBidi"/>
+          <w:color w:val="003D83"/>
+          <w:sz w:val="20"/>
+          <w:szCs w:val="20"/>
+        </w:rPr>
+        <w:t xml:space="preserve"/>
+      </w:r>
+      <w:proofErr w:type="gramEnd"/>
+      <w:r>
+        <w:rPr>
+          <w:rFonts w:asciiTheme="minorBidi" w:hAnsiTheme="minorBidi"/>
+          <w:color w:val="003D83"/>
+          <w:sz w:val="20"/>
+          <w:szCs w:val="20"/>
+        </w:rPr>
+        <w:t/>
+      </w:r>
+    </w:p>
+    <w:p>
+      <w:r>
+        <w:t xml:space="preserve">{%p endif %}</w:t>
+      </w:r>
+      <w:proofErr w:type="spellStart"/>
+      <w:r>
+        <w:t/>
+      </w:r>
+      <w:proofErr w:type="spellEnd"/>
+      <w:r>
+        <w:t xml:space="preserve"/>
       </w:r>
     </w:p>
     <w:p>

</xml_diff>

<commit_message>
Round 13A A4: complete standalone Spacer Word integration
</commit_message>
<xml_diff>
--- a/master_template.docx
+++ b/master_template.docx
@@ -10781,13 +10781,15 @@
         <w:tblW w:w="9926" w:type="dxa"/>
         <w:jc w:val="center"/>
         <w:tblLook w:val="04A0" w:firstRow="1" w:lastRow="0" w:firstColumn="1" w:lastColumn="0" w:noHBand="0" w:noVBand="1"/>
+        <w:tblLayout w:type="fixed"/>
       </w:tblPr>
       <w:tblGrid>
-        <w:gridCol w:w="1406"/>
-        <w:gridCol w:w="1631"/>
-        <w:gridCol w:w="2268"/>
-        <w:gridCol w:w="2126"/>
-        <w:gridCol w:w="2495"/>
+        <w:gridCol w:w="750"/>
+        <w:gridCol w:w="2050"/>
+        <w:gridCol w:w="1900"/>
+        <w:gridCol w:w="1600"/>
+        <w:gridCol w:w="1950"/>
+        <w:gridCol w:w="1676"/>
       </w:tblGrid>
       <w:tr>
         <w:trPr>
@@ -10796,8 +10798,6 @@
         </w:trPr>
         <w:tc>
           <w:tcPr>
-            <w:tcW w:w="9926" w:type="dxa"/>
-            <w:gridSpan w:val="5"/>
             <w:tcBorders>
               <w:top w:val="single" w:sz="4" w:space="0" w:color="auto"/>
               <w:left w:val="single" w:sz="4" w:space="0" w:color="auto"/>
@@ -10805,9 +10805,10 @@
               <w:right w:val="single" w:sz="4" w:space="0" w:color="auto"/>
             </w:tcBorders>
             <w:shd w:val="clear" w:color="auto" w:fill="003D83"/>
-            <w:noWrap/>
-            <w:vAlign w:val="center"/>
-            <w:hideMark/>
+            <w:vAlign w:val="center"/>
+            <w:hideMark/>
+            <w:tcW w:w="9926" w:type="dxa"/>
+            <w:gridSpan w:val="6"/>
           </w:tcPr>
           <w:p>
             <w:pPr>
@@ -10833,7 +10834,7 @@
                 <w:sz w:val="20"/>
                 <w:szCs w:val="20"/>
               </w:rPr>
-              <w:t>Spacer Formulation Data</w:t>
+              <w:t>Spacer Additives Data</w:t>
             </w:r>
           </w:p>
         </w:tc>
@@ -10845,17 +10846,16 @@
         </w:trPr>
         <w:tc>
           <w:tcPr>
-            <w:tcW w:w="3037" w:type="dxa"/>
+            <w:tcBorders>
+              <w:top w:val="nil"/>
+              <w:left w:val="single" w:sz="4" w:space="0" w:color="auto"/>
+              <w:bottom w:val="single" w:sz="4" w:space="0" w:color="auto"/>
+              <w:right w:val="single" w:sz="4" w:space="0" w:color="auto"/>
+            </w:tcBorders>
+            <w:vAlign w:val="center"/>
+            <w:hideMark/>
+            <w:tcW w:w="2800" w:type="dxa"/>
             <w:gridSpan w:val="2"/>
-            <w:tcBorders>
-              <w:top w:val="nil"/>
-              <w:left w:val="single" w:sz="4" w:space="0" w:color="auto"/>
-              <w:bottom w:val="single" w:sz="4" w:space="0" w:color="auto"/>
-              <w:right w:val="single" w:sz="4" w:space="0" w:color="auto"/>
-            </w:tcBorders>
-            <w:noWrap/>
-            <w:vAlign w:val="center"/>
-            <w:hideMark/>
           </w:tcPr>
           <w:p>
             <w:pPr>
@@ -10868,55 +10868,36 @@
         </w:tc>
         <w:tc>
           <w:tcPr>
-            <w:tcW w:w="2268" w:type="dxa"/>
-            <w:tcBorders>
-              <w:top w:val="nil"/>
-              <w:left w:val="nil"/>
-              <w:bottom w:val="single" w:sz="4" w:space="0" w:color="auto"/>
-              <w:right w:val="single" w:sz="4" w:space="0" w:color="auto"/>
-            </w:tcBorders>
-            <w:noWrap/>
-            <w:vAlign w:val="center"/>
-            <w:hideMark/>
-          </w:tcPr>
-          <w:p>
-            <w:pPr>
-              <w:pStyle w:val="NormalTab"/>
-            </w:pPr>
-            <w:proofErr w:type="gramStart"/>
-            <w:r>
-              <w:t xml:space="preserve">{{ </w:t>
-            </w:r>
-            <w:r>
-              <w:t>spacer_volume_bbl</w:t>
-            </w:r>
-            <w:proofErr w:type="spellEnd"/>
-            <w:r>
-              <w:t xml:space="preserve"> }</w:t>
-            </w:r>
-            <w:proofErr w:type="gramEnd"/>
-            <w:r>
-              <w:t xml:space="preserve">} </w:t>
-            </w:r>
-            <w:proofErr w:type="spellStart"/>
-            <w:r>
-              <w:t>bbl</w:t>
-            </w:r>
-            <w:proofErr w:type="spellEnd"/>
-          </w:p>
-        </w:tc>
-        <w:tc>
-          <w:tcPr>
-            <w:tcW w:w="2126" w:type="dxa"/>
-            <w:tcBorders>
-              <w:top w:val="nil"/>
-              <w:left w:val="nil"/>
-              <w:bottom w:val="single" w:sz="4" w:space="0" w:color="auto"/>
-              <w:right w:val="single" w:sz="4" w:space="0" w:color="auto"/>
-            </w:tcBorders>
-            <w:noWrap/>
-            <w:vAlign w:val="center"/>
-            <w:hideMark/>
+            <w:tcBorders>
+              <w:top w:val="nil"/>
+              <w:left w:val="nil"/>
+              <w:bottom w:val="single" w:sz="4" w:space="0" w:color="auto"/>
+              <w:right w:val="single" w:sz="4" w:space="0" w:color="auto"/>
+            </w:tcBorders>
+            <w:vAlign w:val="center"/>
+            <w:hideMark/>
+            <w:tcW w:w="1900" w:type="dxa"/>
+          </w:tcPr>
+          <w:p>
+            <w:pPr>
+              <w:pStyle w:val="NormalTab"/>
+            </w:pPr>
+            <w:r>
+              <w:t>{{ standalone_spacer.volume }} bbl</w:t>
+            </w:r>
+          </w:p>
+        </w:tc>
+        <w:tc>
+          <w:tcPr>
+            <w:tcBorders>
+              <w:top w:val="nil"/>
+              <w:left w:val="nil"/>
+              <w:bottom w:val="single" w:sz="4" w:space="0" w:color="auto"/>
+              <w:right w:val="single" w:sz="4" w:space="0" w:color="auto"/>
+            </w:tcBorders>
+            <w:vAlign w:val="center"/>
+            <w:hideMark/>
+            <w:tcW w:w="1600" w:type="dxa"/>
           </w:tcPr>
           <w:p>
             <w:pPr>
@@ -10929,35 +10910,23 @@
         </w:tc>
         <w:tc>
           <w:tcPr>
-            <w:tcW w:w="2495" w:type="dxa"/>
-            <w:tcBorders>
-              <w:top w:val="nil"/>
-              <w:left w:val="nil"/>
-              <w:bottom w:val="single" w:sz="4" w:space="0" w:color="auto"/>
-              <w:right w:val="single" w:sz="4" w:space="0" w:color="auto"/>
-            </w:tcBorders>
-            <w:noWrap/>
-            <w:vAlign w:val="center"/>
-            <w:hideMark/>
-          </w:tcPr>
-          <w:p>
-            <w:pPr>
-              <w:pStyle w:val="NormalTab"/>
-            </w:pPr>
-            <w:proofErr w:type="gramStart"/>
-            <w:r>
-              <w:t xml:space="preserve">{{ </w:t>
-            </w:r>
-            <w:r>
-              <w:t>spacer_density_note</w:t>
-            </w:r>
-            <w:proofErr w:type="spellEnd"/>
-            <w:r>
-              <w:t xml:space="preserve"> }</w:t>
-            </w:r>
-            <w:proofErr w:type="gramEnd"/>
-            <w:r>
-              <w:t>} pcf</w:t>
+            <w:tcBorders>
+              <w:top w:val="nil"/>
+              <w:left w:val="nil"/>
+              <w:bottom w:val="single" w:sz="4" w:space="0" w:color="auto"/>
+              <w:right w:val="single" w:sz="4" w:space="0" w:color="auto"/>
+            </w:tcBorders>
+            <w:vAlign w:val="center"/>
+            <w:hideMark/>
+            <w:tcW w:w="3626" w:type="dxa"/>
+            <w:gridSpan w:val="2"/>
+          </w:tcPr>
+          <w:p>
+            <w:pPr>
+              <w:pStyle w:val="NormalTab"/>
+            </w:pPr>
+            <w:r>
+              <w:t>{{ standalone_spacer.density }} pcf</w:t>
             </w:r>
           </w:p>
         </w:tc>
@@ -10969,7 +10938,6 @@
         </w:trPr>
         <w:tc>
           <w:tcPr>
-            <w:tcW w:w="605" w:type="dxa"/>
             <w:tcBorders>
               <w:top w:val="nil"/>
               <w:left w:val="single" w:sz="4" w:space="0" w:color="auto"/>
@@ -10979,6 +10947,7 @@
             <w:shd w:val="clear" w:color="000000" w:fill="FFFFFF"/>
             <w:vAlign w:val="center"/>
             <w:hideMark/>
+            <w:tcW w:w="750" w:type="dxa"/>
           </w:tcPr>
           <w:p>
             <w:pPr>
@@ -10991,7 +10960,6 @@
         </w:tc>
         <w:tc>
           <w:tcPr>
-            <w:tcW w:w="2432" w:type="dxa"/>
             <w:tcBorders>
               <w:top w:val="nil"/>
               <w:left w:val="nil"/>
@@ -11001,6 +10969,7 @@
             <w:shd w:val="clear" w:color="000000" w:fill="FFFFFF"/>
             <w:vAlign w:val="center"/>
             <w:hideMark/>
+            <w:tcW w:w="2050" w:type="dxa"/>
           </w:tcPr>
           <w:p>
             <w:pPr>
@@ -11013,7 +10982,6 @@
         </w:tc>
         <w:tc>
           <w:tcPr>
-            <w:tcW w:w="2268" w:type="dxa"/>
             <w:tcBorders>
               <w:top w:val="nil"/>
               <w:left w:val="nil"/>
@@ -11023,6 +10991,7 @@
             <w:shd w:val="clear" w:color="000000" w:fill="FFFFFF"/>
             <w:vAlign w:val="center"/>
             <w:hideMark/>
+            <w:tcW w:w="1900" w:type="dxa"/>
           </w:tcPr>
           <w:p>
             <w:pPr>
@@ -11035,7 +11004,6 @@
         </w:tc>
         <w:tc>
           <w:tcPr>
-            <w:tcW w:w="2126" w:type="dxa"/>
             <w:tcBorders>
               <w:top w:val="nil"/>
               <w:left w:val="nil"/>
@@ -11045,24 +11013,19 @@
             <w:shd w:val="clear" w:color="000000" w:fill="FFFFFF"/>
             <w:vAlign w:val="center"/>
             <w:hideMark/>
-          </w:tcPr>
-          <w:p>
-            <w:pPr>
-              <w:pStyle w:val="NormalTab"/>
-            </w:pPr>
-            <w:proofErr w:type="spellStart"/>
-            <w:r>
-              <w:t>lbs</w:t>
-            </w:r>
-            <w:proofErr w:type="spellEnd"/>
-            <w:r>
-              <w:t xml:space="preserve"> or gal </w:t>
-            </w:r>
-          </w:p>
-        </w:tc>
-        <w:tc>
-          <w:tcPr>
-            <w:tcW w:w="2495" w:type="dxa"/>
+            <w:tcW w:w="1600" w:type="dxa"/>
+          </w:tcPr>
+          <w:p>
+            <w:pPr>
+              <w:pStyle w:val="NormalTab"/>
+            </w:pPr>
+            <w:r>
+              <w:t>lbs or gal</w:t>
+            </w:r>
+          </w:p>
+        </w:tc>
+        <w:tc>
+          <w:tcPr>
             <w:tcBorders>
               <w:top w:val="nil"/>
               <w:left w:val="nil"/>
@@ -11072,27 +11035,37 @@
             <w:shd w:val="clear" w:color="000000" w:fill="FFFFFF"/>
             <w:vAlign w:val="center"/>
             <w:hideMark/>
-          </w:tcPr>
-          <w:p>
-            <w:pPr>
-              <w:pStyle w:val="NormalTab"/>
-            </w:pPr>
-            <w:r>
-              <w:t>(</w:t>
-            </w:r>
-            <w:proofErr w:type="spellStart"/>
-            <w:r>
-              <w:t>lbs</w:t>
-            </w:r>
-            <w:proofErr w:type="spellEnd"/>
-            <w:r>
-              <w:t xml:space="preserve"> or gal) / </w:t>
-            </w:r>
-            <w:proofErr w:type="spellStart"/>
-            <w:r>
-              <w:t>bbl</w:t>
-            </w:r>
-            <w:proofErr w:type="spellEnd"/>
+            <w:tcW w:w="1950" w:type="dxa"/>
+          </w:tcPr>
+          <w:p>
+            <w:pPr>
+              <w:pStyle w:val="NormalTab"/>
+            </w:pPr>
+            <w:r>
+              <w:t>lbs / bbl or gal / bbl</w:t>
+            </w:r>
+          </w:p>
+        </w:tc>
+        <w:tc>
+          <w:tcPr>
+            <w:tcBorders>
+              <w:top w:val="nil"/>
+              <w:left w:val="nil"/>
+              <w:bottom w:val="single" w:sz="4" w:space="0" w:color="auto"/>
+              <w:right w:val="single" w:sz="4" w:space="0" w:color="auto"/>
+            </w:tcBorders>
+            <w:shd w:val="clear" w:color="000000" w:fill="FFFFFF"/>
+            <w:vAlign w:val="center"/>
+            <w:hideMark/>
+            <w:tcW w:w="1676" w:type="dxa"/>
+          </w:tcPr>
+          <w:p>
+            <w:pPr>
+              <w:pStyle w:val="NormalTab"/>
+            </w:pPr>
+            <w:r>
+              <w:t>lbs or gal (with dead Vol.)</w:t>
+            </w:r>
           </w:p>
         </w:tc>
       </w:tr>
@@ -11103,7 +11076,6 @@
         </w:trPr>
         <w:tc>
           <w:tcPr>
-            <w:tcW w:w="605" w:type="dxa"/>
             <w:tcBorders>
               <w:top w:val="nil"/>
               <w:left w:val="single" w:sz="4" w:space="0" w:color="auto"/>
@@ -11111,92 +11083,115 @@
               <w:right w:val="single" w:sz="4" w:space="0" w:color="auto"/>
             </w:tcBorders>
             <w:vAlign w:val="center"/>
-          </w:tcPr>
-          <w:p>
-            <w:pPr>
-              <w:pStyle w:val="NormalTab"/>
-            </w:pPr>
-            <w:r>
-              <w:t xml:space="preserve">{%tr for r in </w:t>
-            </w:r>
-            <w:proofErr w:type="spellStart"/>
-            <w:proofErr w:type="gramStart"/>
-            <w:r>
-              <w:t>spacers</w:t>
-            </w:r>
-            <w:proofErr w:type="spellEnd"/>
-            <w:proofErr w:type="gramEnd"/>
-            <w:r>
-              <w:t xml:space="preserve"> %}</w:t>
-            </w:r>
-          </w:p>
-        </w:tc>
-        <w:tc>
-          <w:tcPr>
-            <w:tcW w:w="2432" w:type="dxa"/>
-            <w:tcBorders>
-              <w:top w:val="nil"/>
-              <w:left w:val="nil"/>
-              <w:bottom w:val="single" w:sz="4" w:space="0" w:color="auto"/>
-              <w:right w:val="single" w:sz="4" w:space="0" w:color="auto"/>
-            </w:tcBorders>
-            <w:vAlign w:val="center"/>
-          </w:tcPr>
-          <w:p>
-            <w:pPr>
-              <w:pStyle w:val="NormalTab"/>
-            </w:pPr>
-          </w:p>
-        </w:tc>
-        <w:tc>
-          <w:tcPr>
-            <w:tcW w:w="2268" w:type="dxa"/>
-            <w:tcBorders>
-              <w:top w:val="nil"/>
-              <w:left w:val="nil"/>
-              <w:bottom w:val="single" w:sz="4" w:space="0" w:color="auto"/>
-              <w:right w:val="single" w:sz="4" w:space="0" w:color="auto"/>
-            </w:tcBorders>
-            <w:vAlign w:val="center"/>
-          </w:tcPr>
-          <w:p>
-            <w:pPr>
-              <w:pStyle w:val="NormalTab"/>
-            </w:pPr>
-          </w:p>
-        </w:tc>
-        <w:tc>
-          <w:tcPr>
-            <w:tcW w:w="2126" w:type="dxa"/>
-            <w:tcBorders>
-              <w:top w:val="nil"/>
-              <w:left w:val="nil"/>
-              <w:bottom w:val="single" w:sz="4" w:space="0" w:color="auto"/>
-              <w:right w:val="single" w:sz="4" w:space="0" w:color="auto"/>
-            </w:tcBorders>
-            <w:vAlign w:val="center"/>
-          </w:tcPr>
-          <w:p>
-            <w:pPr>
-              <w:pStyle w:val="NormalTab"/>
-            </w:pPr>
-          </w:p>
-        </w:tc>
-        <w:tc>
-          <w:tcPr>
-            <w:tcW w:w="2495" w:type="dxa"/>
-            <w:tcBorders>
-              <w:top w:val="nil"/>
-              <w:left w:val="nil"/>
-              <w:bottom w:val="single" w:sz="4" w:space="0" w:color="auto"/>
-              <w:right w:val="single" w:sz="4" w:space="0" w:color="auto"/>
-            </w:tcBorders>
-            <w:vAlign w:val="center"/>
-          </w:tcPr>
-          <w:p>
-            <w:pPr>
-              <w:pStyle w:val="NormalTab"/>
-            </w:pPr>
+            <w:tcW w:w="750" w:type="dxa"/>
+          </w:tcPr>
+          <w:p>
+            <w:pPr>
+              <w:pStyle w:val="NormalTab"/>
+            </w:pPr>
+            <w:r>
+              <w:t>{%tr for r in standalone_spacer.rows %}</w:t>
+            </w:r>
+          </w:p>
+        </w:tc>
+        <w:tc>
+          <w:tcPr>
+            <w:tcBorders>
+              <w:top w:val="nil"/>
+              <w:left w:val="nil"/>
+              <w:bottom w:val="single" w:sz="4" w:space="0" w:color="auto"/>
+              <w:right w:val="single" w:sz="4" w:space="0" w:color="auto"/>
+            </w:tcBorders>
+            <w:vAlign w:val="center"/>
+            <w:tcW w:w="2050" w:type="dxa"/>
+          </w:tcPr>
+          <w:p>
+            <w:pPr>
+              <w:pStyle w:val="NormalTab"/>
+            </w:pPr>
+            <w:r>
+              <w:t/>
+            </w:r>
+          </w:p>
+        </w:tc>
+        <w:tc>
+          <w:tcPr>
+            <w:tcBorders>
+              <w:top w:val="nil"/>
+              <w:left w:val="nil"/>
+              <w:bottom w:val="single" w:sz="4" w:space="0" w:color="auto"/>
+              <w:right w:val="single" w:sz="4" w:space="0" w:color="auto"/>
+            </w:tcBorders>
+            <w:vAlign w:val="center"/>
+            <w:tcW w:w="1900" w:type="dxa"/>
+          </w:tcPr>
+          <w:p>
+            <w:pPr>
+              <w:pStyle w:val="NormalTab"/>
+            </w:pPr>
+            <w:r>
+              <w:t/>
+            </w:r>
+          </w:p>
+        </w:tc>
+        <w:tc>
+          <w:tcPr>
+            <w:tcBorders>
+              <w:top w:val="nil"/>
+              <w:left w:val="nil"/>
+              <w:bottom w:val="single" w:sz="4" w:space="0" w:color="auto"/>
+              <w:right w:val="single" w:sz="4" w:space="0" w:color="auto"/>
+            </w:tcBorders>
+            <w:vAlign w:val="center"/>
+            <w:tcW w:w="1600" w:type="dxa"/>
+          </w:tcPr>
+          <w:p>
+            <w:pPr>
+              <w:pStyle w:val="NormalTab"/>
+            </w:pPr>
+            <w:r>
+              <w:t/>
+            </w:r>
+          </w:p>
+        </w:tc>
+        <w:tc>
+          <w:tcPr>
+            <w:tcBorders>
+              <w:top w:val="nil"/>
+              <w:left w:val="nil"/>
+              <w:bottom w:val="single" w:sz="4" w:space="0" w:color="auto"/>
+              <w:right w:val="single" w:sz="4" w:space="0" w:color="auto"/>
+            </w:tcBorders>
+            <w:vAlign w:val="center"/>
+            <w:tcW w:w="1950" w:type="dxa"/>
+          </w:tcPr>
+          <w:p>
+            <w:pPr>
+              <w:pStyle w:val="NormalTab"/>
+            </w:pPr>
+            <w:r>
+              <w:t/>
+            </w:r>
+          </w:p>
+        </w:tc>
+        <w:tc>
+          <w:tcPr>
+            <w:tcBorders>
+              <w:top w:val="nil"/>
+              <w:left w:val="nil"/>
+              <w:bottom w:val="single" w:sz="4" w:space="0" w:color="auto"/>
+              <w:right w:val="single" w:sz="4" w:space="0" w:color="auto"/>
+            </w:tcBorders>
+            <w:vAlign w:val="center"/>
+            <w:tcW w:w="1676" w:type="dxa"/>
+          </w:tcPr>
+          <w:p>
+            <w:pPr>
+              <w:pStyle w:val="NormalTab"/>
+            </w:pPr>
+            <w:r>
+              <w:t/>
+            </w:r>
           </w:p>
         </w:tc>
       </w:tr>
@@ -11207,7 +11202,6 @@
         </w:trPr>
         <w:tc>
           <w:tcPr>
-            <w:tcW w:w="605" w:type="dxa"/>
             <w:tcBorders>
               <w:top w:val="nil"/>
               <w:left w:val="single" w:sz="4" w:space="0" w:color="auto"/>
@@ -11215,150 +11209,114 @@
               <w:right w:val="single" w:sz="4" w:space="0" w:color="auto"/>
             </w:tcBorders>
             <w:vAlign w:val="center"/>
-          </w:tcPr>
-          <w:p>
-            <w:pPr>
-              <w:pStyle w:val="NormalTab"/>
-            </w:pPr>
-            <w:proofErr w:type="gramStart"/>
-            <w:r>
-              <w:t xml:space="preserve">{{ </w:t>
-            </w:r>
-            <w:proofErr w:type="spellStart"/>
-            <w:r>
-              <w:t>loop</w:t>
-            </w:r>
-            <w:proofErr w:type="gramEnd"/>
-            <w:r>
-              <w:t>.index</w:t>
-            </w:r>
-            <w:proofErr w:type="spellEnd"/>
-            <w:r>
-              <w:t xml:space="preserve"> }}</w:t>
-            </w:r>
-          </w:p>
-        </w:tc>
-        <w:tc>
-          <w:tcPr>
-            <w:tcW w:w="2432" w:type="dxa"/>
-            <w:tcBorders>
-              <w:top w:val="nil"/>
-              <w:left w:val="nil"/>
-              <w:bottom w:val="single" w:sz="4" w:space="0" w:color="auto"/>
-              <w:right w:val="single" w:sz="4" w:space="0" w:color="auto"/>
-            </w:tcBorders>
-            <w:vAlign w:val="center"/>
-          </w:tcPr>
-          <w:p>
-            <w:pPr>
-              <w:pStyle w:val="NormalTab"/>
-            </w:pPr>
-            <w:proofErr w:type="gramStart"/>
-            <w:r>
-              <w:t xml:space="preserve">{{ </w:t>
-            </w:r>
-            <w:proofErr w:type="spellStart"/>
-            <w:r>
-              <w:t>r</w:t>
-            </w:r>
-            <w:proofErr w:type="gramEnd"/>
-            <w:r>
-              <w:t>.Name</w:t>
-            </w:r>
-            <w:proofErr w:type="spellEnd"/>
-            <w:r>
-              <w:t xml:space="preserve"> }}</w:t>
-            </w:r>
-          </w:p>
-        </w:tc>
-        <w:tc>
-          <w:tcPr>
-            <w:tcW w:w="2268" w:type="dxa"/>
-            <w:tcBorders>
-              <w:top w:val="nil"/>
-              <w:left w:val="nil"/>
-              <w:bottom w:val="single" w:sz="4" w:space="0" w:color="auto"/>
-              <w:right w:val="single" w:sz="4" w:space="0" w:color="auto"/>
-            </w:tcBorders>
-            <w:vAlign w:val="center"/>
-          </w:tcPr>
-          <w:p>
-            <w:pPr>
-              <w:pStyle w:val="NormalTab"/>
-            </w:pPr>
-            <w:proofErr w:type="gramStart"/>
-            <w:r>
-              <w:t>{{ r</w:t>
-            </w:r>
-            <w:proofErr w:type="gramEnd"/>
-            <w:r>
-              <w:t>['Material Type'] }}</w:t>
-            </w:r>
-          </w:p>
-        </w:tc>
-        <w:tc>
-          <w:tcPr>
-            <w:tcW w:w="2126" w:type="dxa"/>
-            <w:tcBorders>
-              <w:top w:val="nil"/>
-              <w:left w:val="nil"/>
-              <w:bottom w:val="single" w:sz="4" w:space="0" w:color="auto"/>
-              <w:right w:val="single" w:sz="4" w:space="0" w:color="auto"/>
-            </w:tcBorders>
-            <w:vAlign w:val="center"/>
-          </w:tcPr>
-          <w:p>
-            <w:pPr>
-              <w:pStyle w:val="NormalTab"/>
-            </w:pPr>
-            <w:proofErr w:type="gramStart"/>
-            <w:r>
-              <w:t xml:space="preserve">{{ </w:t>
-            </w:r>
-            <w:proofErr w:type="spellStart"/>
-            <w:r>
-              <w:t>r</w:t>
-            </w:r>
-            <w:proofErr w:type="gramEnd"/>
-            <w:r>
-              <w:t>.amount</w:t>
-            </w:r>
-            <w:proofErr w:type="spellEnd"/>
-            <w:r>
-              <w:t xml:space="preserve"> }}</w:t>
-            </w:r>
-          </w:p>
-        </w:tc>
-        <w:tc>
-          <w:tcPr>
-            <w:tcW w:w="2495" w:type="dxa"/>
-            <w:tcBorders>
-              <w:top w:val="nil"/>
-              <w:left w:val="nil"/>
-              <w:bottom w:val="single" w:sz="4" w:space="0" w:color="auto"/>
-              <w:right w:val="single" w:sz="4" w:space="0" w:color="auto"/>
-            </w:tcBorders>
-            <w:vAlign w:val="center"/>
-          </w:tcPr>
-          <w:p>
-            <w:pPr>
-              <w:pStyle w:val="NormalTab"/>
-            </w:pPr>
-            <w:proofErr w:type="gramStart"/>
-            <w:r>
-              <w:t xml:space="preserve">{{ </w:t>
-            </w:r>
-            <w:proofErr w:type="spellStart"/>
-            <w:r>
-              <w:t>r</w:t>
-            </w:r>
-            <w:proofErr w:type="gramEnd"/>
-            <w:r>
-              <w:t>.ratio</w:t>
-            </w:r>
-            <w:proofErr w:type="spellEnd"/>
-            <w:r>
-              <w:t xml:space="preserve"> }}</w:t>
+            <w:tcW w:w="750" w:type="dxa"/>
+          </w:tcPr>
+          <w:p>
+            <w:pPr>
+              <w:pStyle w:val="NormalTab"/>
+            </w:pPr>
+            <w:r>
+              <w:t>{{ r["Item"] }}</w:t>
+            </w:r>
+          </w:p>
+        </w:tc>
+        <w:tc>
+          <w:tcPr>
+            <w:tcBorders>
+              <w:top w:val="nil"/>
+              <w:left w:val="nil"/>
+              <w:bottom w:val="single" w:sz="4" w:space="0" w:color="auto"/>
+              <w:right w:val="single" w:sz="4" w:space="0" w:color="auto"/>
+            </w:tcBorders>
+            <w:vAlign w:val="center"/>
+            <w:tcW w:w="2050" w:type="dxa"/>
+          </w:tcPr>
+          <w:p>
+            <w:pPr>
+              <w:pStyle w:val="NormalTab"/>
+            </w:pPr>
+            <w:r>
+              <w:t>{{ r["Name"] }}</w:t>
+            </w:r>
+          </w:p>
+        </w:tc>
+        <w:tc>
+          <w:tcPr>
+            <w:tcBorders>
+              <w:top w:val="nil"/>
+              <w:left w:val="nil"/>
+              <w:bottom w:val="single" w:sz="4" w:space="0" w:color="auto"/>
+              <w:right w:val="single" w:sz="4" w:space="0" w:color="auto"/>
+            </w:tcBorders>
+            <w:vAlign w:val="center"/>
+            <w:tcW w:w="1900" w:type="dxa"/>
+          </w:tcPr>
+          <w:p>
+            <w:pPr>
+              <w:pStyle w:val="NormalTab"/>
+            </w:pPr>
+            <w:r>
+              <w:t>{{ r["Material Type"] }}</w:t>
+            </w:r>
+          </w:p>
+        </w:tc>
+        <w:tc>
+          <w:tcPr>
+            <w:tcBorders>
+              <w:top w:val="nil"/>
+              <w:left w:val="nil"/>
+              <w:bottom w:val="single" w:sz="4" w:space="0" w:color="auto"/>
+              <w:right w:val="single" w:sz="4" w:space="0" w:color="auto"/>
+            </w:tcBorders>
+            <w:vAlign w:val="center"/>
+            <w:tcW w:w="1600" w:type="dxa"/>
+          </w:tcPr>
+          <w:p>
+            <w:pPr>
+              <w:pStyle w:val="NormalTab"/>
+            </w:pPr>
+            <w:r>
+              <w:t>{{ r["lbs or gal"] }}</w:t>
+            </w:r>
+          </w:p>
+        </w:tc>
+        <w:tc>
+          <w:tcPr>
+            <w:tcBorders>
+              <w:top w:val="nil"/>
+              <w:left w:val="nil"/>
+              <w:bottom w:val="single" w:sz="4" w:space="0" w:color="auto"/>
+              <w:right w:val="single" w:sz="4" w:space="0" w:color="auto"/>
+            </w:tcBorders>
+            <w:vAlign w:val="center"/>
+            <w:tcW w:w="1950" w:type="dxa"/>
+          </w:tcPr>
+          <w:p>
+            <w:pPr>
+              <w:pStyle w:val="NormalTab"/>
+            </w:pPr>
+            <w:r>
+              <w:t>{{ r["lbs / bbl or gal / bbl"] }}</w:t>
+            </w:r>
+          </w:p>
+        </w:tc>
+        <w:tc>
+          <w:tcPr>
+            <w:tcBorders>
+              <w:top w:val="nil"/>
+              <w:left w:val="nil"/>
+              <w:bottom w:val="single" w:sz="4" w:space="0" w:color="auto"/>
+              <w:right w:val="single" w:sz="4" w:space="0" w:color="auto"/>
+            </w:tcBorders>
+            <w:vAlign w:val="center"/>
+            <w:tcW w:w="1676" w:type="dxa"/>
+          </w:tcPr>
+          <w:p>
+            <w:pPr>
+              <w:pStyle w:val="NormalTab"/>
+            </w:pPr>
+            <w:r>
+              <w:t>{{ r["lbs or gal\n(with dead Vol.)"] }}</w:t>
             </w:r>
           </w:p>
         </w:tc>
@@ -11370,7 +11328,6 @@
         </w:trPr>
         <w:tc>
           <w:tcPr>
-            <w:tcW w:w="605" w:type="dxa"/>
             <w:tcBorders>
               <w:top w:val="nil"/>
               <w:left w:val="single" w:sz="4" w:space="0" w:color="auto"/>
@@ -11378,94 +11335,140 @@
               <w:right w:val="single" w:sz="4" w:space="0" w:color="auto"/>
             </w:tcBorders>
             <w:vAlign w:val="center"/>
-          </w:tcPr>
-          <w:p>
-            <w:pPr>
-              <w:pStyle w:val="NormalTab"/>
-            </w:pPr>
-            <w:r>
-              <w:t xml:space="preserve">{%tr </w:t>
-            </w:r>
-            <w:proofErr w:type="spellStart"/>
-            <w:r>
-              <w:t>endfor</w:t>
-            </w:r>
-            <w:proofErr w:type="spellEnd"/>
-            <w:r>
-              <w:t xml:space="preserve"> %}</w:t>
-            </w:r>
-          </w:p>
-        </w:tc>
-        <w:tc>
-          <w:tcPr>
-            <w:tcW w:w="2432" w:type="dxa"/>
-            <w:tcBorders>
-              <w:top w:val="nil"/>
-              <w:left w:val="nil"/>
-              <w:bottom w:val="single" w:sz="4" w:space="0" w:color="auto"/>
-              <w:right w:val="single" w:sz="4" w:space="0" w:color="auto"/>
-            </w:tcBorders>
-            <w:vAlign w:val="center"/>
-          </w:tcPr>
-          <w:p>
-            <w:pPr>
-              <w:pStyle w:val="NormalTab"/>
-            </w:pPr>
-          </w:p>
-        </w:tc>
-        <w:tc>
-          <w:tcPr>
-            <w:tcW w:w="2268" w:type="dxa"/>
-            <w:tcBorders>
-              <w:top w:val="nil"/>
-              <w:left w:val="nil"/>
-              <w:bottom w:val="single" w:sz="4" w:space="0" w:color="auto"/>
-              <w:right w:val="single" w:sz="4" w:space="0" w:color="auto"/>
-            </w:tcBorders>
-            <w:vAlign w:val="center"/>
-          </w:tcPr>
-          <w:p>
-            <w:pPr>
-              <w:pStyle w:val="NormalTab"/>
-            </w:pPr>
-          </w:p>
-        </w:tc>
-        <w:tc>
-          <w:tcPr>
-            <w:tcW w:w="2126" w:type="dxa"/>
-            <w:tcBorders>
-              <w:top w:val="nil"/>
-              <w:left w:val="nil"/>
-              <w:bottom w:val="single" w:sz="4" w:space="0" w:color="auto"/>
-              <w:right w:val="single" w:sz="4" w:space="0" w:color="auto"/>
-            </w:tcBorders>
-            <w:vAlign w:val="center"/>
-          </w:tcPr>
-          <w:p>
-            <w:pPr>
-              <w:pStyle w:val="NormalTab"/>
-            </w:pPr>
-          </w:p>
-        </w:tc>
-        <w:tc>
-          <w:tcPr>
-            <w:tcW w:w="2495" w:type="dxa"/>
-            <w:tcBorders>
-              <w:top w:val="nil"/>
-              <w:left w:val="nil"/>
-              <w:bottom w:val="single" w:sz="4" w:space="0" w:color="auto"/>
-              <w:right w:val="single" w:sz="4" w:space="0" w:color="auto"/>
-            </w:tcBorders>
-            <w:vAlign w:val="center"/>
-          </w:tcPr>
-          <w:p>
-            <w:pPr>
-              <w:pStyle w:val="NormalTab"/>
-            </w:pPr>
+            <w:tcW w:w="750" w:type="dxa"/>
+          </w:tcPr>
+          <w:p>
+            <w:pPr>
+              <w:pStyle w:val="NormalTab"/>
+            </w:pPr>
+            <w:r>
+              <w:t>{%tr endfor %}</w:t>
+            </w:r>
+          </w:p>
+        </w:tc>
+        <w:tc>
+          <w:tcPr>
+            <w:tcBorders>
+              <w:top w:val="nil"/>
+              <w:left w:val="nil"/>
+              <w:bottom w:val="single" w:sz="4" w:space="0" w:color="auto"/>
+              <w:right w:val="single" w:sz="4" w:space="0" w:color="auto"/>
+            </w:tcBorders>
+            <w:vAlign w:val="center"/>
+            <w:tcW w:w="2050" w:type="dxa"/>
+          </w:tcPr>
+          <w:p>
+            <w:pPr>
+              <w:pStyle w:val="NormalTab"/>
+            </w:pPr>
+            <w:r>
+              <w:t/>
+            </w:r>
+          </w:p>
+        </w:tc>
+        <w:tc>
+          <w:tcPr>
+            <w:tcBorders>
+              <w:top w:val="nil"/>
+              <w:left w:val="nil"/>
+              <w:bottom w:val="single" w:sz="4" w:space="0" w:color="auto"/>
+              <w:right w:val="single" w:sz="4" w:space="0" w:color="auto"/>
+            </w:tcBorders>
+            <w:vAlign w:val="center"/>
+            <w:tcW w:w="1900" w:type="dxa"/>
+          </w:tcPr>
+          <w:p>
+            <w:pPr>
+              <w:pStyle w:val="NormalTab"/>
+            </w:pPr>
+            <w:r>
+              <w:t/>
+            </w:r>
+          </w:p>
+        </w:tc>
+        <w:tc>
+          <w:tcPr>
+            <w:tcBorders>
+              <w:top w:val="nil"/>
+              <w:left w:val="nil"/>
+              <w:bottom w:val="single" w:sz="4" w:space="0" w:color="auto"/>
+              <w:right w:val="single" w:sz="4" w:space="0" w:color="auto"/>
+            </w:tcBorders>
+            <w:vAlign w:val="center"/>
+            <w:tcW w:w="1600" w:type="dxa"/>
+          </w:tcPr>
+          <w:p>
+            <w:pPr>
+              <w:pStyle w:val="NormalTab"/>
+            </w:pPr>
+            <w:r>
+              <w:t/>
+            </w:r>
+          </w:p>
+        </w:tc>
+        <w:tc>
+          <w:tcPr>
+            <w:tcBorders>
+              <w:top w:val="nil"/>
+              <w:left w:val="nil"/>
+              <w:bottom w:val="single" w:sz="4" w:space="0" w:color="auto"/>
+              <w:right w:val="single" w:sz="4" w:space="0" w:color="auto"/>
+            </w:tcBorders>
+            <w:vAlign w:val="center"/>
+            <w:tcW w:w="1950" w:type="dxa"/>
+          </w:tcPr>
+          <w:p>
+            <w:pPr>
+              <w:pStyle w:val="NormalTab"/>
+            </w:pPr>
+            <w:r>
+              <w:t/>
+            </w:r>
+          </w:p>
+        </w:tc>
+        <w:tc>
+          <w:tcPr>
+            <w:tcBorders>
+              <w:top w:val="nil"/>
+              <w:left w:val="nil"/>
+              <w:bottom w:val="single" w:sz="4" w:space="0" w:color="auto"/>
+              <w:right w:val="single" w:sz="4" w:space="0" w:color="auto"/>
+            </w:tcBorders>
+            <w:vAlign w:val="center"/>
+            <w:tcW w:w="1676" w:type="dxa"/>
+          </w:tcPr>
+          <w:p>
+            <w:pPr>
+              <w:pStyle w:val="NormalTab"/>
+            </w:pPr>
+            <w:r>
+              <w:t/>
+            </w:r>
           </w:p>
         </w:tc>
       </w:tr>
     </w:tbl>
+    <w:p>
+      <w:pPr>
+        <w:spacing w:after="0" w:line="240" w:lineRule="auto"/>
+        <w:ind w:firstLine="0"/>
+        <w:rPr>
+          <w:rFonts w:asciiTheme="minorBidi" w:hAnsiTheme="minorBidi"/>
+          <w:color w:val="003D83"/>
+          <w:sz w:val="20"/>
+          <w:szCs w:val="20"/>
+        </w:rPr>
+      </w:pPr>
+      <w:r>
+        <w:rPr>
+          <w:rFonts w:asciiTheme="minorBidi" w:hAnsiTheme="minorBidi"/>
+          <w:color w:val="003D83"/>
+          <w:sz w:val="20"/>
+          <w:szCs w:val="20"/>
+        </w:rPr>
+        <w:t>{{ standalone_spacer.note_mix }}</w:t>
+      </w:r>
+    </w:p>
     <w:p>
       <w:r>
         <w:t>{%p endif %}</w:t>
@@ -19940,6 +19943,1911 @@
       <w:proofErr w:type="spellEnd"/>
       <w:r>
         <w:t xml:space="preserve"/>
+      </w:r>
+    </w:p>
+    <w:p>
+      <w:r>
+        <w:t>{%p if has_spacer %}</w:t>
+      </w:r>
+    </w:p>
+    <w:p>
+      <w:pPr>
+        <w:spacing w:after="0" w:line="240" w:lineRule="auto"/>
+        <w:rPr>
+          <w:rFonts w:asciiTheme="minorBidi" w:eastAsia="Times New Roman" w:hAnsiTheme="minorBidi"/>
+          <w:b/>
+          <w:bCs/>
+          <w:color w:val="003D83"/>
+          <w:lang w:bidi="fa-IR"/>
+        </w:rPr>
+      </w:pPr>
+      <w:r>
+        <w:rPr>
+          <w:rFonts w:asciiTheme="minorBidi" w:eastAsia="Times New Roman" w:hAnsiTheme="minorBidi"/>
+          <w:b/>
+          <w:bCs/>
+          <w:color w:val="003D83"/>
+          <w:lang w:bidi="fa-IR"/>
+        </w:rPr>
+        <w:t>Spacer Results</w:t>
+      </w:r>
+    </w:p>
+    <w:tbl>
+      <w:tblPr>
+        <w:tblW w:w="10651" w:type="dxa"/>
+        <w:jc w:val="center"/>
+        <w:tblLook w:val="04A0" w:firstRow="1" w:lastRow="0" w:firstColumn="1" w:lastColumn="0" w:noHBand="0" w:noVBand="1"/>
+      </w:tblPr>
+      <w:tblGrid>
+        <w:gridCol w:w="2056"/>
+        <w:gridCol w:w="1795"/>
+        <w:gridCol w:w="1795"/>
+        <w:gridCol w:w="1698"/>
+        <w:gridCol w:w="1563"/>
+        <w:gridCol w:w="1744"/>
+      </w:tblGrid>
+      <w:tr>
+        <w:trPr>
+          <w:trHeight w:val="285"/>
+          <w:jc w:val="center"/>
+        </w:trPr>
+        <w:tc>
+          <w:tcPr>
+            <w:tcW w:w="10651" w:type="dxa"/>
+            <w:gridSpan w:val="6"/>
+            <w:tcBorders>
+              <w:top w:val="single" w:sz="4" w:space="0" w:color="auto"/>
+              <w:left w:val="single" w:sz="4" w:space="0" w:color="auto"/>
+              <w:bottom w:val="single" w:sz="4" w:space="0" w:color="auto"/>
+              <w:right w:val="single" w:sz="4" w:space="0" w:color="000000"/>
+            </w:tcBorders>
+            <w:shd w:val="clear" w:color="000000" w:fill="003D83"/>
+            <w:noWrap/>
+            <w:vAlign w:val="center"/>
+            <w:hideMark/>
+          </w:tcPr>
+          <w:p>
+            <w:pPr>
+              <w:spacing w:after="0" w:line="240" w:lineRule="auto"/>
+              <w:ind w:firstLine="0"/>
+              <w:rPr>
+                <w:rFonts w:asciiTheme="minorBidi" w:eastAsia="Times New Roman" w:hAnsiTheme="minorBidi"/>
+                <w:b/>
+                <w:bCs/>
+                <w:color w:val="FFFFFF"/>
+                <w:sz w:val="20"/>
+                <w:szCs w:val="20"/>
+                <w:lang w:bidi="fa-IR"/>
+              </w:rPr>
+            </w:pPr>
+            <w:r>
+              <w:rPr>
+                <w:rFonts w:asciiTheme="minorBidi" w:eastAsia="Times New Roman" w:hAnsiTheme="minorBidi"/>
+                <w:b/>
+                <w:bCs/>
+                <w:color w:val="FFFFFF"/>
+                <w:sz w:val="20"/>
+                <w:szCs w:val="20"/>
+                <w:lang w:bidi="fa-IR"/>
+              </w:rPr>
+              <w:t>Spacer Lab Results</w:t>
+            </w:r>
+          </w:p>
+        </w:tc>
+      </w:tr>
+      <w:tr>
+        <w:trPr>
+          <w:trHeight w:val="285"/>
+          <w:jc w:val="center"/>
+        </w:trPr>
+        <w:tc>
+          <w:tcPr>
+            <w:tcW w:w="2056" w:type="dxa"/>
+            <w:tcBorders>
+              <w:top w:val="nil"/>
+              <w:left w:val="single" w:sz="4" w:space="0" w:color="auto"/>
+              <w:bottom w:val="single" w:sz="4" w:space="0" w:color="auto"/>
+              <w:right w:val="single" w:sz="4" w:space="0" w:color="auto"/>
+            </w:tcBorders>
+            <w:noWrap/>
+            <w:vAlign w:val="center"/>
+            <w:hideMark/>
+          </w:tcPr>
+          <w:p>
+            <w:pPr>
+              <w:pStyle w:val="NormalTab"/>
+            </w:pPr>
+            <w:r>
+              <w:t>Material Type</w:t>
+            </w:r>
+          </w:p>
+        </w:tc>
+        <w:tc>
+          <w:tcPr>
+            <w:tcW w:w="1795" w:type="dxa"/>
+            <w:tcBorders>
+              <w:top w:val="nil"/>
+              <w:left w:val="nil"/>
+              <w:bottom w:val="single" w:sz="4" w:space="0" w:color="auto"/>
+              <w:right w:val="single" w:sz="4" w:space="0" w:color="auto"/>
+            </w:tcBorders>
+            <w:noWrap/>
+            <w:vAlign w:val="center"/>
+            <w:hideMark/>
+          </w:tcPr>
+          <w:p>
+            <w:pPr>
+              <w:pStyle w:val="NormalTab"/>
+            </w:pPr>
+            <w:r>
+              <w:t>Code</w:t>
+            </w:r>
+          </w:p>
+        </w:tc>
+        <w:tc>
+          <w:tcPr>
+            <w:tcW w:w="1795" w:type="dxa"/>
+            <w:tcBorders>
+              <w:top w:val="nil"/>
+              <w:left w:val="nil"/>
+              <w:bottom w:val="single" w:sz="4" w:space="0" w:color="auto"/>
+              <w:right w:val="single" w:sz="4" w:space="0" w:color="auto"/>
+            </w:tcBorders>
+            <w:noWrap/>
+            <w:vAlign w:val="center"/>
+            <w:hideMark/>
+          </w:tcPr>
+          <w:p>
+            <w:pPr>
+              <w:pStyle w:val="NormalTab"/>
+            </w:pPr>
+            <w:r>
+              <w:t>Lot Number</w:t>
+            </w:r>
+          </w:p>
+        </w:tc>
+        <w:tc>
+          <w:tcPr>
+            <w:tcW w:w="1698" w:type="dxa"/>
+            <w:tcBorders>
+              <w:top w:val="nil"/>
+              <w:left w:val="nil"/>
+              <w:bottom w:val="single" w:sz="4" w:space="0" w:color="auto"/>
+              <w:right w:val="single" w:sz="4" w:space="0" w:color="auto"/>
+            </w:tcBorders>
+            <w:noWrap/>
+            <w:vAlign w:val="center"/>
+            <w:hideMark/>
+          </w:tcPr>
+          <w:p>
+            <w:pPr>
+              <w:pStyle w:val="NormalTab"/>
+            </w:pPr>
+            <w:r>
+              <w:t>Concentration</w:t>
+            </w:r>
+          </w:p>
+        </w:tc>
+        <w:tc>
+          <w:tcPr>
+            <w:tcW w:w="1563" w:type="dxa"/>
+            <w:tcBorders>
+              <w:top w:val="nil"/>
+              <w:left w:val="nil"/>
+              <w:bottom w:val="single" w:sz="4" w:space="0" w:color="auto"/>
+              <w:right w:val="single" w:sz="4" w:space="0" w:color="auto"/>
+            </w:tcBorders>
+            <w:noWrap/>
+            <w:vAlign w:val="center"/>
+            <w:hideMark/>
+          </w:tcPr>
+          <w:p>
+            <w:pPr>
+              <w:pStyle w:val="NormalTab"/>
+            </w:pPr>
+            <w:r>
+              <w:t>Design Unit</w:t>
+            </w:r>
+          </w:p>
+        </w:tc>
+        <w:tc>
+          <w:tcPr>
+            <w:tcW w:w="1744" w:type="dxa"/>
+            <w:tcBorders>
+              <w:top w:val="nil"/>
+              <w:left w:val="nil"/>
+              <w:bottom w:val="single" w:sz="4" w:space="0" w:color="auto"/>
+              <w:right w:val="single" w:sz="4" w:space="0" w:color="auto"/>
+            </w:tcBorders>
+            <w:noWrap/>
+            <w:vAlign w:val="center"/>
+            <w:hideMark/>
+          </w:tcPr>
+          <w:p>
+            <w:pPr>
+              <w:pStyle w:val="NormalTab"/>
+            </w:pPr>
+            <w:r>
+              <w:t>Mass (g/600 mL)</w:t>
+            </w:r>
+          </w:p>
+        </w:tc>
+      </w:tr>
+      <w:tr>
+        <w:trPr>
+          <w:trHeight w:val="285"/>
+          <w:jc w:val="center"/>
+        </w:trPr>
+        <w:tc>
+          <w:tcPr>
+            <w:tcW w:w="2056" w:type="dxa"/>
+            <w:tcBorders>
+              <w:top w:val="nil"/>
+              <w:left w:val="single" w:sz="4" w:space="0" w:color="auto"/>
+              <w:bottom w:val="single" w:sz="4" w:space="0" w:color="auto"/>
+              <w:right w:val="single" w:sz="4" w:space="0" w:color="auto"/>
+            </w:tcBorders>
+            <w:noWrap/>
+            <w:vAlign w:val="center"/>
+          </w:tcPr>
+          <w:p>
+            <w:pPr>
+              <w:pStyle w:val="NormalTab"/>
+            </w:pPr>
+            <w:r>
+              <w:t>{%tr for r in standalone_spacer.lab_rows %}</w:t>
+            </w:r>
+          </w:p>
+        </w:tc>
+        <w:tc>
+          <w:tcPr>
+            <w:tcW w:w="1795" w:type="dxa"/>
+            <w:tcBorders>
+              <w:top w:val="nil"/>
+              <w:left w:val="nil"/>
+              <w:bottom w:val="single" w:sz="4" w:space="0" w:color="auto"/>
+              <w:right w:val="single" w:sz="4" w:space="0" w:color="auto"/>
+            </w:tcBorders>
+            <w:noWrap/>
+            <w:vAlign w:val="center"/>
+          </w:tcPr>
+          <w:p>
+            <w:pPr>
+              <w:pStyle w:val="NormalTab"/>
+            </w:pPr>
+            <w:r>
+              <w:t/>
+            </w:r>
+          </w:p>
+        </w:tc>
+        <w:tc>
+          <w:tcPr>
+            <w:tcW w:w="1795" w:type="dxa"/>
+            <w:tcBorders>
+              <w:top w:val="nil"/>
+              <w:left w:val="nil"/>
+              <w:bottom w:val="single" w:sz="4" w:space="0" w:color="auto"/>
+              <w:right w:val="single" w:sz="4" w:space="0" w:color="auto"/>
+            </w:tcBorders>
+            <w:noWrap/>
+            <w:vAlign w:val="center"/>
+          </w:tcPr>
+          <w:p>
+            <w:pPr>
+              <w:pStyle w:val="NormalTab"/>
+            </w:pPr>
+            <w:r>
+              <w:t/>
+            </w:r>
+          </w:p>
+        </w:tc>
+        <w:tc>
+          <w:tcPr>
+            <w:tcW w:w="1698" w:type="dxa"/>
+            <w:tcBorders>
+              <w:top w:val="nil"/>
+              <w:left w:val="nil"/>
+              <w:bottom w:val="single" w:sz="4" w:space="0" w:color="auto"/>
+              <w:right w:val="single" w:sz="4" w:space="0" w:color="auto"/>
+            </w:tcBorders>
+            <w:noWrap/>
+            <w:vAlign w:val="center"/>
+          </w:tcPr>
+          <w:p>
+            <w:pPr>
+              <w:pStyle w:val="NormalTab"/>
+            </w:pPr>
+            <w:r>
+              <w:t/>
+            </w:r>
+          </w:p>
+        </w:tc>
+        <w:tc>
+          <w:tcPr>
+            <w:tcW w:w="1563" w:type="dxa"/>
+            <w:tcBorders>
+              <w:top w:val="nil"/>
+              <w:left w:val="nil"/>
+              <w:bottom w:val="single" w:sz="4" w:space="0" w:color="auto"/>
+              <w:right w:val="single" w:sz="4" w:space="0" w:color="auto"/>
+            </w:tcBorders>
+            <w:noWrap/>
+            <w:vAlign w:val="center"/>
+          </w:tcPr>
+          <w:p>
+            <w:pPr>
+              <w:pStyle w:val="NormalTab"/>
+            </w:pPr>
+            <w:r>
+              <w:t/>
+            </w:r>
+          </w:p>
+        </w:tc>
+        <w:tc>
+          <w:tcPr>
+            <w:tcW w:w="1744" w:type="dxa"/>
+            <w:tcBorders>
+              <w:top w:val="nil"/>
+              <w:left w:val="nil"/>
+              <w:bottom w:val="single" w:sz="4" w:space="0" w:color="auto"/>
+              <w:right w:val="single" w:sz="4" w:space="0" w:color="auto"/>
+            </w:tcBorders>
+            <w:noWrap/>
+            <w:vAlign w:val="center"/>
+          </w:tcPr>
+          <w:p>
+            <w:pPr>
+              <w:pStyle w:val="NormalTab"/>
+              <w:rPr>
+                <w:rFonts w:ascii="Arial" w:hAnsi="Arial" w:cs="Arial"/>
+              </w:rPr>
+            </w:pPr>
+            <w:r>
+              <w:t/>
+            </w:r>
+          </w:p>
+        </w:tc>
+      </w:tr>
+      <w:tr>
+        <w:trPr>
+          <w:trHeight w:val="285"/>
+          <w:jc w:val="center"/>
+        </w:trPr>
+        <w:tc>
+          <w:tcPr>
+            <w:tcW w:w="2056" w:type="dxa"/>
+            <w:tcBorders>
+              <w:top w:val="nil"/>
+              <w:left w:val="single" w:sz="4" w:space="0" w:color="auto"/>
+              <w:bottom w:val="single" w:sz="4" w:space="0" w:color="auto"/>
+              <w:right w:val="single" w:sz="4" w:space="0" w:color="auto"/>
+            </w:tcBorders>
+            <w:noWrap/>
+            <w:vAlign w:val="center"/>
+          </w:tcPr>
+          <w:p>
+            <w:pPr>
+              <w:pStyle w:val="NormalTab"/>
+            </w:pPr>
+            <w:r>
+              <w:t>{{ r["Material Type"] }}</w:t>
+            </w:r>
+          </w:p>
+        </w:tc>
+        <w:tc>
+          <w:tcPr>
+            <w:tcW w:w="1795" w:type="dxa"/>
+            <w:tcBorders>
+              <w:top w:val="nil"/>
+              <w:left w:val="nil"/>
+              <w:bottom w:val="single" w:sz="4" w:space="0" w:color="auto"/>
+              <w:right w:val="single" w:sz="4" w:space="0" w:color="auto"/>
+            </w:tcBorders>
+            <w:noWrap/>
+            <w:vAlign w:val="center"/>
+          </w:tcPr>
+          <w:p>
+            <w:pPr>
+              <w:pStyle w:val="NormalTab"/>
+            </w:pPr>
+            <w:r>
+              <w:t>{{ r["Code"] }}</w:t>
+            </w:r>
+          </w:p>
+        </w:tc>
+        <w:tc>
+          <w:tcPr>
+            <w:tcW w:w="1795" w:type="dxa"/>
+            <w:tcBorders>
+              <w:top w:val="nil"/>
+              <w:left w:val="nil"/>
+              <w:bottom w:val="single" w:sz="4" w:space="0" w:color="auto"/>
+              <w:right w:val="single" w:sz="4" w:space="0" w:color="auto"/>
+            </w:tcBorders>
+            <w:noWrap/>
+            <w:vAlign w:val="center"/>
+          </w:tcPr>
+          <w:p>
+            <w:pPr>
+              <w:pStyle w:val="NormalTab"/>
+            </w:pPr>
+            <w:r>
+              <w:t>{{ r["Lot Number"] }}</w:t>
+            </w:r>
+          </w:p>
+        </w:tc>
+        <w:tc>
+          <w:tcPr>
+            <w:tcW w:w="1698" w:type="dxa"/>
+            <w:tcBorders>
+              <w:top w:val="nil"/>
+              <w:left w:val="nil"/>
+              <w:bottom w:val="single" w:sz="4" w:space="0" w:color="auto"/>
+              <w:right w:val="single" w:sz="4" w:space="0" w:color="auto"/>
+            </w:tcBorders>
+            <w:noWrap/>
+            <w:vAlign w:val="center"/>
+          </w:tcPr>
+          <w:p>
+            <w:pPr>
+              <w:pStyle w:val="NormalTab"/>
+            </w:pPr>
+            <w:r>
+              <w:t>{{ r["Concentration"] }}</w:t>
+            </w:r>
+          </w:p>
+        </w:tc>
+        <w:tc>
+          <w:tcPr>
+            <w:tcW w:w="1563" w:type="dxa"/>
+            <w:tcBorders>
+              <w:top w:val="nil"/>
+              <w:left w:val="nil"/>
+              <w:bottom w:val="single" w:sz="4" w:space="0" w:color="auto"/>
+              <w:right w:val="single" w:sz="4" w:space="0" w:color="auto"/>
+            </w:tcBorders>
+            <w:noWrap/>
+            <w:vAlign w:val="center"/>
+          </w:tcPr>
+          <w:p>
+            <w:pPr>
+              <w:pStyle w:val="NormalTab"/>
+            </w:pPr>
+            <w:r>
+              <w:t>{{ r["Design Unit"] }}</w:t>
+            </w:r>
+          </w:p>
+        </w:tc>
+        <w:tc>
+          <w:tcPr>
+            <w:tcW w:w="1744" w:type="dxa"/>
+            <w:tcBorders>
+              <w:top w:val="nil"/>
+              <w:left w:val="nil"/>
+              <w:bottom w:val="single" w:sz="4" w:space="0" w:color="auto"/>
+              <w:right w:val="single" w:sz="4" w:space="0" w:color="auto"/>
+            </w:tcBorders>
+            <w:noWrap/>
+            <w:vAlign w:val="center"/>
+          </w:tcPr>
+          <w:p>
+            <w:pPr>
+              <w:pStyle w:val="NormalTab"/>
+              <w:rPr>
+                <w:rFonts w:ascii="Arial" w:hAnsi="Arial" w:cs="Arial"/>
+              </w:rPr>
+            </w:pPr>
+            <w:r>
+              <w:t>{{ r["Mass"] }}</w:t>
+            </w:r>
+          </w:p>
+        </w:tc>
+      </w:tr>
+      <w:tr>
+        <w:trPr>
+          <w:trHeight w:val="285"/>
+          <w:jc w:val="center"/>
+        </w:trPr>
+        <w:tc>
+          <w:tcPr>
+            <w:tcW w:w="2056" w:type="dxa"/>
+            <w:tcBorders>
+              <w:top w:val="nil"/>
+              <w:left w:val="single" w:sz="4" w:space="0" w:color="auto"/>
+              <w:bottom w:val="single" w:sz="4" w:space="0" w:color="auto"/>
+              <w:right w:val="single" w:sz="4" w:space="0" w:color="auto"/>
+            </w:tcBorders>
+            <w:noWrap/>
+            <w:vAlign w:val="center"/>
+          </w:tcPr>
+          <w:p>
+            <w:pPr>
+              <w:pStyle w:val="NormalTab"/>
+            </w:pPr>
+            <w:r>
+              <w:t>{%tr endfor %}</w:t>
+            </w:r>
+          </w:p>
+        </w:tc>
+        <w:tc>
+          <w:tcPr>
+            <w:tcW w:w="1795" w:type="dxa"/>
+            <w:tcBorders>
+              <w:top w:val="nil"/>
+              <w:left w:val="nil"/>
+              <w:bottom w:val="single" w:sz="4" w:space="0" w:color="auto"/>
+              <w:right w:val="single" w:sz="4" w:space="0" w:color="auto"/>
+            </w:tcBorders>
+            <w:noWrap/>
+            <w:vAlign w:val="center"/>
+          </w:tcPr>
+          <w:p>
+            <w:pPr>
+              <w:pStyle w:val="NormalTab"/>
+            </w:pPr>
+            <w:r>
+              <w:t/>
+            </w:r>
+          </w:p>
+        </w:tc>
+        <w:tc>
+          <w:tcPr>
+            <w:tcW w:w="1795" w:type="dxa"/>
+            <w:tcBorders>
+              <w:top w:val="nil"/>
+              <w:left w:val="nil"/>
+              <w:bottom w:val="single" w:sz="4" w:space="0" w:color="auto"/>
+              <w:right w:val="single" w:sz="4" w:space="0" w:color="auto"/>
+            </w:tcBorders>
+            <w:noWrap/>
+            <w:vAlign w:val="center"/>
+          </w:tcPr>
+          <w:p>
+            <w:pPr>
+              <w:pStyle w:val="NormalTab"/>
+            </w:pPr>
+            <w:r>
+              <w:t/>
+            </w:r>
+          </w:p>
+        </w:tc>
+        <w:tc>
+          <w:tcPr>
+            <w:tcW w:w="1698" w:type="dxa"/>
+            <w:tcBorders>
+              <w:top w:val="nil"/>
+              <w:left w:val="nil"/>
+              <w:bottom w:val="single" w:sz="4" w:space="0" w:color="auto"/>
+              <w:right w:val="single" w:sz="4" w:space="0" w:color="auto"/>
+            </w:tcBorders>
+            <w:noWrap/>
+            <w:vAlign w:val="center"/>
+          </w:tcPr>
+          <w:p>
+            <w:pPr>
+              <w:pStyle w:val="NormalTab"/>
+            </w:pPr>
+            <w:r>
+              <w:t/>
+            </w:r>
+          </w:p>
+        </w:tc>
+        <w:tc>
+          <w:tcPr>
+            <w:tcW w:w="1563" w:type="dxa"/>
+            <w:tcBorders>
+              <w:top w:val="nil"/>
+              <w:left w:val="nil"/>
+              <w:bottom w:val="single" w:sz="4" w:space="0" w:color="auto"/>
+              <w:right w:val="single" w:sz="4" w:space="0" w:color="auto"/>
+            </w:tcBorders>
+            <w:noWrap/>
+            <w:vAlign w:val="center"/>
+          </w:tcPr>
+          <w:p>
+            <w:pPr>
+              <w:pStyle w:val="NormalTab"/>
+            </w:pPr>
+            <w:r>
+              <w:t/>
+            </w:r>
+          </w:p>
+        </w:tc>
+        <w:tc>
+          <w:tcPr>
+            <w:tcW w:w="1744" w:type="dxa"/>
+            <w:tcBorders>
+              <w:top w:val="nil"/>
+              <w:left w:val="nil"/>
+              <w:bottom w:val="single" w:sz="4" w:space="0" w:color="auto"/>
+              <w:right w:val="single" w:sz="4" w:space="0" w:color="auto"/>
+            </w:tcBorders>
+            <w:noWrap/>
+            <w:vAlign w:val="center"/>
+          </w:tcPr>
+          <w:p>
+            <w:pPr>
+              <w:pStyle w:val="NormalTab"/>
+              <w:rPr>
+                <w:rFonts w:ascii="Arial" w:hAnsi="Arial" w:cs="Arial"/>
+              </w:rPr>
+            </w:pPr>
+            <w:r>
+              <w:t/>
+            </w:r>
+          </w:p>
+        </w:tc>
+      </w:tr>
+      <w:tr>
+        <w:trPr>
+          <w:trHeight w:val="285"/>
+          <w:jc w:val="center"/>
+        </w:trPr>
+        <w:tc>
+          <w:tcPr>
+            <w:tcW w:w="2056" w:type="dxa"/>
+            <w:tcBorders>
+              <w:top w:val="nil"/>
+              <w:left w:val="single" w:sz="4" w:space="0" w:color="auto"/>
+              <w:bottom w:val="single" w:sz="4" w:space="0" w:color="auto"/>
+              <w:right w:val="single" w:sz="4" w:space="0" w:color="auto"/>
+            </w:tcBorders>
+            <w:noWrap/>
+            <w:vAlign w:val="center"/>
+          </w:tcPr>
+          <w:p>
+            <w:pPr>
+              <w:pStyle w:val="NormalTab"/>
+            </w:pPr>
+            <w:r>
+              <w:t>Total Mass</w:t>
+            </w:r>
+          </w:p>
+        </w:tc>
+        <w:tc>
+          <w:tcPr>
+            <w:tcW w:w="1795" w:type="dxa"/>
+            <w:tcBorders>
+              <w:top w:val="nil"/>
+              <w:left w:val="nil"/>
+              <w:bottom w:val="single" w:sz="4" w:space="0" w:color="auto"/>
+              <w:right w:val="single" w:sz="4" w:space="0" w:color="auto"/>
+            </w:tcBorders>
+            <w:noWrap/>
+            <w:vAlign w:val="center"/>
+          </w:tcPr>
+          <w:p>
+            <w:pPr>
+              <w:pStyle w:val="NormalTab"/>
+            </w:pPr>
+            <w:r>
+              <w:t/>
+            </w:r>
+          </w:p>
+        </w:tc>
+        <w:tc>
+          <w:tcPr>
+            <w:tcW w:w="1795" w:type="dxa"/>
+            <w:tcBorders>
+              <w:top w:val="nil"/>
+              <w:left w:val="nil"/>
+              <w:bottom w:val="single" w:sz="4" w:space="0" w:color="auto"/>
+              <w:right w:val="single" w:sz="4" w:space="0" w:color="auto"/>
+            </w:tcBorders>
+            <w:noWrap/>
+            <w:vAlign w:val="center"/>
+          </w:tcPr>
+          <w:p>
+            <w:pPr>
+              <w:pStyle w:val="NormalTab"/>
+            </w:pPr>
+            <w:r>
+              <w:t/>
+            </w:r>
+          </w:p>
+        </w:tc>
+        <w:tc>
+          <w:tcPr>
+            <w:tcW w:w="1698" w:type="dxa"/>
+            <w:tcBorders>
+              <w:top w:val="nil"/>
+              <w:left w:val="nil"/>
+              <w:bottom w:val="single" w:sz="4" w:space="0" w:color="auto"/>
+              <w:right w:val="single" w:sz="4" w:space="0" w:color="auto"/>
+            </w:tcBorders>
+            <w:noWrap/>
+            <w:vAlign w:val="center"/>
+          </w:tcPr>
+          <w:p>
+            <w:pPr>
+              <w:pStyle w:val="NormalTab"/>
+            </w:pPr>
+            <w:r>
+              <w:t/>
+            </w:r>
+          </w:p>
+        </w:tc>
+        <w:tc>
+          <w:tcPr>
+            <w:tcW w:w="1563" w:type="dxa"/>
+            <w:tcBorders>
+              <w:top w:val="nil"/>
+              <w:left w:val="nil"/>
+              <w:bottom w:val="single" w:sz="4" w:space="0" w:color="auto"/>
+              <w:right w:val="single" w:sz="4" w:space="0" w:color="auto"/>
+            </w:tcBorders>
+            <w:noWrap/>
+            <w:vAlign w:val="center"/>
+          </w:tcPr>
+          <w:p>
+            <w:pPr>
+              <w:pStyle w:val="NormalTab"/>
+            </w:pPr>
+            <w:r>
+              <w:t/>
+            </w:r>
+          </w:p>
+        </w:tc>
+        <w:tc>
+          <w:tcPr>
+            <w:tcW w:w="1744" w:type="dxa"/>
+            <w:tcBorders>
+              <w:top w:val="nil"/>
+              <w:left w:val="nil"/>
+              <w:bottom w:val="single" w:sz="4" w:space="0" w:color="auto"/>
+              <w:right w:val="single" w:sz="4" w:space="0" w:color="auto"/>
+            </w:tcBorders>
+            <w:noWrap/>
+            <w:vAlign w:val="center"/>
+          </w:tcPr>
+          <w:p>
+            <w:pPr>
+              <w:pStyle w:val="NormalTab"/>
+              <w:rPr>
+                <w:rFonts w:ascii="Arial" w:hAnsi="Arial" w:cs="Arial"/>
+              </w:rPr>
+            </w:pPr>
+            <w:r>
+              <w:t>{{ standalone_spacer.lab_mass_g }}</w:t>
+            </w:r>
+          </w:p>
+        </w:tc>
+      </w:tr>
+    </w:tbl>
+    <w:p>
+      <w:r>
+        <w:t/>
+      </w:r>
+    </w:p>
+    <w:tbl>
+      <w:tblPr>
+        <w:tblW w:w="6925" w:type="dxa"/>
+        <w:jc w:val="center"/>
+        <w:tblBorders>
+          <w:top w:val="single" w:sz="4" w:space="0" w:color="auto"/>
+          <w:left w:val="single" w:sz="4" w:space="0" w:color="auto"/>
+          <w:bottom w:val="single" w:sz="4" w:space="0" w:color="auto"/>
+          <w:right w:val="single" w:sz="4" w:space="0" w:color="auto"/>
+          <w:insideH w:val="single" w:sz="4" w:space="0" w:color="auto"/>
+          <w:insideV w:val="single" w:sz="4" w:space="0" w:color="auto"/>
+        </w:tblBorders>
+        <w:tblLook w:val="04A0" w:firstRow="1" w:lastRow="0" w:firstColumn="1" w:lastColumn="0" w:noHBand="0" w:noVBand="1"/>
+      </w:tblPr>
+      <w:tblGrid>
+        <w:gridCol w:w="1837"/>
+        <w:gridCol w:w="1569"/>
+        <w:gridCol w:w="1610"/>
+        <w:gridCol w:w="1909"/>
+      </w:tblGrid>
+      <w:tr>
+        <w:trPr>
+          <w:cantSplit/>
+          <w:trHeight w:val="287"/>
+          <w:jc w:val="center"/>
+        </w:trPr>
+        <w:tc>
+          <w:tcPr>
+            <w:tcW w:w="6925" w:type="dxa"/>
+            <w:gridSpan w:val="4"/>
+            <w:shd w:val="clear" w:color="auto" w:fill="003D83"/>
+            <w:vAlign w:val="center"/>
+          </w:tcPr>
+          <w:p>
+            <w:pPr>
+              <w:spacing w:after="0" w:line="240" w:lineRule="auto"/>
+              <w:rPr>
+                <w:rFonts w:asciiTheme="minorBidi" w:eastAsia="Times New Roman" w:hAnsiTheme="minorBidi"/>
+                <w:b/>
+                <w:bCs/>
+                <w:color w:val="003D83"/>
+                <w:sz w:val="20"/>
+                <w:szCs w:val="20"/>
+                <w:lang w:bidi="fa-IR"/>
+              </w:rPr>
+            </w:pPr>
+            <w:r>
+              <w:rPr>
+                <w:rFonts w:asciiTheme="minorBidi" w:eastAsia="Times New Roman" w:hAnsiTheme="minorBidi"/>
+                <w:b/>
+                <w:bCs/>
+                <w:color w:val="FFFFFF" w:themeColor="background1"/>
+                <w:sz w:val="20"/>
+                <w:szCs w:val="20"/>
+                <w:lang w:bidi="fa-IR"/>
+              </w:rPr>
+              <w:t>Spacer Rheology</w:t>
+            </w:r>
+          </w:p>
+        </w:tc>
+      </w:tr>
+      <w:tr>
+        <w:trPr>
+          <w:cantSplit/>
+          <w:trHeight w:val="287"/>
+          <w:jc w:val="center"/>
+        </w:trPr>
+        <w:tc>
+          <w:tcPr>
+            <w:tcW w:w="1837" w:type="dxa"/>
+            <w:shd w:val="clear" w:color="000000" w:fill="FFFFFF"/>
+            <w:vAlign w:val="center"/>
+            <w:hideMark/>
+          </w:tcPr>
+          <w:p>
+            <w:pPr>
+              <w:pStyle w:val="NormalTab"/>
+            </w:pPr>
+            <w:r>
+              <w:t>Temperature</w:t>
+            </w:r>
+          </w:p>
+        </w:tc>
+        <w:tc>
+          <w:tcPr>
+            <w:tcW w:w="1569" w:type="dxa"/>
+            <w:shd w:val="clear" w:color="000000" w:fill="FFFFFF"/>
+            <w:vAlign w:val="center"/>
+            <w:hideMark/>
+          </w:tcPr>
+          <w:p>
+            <w:pPr>
+              <w:pStyle w:val="NormalTab"/>
+            </w:pPr>
+            <w:proofErr w:type="spellStart"/>
+            <w:r>
+              <w:t>T</w:t>
+            </w:r>
+            <w:r>
+              <w:rPr>
+                <w:vertAlign w:val="subscript"/>
+              </w:rPr>
+              <w:t>start</w:t>
+            </w:r>
+            <w:proofErr w:type="spellEnd"/>
+            <w:r>
+              <w:t>: Surface</w:t>
+            </w:r>
+          </w:p>
+        </w:tc>
+        <w:tc>
+          <w:tcPr>
+            <w:tcW w:w="1610" w:type="dxa"/>
+            <w:shd w:val="clear" w:color="000000" w:fill="FFFFFF"/>
+            <w:vAlign w:val="center"/>
+          </w:tcPr>
+          <w:p>
+            <w:pPr>
+              <w:pStyle w:val="NormalTab"/>
+            </w:pPr>
+            <w:r>
+              <w:t>Tstart: {{ standalone_spacer.lab.bhct }} degF</w:t>
+            </w:r>
+          </w:p>
+        </w:tc>
+        <w:tc>
+          <w:tcPr>
+            <w:tcW w:w="1909" w:type="dxa"/>
+            <w:shd w:val="clear" w:color="000000" w:fill="FFFFFF"/>
+            <w:vAlign w:val="center"/>
+            <w:hideMark/>
+          </w:tcPr>
+          <w:p>
+            <w:pPr>
+              <w:pStyle w:val="NormalTab"/>
+            </w:pPr>
+            <w:r>
+              <w:t>Tstart: {{ standalone_spacer.lab.bhct }} degF</w:t>
+            </w:r>
+          </w:p>
+        </w:tc>
+      </w:tr>
+      <w:tr>
+        <w:trPr>
+          <w:cantSplit/>
+          <w:trHeight w:val="406"/>
+          <w:jc w:val="center"/>
+        </w:trPr>
+        <w:tc>
+          <w:tcPr>
+            <w:tcW w:w="1837" w:type="dxa"/>
+            <w:shd w:val="clear" w:color="000000" w:fill="FFFFFF"/>
+            <w:vAlign w:val="center"/>
+            <w:hideMark/>
+          </w:tcPr>
+          <w:p>
+            <w:pPr>
+              <w:pStyle w:val="NormalTab"/>
+            </w:pPr>
+            <w:r>
+              <w:t>RPM</w:t>
+            </w:r>
+          </w:p>
+        </w:tc>
+        <w:tc>
+          <w:tcPr>
+            <w:tcW w:w="1569" w:type="dxa"/>
+            <w:shd w:val="clear" w:color="000000" w:fill="FFFFFF"/>
+            <w:vAlign w:val="center"/>
+            <w:hideMark/>
+          </w:tcPr>
+          <w:p>
+            <w:pPr>
+              <w:pStyle w:val="NormalTab"/>
+            </w:pPr>
+            <w:r>
+              <w:t>Ramp-Down (deg)</w:t>
+            </w:r>
+          </w:p>
+        </w:tc>
+        <w:tc>
+          <w:tcPr>
+            <w:tcW w:w="1610" w:type="dxa"/>
+            <w:shd w:val="clear" w:color="000000" w:fill="FFFFFF"/>
+            <w:vAlign w:val="center"/>
+          </w:tcPr>
+          <w:p>
+            <w:pPr>
+              <w:pStyle w:val="NormalTab"/>
+            </w:pPr>
+            <w:r>
+              <w:t>Ramp-Up (deg)</w:t>
+            </w:r>
+          </w:p>
+        </w:tc>
+        <w:tc>
+          <w:tcPr>
+            <w:tcW w:w="1909" w:type="dxa"/>
+            <w:shd w:val="clear" w:color="000000" w:fill="FFFFFF"/>
+            <w:vAlign w:val="center"/>
+            <w:hideMark/>
+          </w:tcPr>
+          <w:p>
+            <w:pPr>
+              <w:pStyle w:val="NormalTab"/>
+            </w:pPr>
+            <w:r>
+              <w:t>Ramp-Down (deg)</w:t>
+            </w:r>
+          </w:p>
+        </w:tc>
+      </w:tr>
+      <w:tr>
+        <w:trPr>
+          <w:cantSplit/>
+          <w:trHeight w:val="287"/>
+          <w:jc w:val="center"/>
+        </w:trPr>
+        <w:tc>
+          <w:tcPr>
+            <w:tcW w:w="1837" w:type="dxa"/>
+            <w:shd w:val="clear" w:color="000000" w:fill="FFFFFF"/>
+            <w:vAlign w:val="center"/>
+            <w:hideMark/>
+          </w:tcPr>
+          <w:p>
+            <w:pPr>
+              <w:pStyle w:val="NormalTab"/>
+            </w:pPr>
+            <w:r>
+              <w:t>300</w:t>
+            </w:r>
+          </w:p>
+        </w:tc>
+        <w:tc>
+          <w:tcPr>
+            <w:tcW w:w="1569" w:type="dxa"/>
+            <w:shd w:val="clear" w:color="000000" w:fill="FFFFFF"/>
+            <w:vAlign w:val="center"/>
+          </w:tcPr>
+          <w:p>
+            <w:pPr>
+              <w:spacing w:after="0" w:line="240" w:lineRule="auto"/>
+              <w:ind w:firstLine="0"/>
+              <w:jc w:val="center"/>
+              <w:rPr>
+                <w:rFonts w:asciiTheme="minorBidi" w:eastAsia="Times New Roman" w:hAnsiTheme="minorBidi"/>
+                <w:color w:val="1F497D" w:themeColor="text2"/>
+                <w:sz w:val="20"/>
+                <w:szCs w:val="20"/>
+                <w:lang w:bidi="fa-IR"/>
+              </w:rPr>
+            </w:pPr>
+            <w:r>
+              <w:rPr>
+                <w:rFonts w:asciiTheme="minorBidi" w:eastAsia="Times New Roman" w:hAnsiTheme="minorBidi"/>
+                <w:color w:val="1F497D" w:themeColor="text2"/>
+                <w:sz w:val="20"/>
+                <w:szCs w:val="20"/>
+                <w:lang w:bidi="fa-IR"/>
+              </w:rPr>
+              <w:t>{{ standalone_spacer.lab.rheology.get('surface_down', {}).get('300', '-') }}</w:t>
+            </w:r>
+          </w:p>
+        </w:tc>
+        <w:tc>
+          <w:tcPr>
+            <w:tcW w:w="1610" w:type="dxa"/>
+            <w:shd w:val="clear" w:color="000000" w:fill="FFFFFF"/>
+          </w:tcPr>
+          <w:p>
+            <w:pPr>
+              <w:pStyle w:val="NormalTab"/>
+            </w:pPr>
+            <w:r>
+              <w:t>{{ standalone_spacer.lab.rheology.get('bhct_up', {}).get('300', '-') }}</w:t>
+            </w:r>
+          </w:p>
+        </w:tc>
+        <w:tc>
+          <w:tcPr>
+            <w:tcW w:w="1909" w:type="dxa"/>
+            <w:shd w:val="clear" w:color="000000" w:fill="FFFFFF"/>
+            <w:vAlign w:val="center"/>
+          </w:tcPr>
+          <w:p>
+            <w:pPr>
+              <w:pStyle w:val="NormalTab"/>
+            </w:pPr>
+            <w:r>
+              <w:t>{{ standalone_spacer.lab.rheology.get('bhct_down', {}).get('300', '-') }}</w:t>
+            </w:r>
+          </w:p>
+        </w:tc>
+      </w:tr>
+      <w:tr>
+        <w:trPr>
+          <w:cantSplit/>
+          <w:trHeight w:val="287"/>
+          <w:jc w:val="center"/>
+        </w:trPr>
+        <w:tc>
+          <w:tcPr>
+            <w:tcW w:w="1837" w:type="dxa"/>
+            <w:shd w:val="clear" w:color="000000" w:fill="FFFFFF"/>
+            <w:vAlign w:val="center"/>
+            <w:hideMark/>
+          </w:tcPr>
+          <w:p>
+            <w:pPr>
+              <w:pStyle w:val="NormalTab"/>
+            </w:pPr>
+            <w:r>
+              <w:t>200</w:t>
+            </w:r>
+          </w:p>
+        </w:tc>
+        <w:tc>
+          <w:tcPr>
+            <w:tcW w:w="1569" w:type="dxa"/>
+            <w:shd w:val="clear" w:color="000000" w:fill="FFFFFF"/>
+            <w:vAlign w:val="center"/>
+          </w:tcPr>
+          <w:p>
+            <w:pPr>
+              <w:spacing w:after="0" w:line="240" w:lineRule="auto"/>
+              <w:ind w:firstLine="0"/>
+              <w:jc w:val="center"/>
+              <w:rPr>
+                <w:rFonts w:asciiTheme="minorBidi" w:eastAsia="Times New Roman" w:hAnsiTheme="minorBidi"/>
+                <w:color w:val="1F497D" w:themeColor="text2"/>
+                <w:sz w:val="20"/>
+                <w:szCs w:val="20"/>
+                <w:lang w:bidi="fa-IR"/>
+              </w:rPr>
+            </w:pPr>
+            <w:r>
+              <w:rPr>
+                <w:rFonts w:asciiTheme="minorBidi" w:eastAsia="Times New Roman" w:hAnsiTheme="minorBidi"/>
+                <w:color w:val="1F497D" w:themeColor="text2"/>
+                <w:sz w:val="20"/>
+                <w:szCs w:val="20"/>
+                <w:lang w:bidi="fa-IR"/>
+              </w:rPr>
+              <w:t>{{ standalone_spacer.lab.rheology.get('surface_down', {}).get('200', '-') }}</w:t>
+            </w:r>
+          </w:p>
+        </w:tc>
+        <w:tc>
+          <w:tcPr>
+            <w:tcW w:w="1610" w:type="dxa"/>
+            <w:shd w:val="clear" w:color="000000" w:fill="FFFFFF"/>
+          </w:tcPr>
+          <w:p>
+            <w:pPr>
+              <w:pStyle w:val="NormalTab"/>
+            </w:pPr>
+            <w:r>
+              <w:t>{{ standalone_spacer.lab.rheology.get('bhct_up', {}).get('200', '-') }}</w:t>
+            </w:r>
+          </w:p>
+        </w:tc>
+        <w:tc>
+          <w:tcPr>
+            <w:tcW w:w="1909" w:type="dxa"/>
+            <w:shd w:val="clear" w:color="000000" w:fill="FFFFFF"/>
+            <w:vAlign w:val="center"/>
+          </w:tcPr>
+          <w:p>
+            <w:pPr>
+              <w:pStyle w:val="NormalTab"/>
+            </w:pPr>
+            <w:r>
+              <w:t>{{ standalone_spacer.lab.rheology.get('bhct_down', {}).get('200', '-') }}</w:t>
+            </w:r>
+          </w:p>
+        </w:tc>
+      </w:tr>
+      <w:tr>
+        <w:trPr>
+          <w:cantSplit/>
+          <w:trHeight w:val="287"/>
+          <w:jc w:val="center"/>
+        </w:trPr>
+        <w:tc>
+          <w:tcPr>
+            <w:tcW w:w="1837" w:type="dxa"/>
+            <w:shd w:val="clear" w:color="000000" w:fill="FFFFFF"/>
+            <w:vAlign w:val="center"/>
+            <w:hideMark/>
+          </w:tcPr>
+          <w:p>
+            <w:pPr>
+              <w:pStyle w:val="NormalTab"/>
+            </w:pPr>
+            <w:r>
+              <w:t>100</w:t>
+            </w:r>
+          </w:p>
+        </w:tc>
+        <w:tc>
+          <w:tcPr>
+            <w:tcW w:w="1569" w:type="dxa"/>
+            <w:shd w:val="clear" w:color="000000" w:fill="FFFFFF"/>
+            <w:vAlign w:val="center"/>
+          </w:tcPr>
+          <w:p>
+            <w:pPr>
+              <w:spacing w:after="0" w:line="240" w:lineRule="auto"/>
+              <w:ind w:firstLine="0"/>
+              <w:jc w:val="center"/>
+              <w:rPr>
+                <w:rFonts w:asciiTheme="minorBidi" w:eastAsia="Times New Roman" w:hAnsiTheme="minorBidi"/>
+                <w:color w:val="1F497D" w:themeColor="text2"/>
+                <w:sz w:val="20"/>
+                <w:szCs w:val="20"/>
+                <w:lang w:bidi="fa-IR"/>
+              </w:rPr>
+            </w:pPr>
+            <w:r>
+              <w:rPr>
+                <w:rFonts w:asciiTheme="minorBidi" w:eastAsia="Times New Roman" w:hAnsiTheme="minorBidi"/>
+                <w:color w:val="1F497D" w:themeColor="text2"/>
+                <w:sz w:val="20"/>
+                <w:szCs w:val="20"/>
+                <w:lang w:bidi="fa-IR"/>
+              </w:rPr>
+              <w:t>{{ standalone_spacer.lab.rheology.get('surface_down', {}).get('100', '-') }}</w:t>
+            </w:r>
+          </w:p>
+        </w:tc>
+        <w:tc>
+          <w:tcPr>
+            <w:tcW w:w="1610" w:type="dxa"/>
+            <w:shd w:val="clear" w:color="000000" w:fill="FFFFFF"/>
+          </w:tcPr>
+          <w:p>
+            <w:pPr>
+              <w:pStyle w:val="NormalTab"/>
+            </w:pPr>
+            <w:r>
+              <w:t>{{ standalone_spacer.lab.rheology.get('bhct_up', {}).get('100', '-') }}</w:t>
+            </w:r>
+          </w:p>
+        </w:tc>
+        <w:tc>
+          <w:tcPr>
+            <w:tcW w:w="1909" w:type="dxa"/>
+            <w:shd w:val="clear" w:color="000000" w:fill="FFFFFF"/>
+            <w:vAlign w:val="center"/>
+          </w:tcPr>
+          <w:p>
+            <w:pPr>
+              <w:pStyle w:val="NormalTab"/>
+            </w:pPr>
+            <w:r>
+              <w:t>{{ standalone_spacer.lab.rheology.get('bhct_down', {}).get('100', '-') }}</w:t>
+            </w:r>
+          </w:p>
+        </w:tc>
+      </w:tr>
+      <w:tr>
+        <w:trPr>
+          <w:cantSplit/>
+          <w:trHeight w:val="287"/>
+          <w:jc w:val="center"/>
+        </w:trPr>
+        <w:tc>
+          <w:tcPr>
+            <w:tcW w:w="1837" w:type="dxa"/>
+            <w:shd w:val="clear" w:color="000000" w:fill="FFFFFF"/>
+            <w:vAlign w:val="center"/>
+            <w:hideMark/>
+          </w:tcPr>
+          <w:p>
+            <w:pPr>
+              <w:pStyle w:val="NormalTab"/>
+            </w:pPr>
+            <w:r>
+              <w:t>60</w:t>
+            </w:r>
+          </w:p>
+        </w:tc>
+        <w:tc>
+          <w:tcPr>
+            <w:tcW w:w="1569" w:type="dxa"/>
+            <w:shd w:val="clear" w:color="000000" w:fill="FFFFFF"/>
+            <w:vAlign w:val="center"/>
+          </w:tcPr>
+          <w:p>
+            <w:pPr>
+              <w:spacing w:after="0" w:line="240" w:lineRule="auto"/>
+              <w:ind w:firstLine="0"/>
+              <w:jc w:val="center"/>
+              <w:rPr>
+                <w:rFonts w:asciiTheme="minorBidi" w:eastAsia="Times New Roman" w:hAnsiTheme="minorBidi"/>
+                <w:color w:val="1F497D" w:themeColor="text2"/>
+                <w:sz w:val="20"/>
+                <w:szCs w:val="20"/>
+                <w:lang w:bidi="fa-IR"/>
+              </w:rPr>
+            </w:pPr>
+            <w:r>
+              <w:rPr>
+                <w:rFonts w:asciiTheme="minorBidi" w:eastAsia="Times New Roman" w:hAnsiTheme="minorBidi"/>
+                <w:color w:val="1F497D" w:themeColor="text2"/>
+                <w:sz w:val="20"/>
+                <w:szCs w:val="20"/>
+                <w:lang w:bidi="fa-IR"/>
+              </w:rPr>
+              <w:t>{{ standalone_spacer.lab.rheology.get('surface_down', {}).get('60', '-') }}</w:t>
+            </w:r>
+          </w:p>
+        </w:tc>
+        <w:tc>
+          <w:tcPr>
+            <w:tcW w:w="1610" w:type="dxa"/>
+            <w:shd w:val="clear" w:color="000000" w:fill="FFFFFF"/>
+          </w:tcPr>
+          <w:p>
+            <w:pPr>
+              <w:pStyle w:val="NormalTab"/>
+            </w:pPr>
+            <w:r>
+              <w:t>{{ standalone_spacer.lab.rheology.get('bhct_up', {}).get('60', '-') }}</w:t>
+            </w:r>
+          </w:p>
+        </w:tc>
+        <w:tc>
+          <w:tcPr>
+            <w:tcW w:w="1909" w:type="dxa"/>
+            <w:shd w:val="clear" w:color="000000" w:fill="FFFFFF"/>
+            <w:vAlign w:val="center"/>
+          </w:tcPr>
+          <w:p>
+            <w:pPr>
+              <w:pStyle w:val="NormalTab"/>
+            </w:pPr>
+            <w:r>
+              <w:t>{{ standalone_spacer.lab.rheology.get('bhct_down', {}).get('60', '-') }}</w:t>
+            </w:r>
+          </w:p>
+        </w:tc>
+      </w:tr>
+      <w:tr>
+        <w:trPr>
+          <w:cantSplit/>
+          <w:trHeight w:val="287"/>
+          <w:jc w:val="center"/>
+        </w:trPr>
+        <w:tc>
+          <w:tcPr>
+            <w:tcW w:w="1837" w:type="dxa"/>
+            <w:shd w:val="clear" w:color="000000" w:fill="FFFFFF"/>
+            <w:vAlign w:val="center"/>
+            <w:hideMark/>
+          </w:tcPr>
+          <w:p>
+            <w:pPr>
+              <w:pStyle w:val="NormalTab"/>
+            </w:pPr>
+            <w:r>
+              <w:t>30</w:t>
+            </w:r>
+          </w:p>
+        </w:tc>
+        <w:tc>
+          <w:tcPr>
+            <w:tcW w:w="1569" w:type="dxa"/>
+            <w:shd w:val="clear" w:color="000000" w:fill="FFFFFF"/>
+            <w:vAlign w:val="center"/>
+          </w:tcPr>
+          <w:p>
+            <w:pPr>
+              <w:spacing w:after="0" w:line="240" w:lineRule="auto"/>
+              <w:ind w:firstLine="0"/>
+              <w:jc w:val="center"/>
+              <w:rPr>
+                <w:rFonts w:asciiTheme="minorBidi" w:eastAsia="Times New Roman" w:hAnsiTheme="minorBidi"/>
+                <w:color w:val="1F497D" w:themeColor="text2"/>
+                <w:sz w:val="20"/>
+                <w:szCs w:val="20"/>
+                <w:lang w:bidi="fa-IR"/>
+              </w:rPr>
+            </w:pPr>
+            <w:r>
+              <w:rPr>
+                <w:rFonts w:asciiTheme="minorBidi" w:eastAsia="Times New Roman" w:hAnsiTheme="minorBidi"/>
+                <w:color w:val="1F497D" w:themeColor="text2"/>
+                <w:sz w:val="20"/>
+                <w:szCs w:val="20"/>
+                <w:lang w:bidi="fa-IR"/>
+              </w:rPr>
+              <w:t>{{ standalone_spacer.lab.rheology.get('surface_down', {}).get('30', '-') }}</w:t>
+            </w:r>
+          </w:p>
+        </w:tc>
+        <w:tc>
+          <w:tcPr>
+            <w:tcW w:w="1610" w:type="dxa"/>
+            <w:shd w:val="clear" w:color="000000" w:fill="FFFFFF"/>
+          </w:tcPr>
+          <w:p>
+            <w:pPr>
+              <w:pStyle w:val="NormalTab"/>
+            </w:pPr>
+            <w:r>
+              <w:t>{{ standalone_spacer.lab.rheology.get('bhct_up', {}).get('30', '-') }}</w:t>
+            </w:r>
+          </w:p>
+        </w:tc>
+        <w:tc>
+          <w:tcPr>
+            <w:tcW w:w="1909" w:type="dxa"/>
+            <w:shd w:val="clear" w:color="000000" w:fill="FFFFFF"/>
+            <w:vAlign w:val="center"/>
+          </w:tcPr>
+          <w:p>
+            <w:pPr>
+              <w:pStyle w:val="NormalTab"/>
+            </w:pPr>
+            <w:r>
+              <w:t>{{ standalone_spacer.lab.rheology.get('bhct_down', {}).get('30', '-') }}</w:t>
+            </w:r>
+          </w:p>
+        </w:tc>
+      </w:tr>
+      <w:tr>
+        <w:trPr>
+          <w:cantSplit/>
+          <w:trHeight w:val="287"/>
+          <w:jc w:val="center"/>
+        </w:trPr>
+        <w:tc>
+          <w:tcPr>
+            <w:tcW w:w="1837" w:type="dxa"/>
+            <w:shd w:val="clear" w:color="000000" w:fill="FFFFFF"/>
+            <w:vAlign w:val="center"/>
+            <w:hideMark/>
+          </w:tcPr>
+          <w:p>
+            <w:pPr>
+              <w:pStyle w:val="NormalTab"/>
+            </w:pPr>
+            <w:r>
+              <w:t>6</w:t>
+            </w:r>
+          </w:p>
+        </w:tc>
+        <w:tc>
+          <w:tcPr>
+            <w:tcW w:w="1569" w:type="dxa"/>
+            <w:shd w:val="clear" w:color="000000" w:fill="FFFFFF"/>
+            <w:vAlign w:val="center"/>
+          </w:tcPr>
+          <w:p>
+            <w:pPr>
+              <w:spacing w:after="0" w:line="240" w:lineRule="auto"/>
+              <w:ind w:firstLine="0"/>
+              <w:jc w:val="center"/>
+              <w:rPr>
+                <w:rFonts w:asciiTheme="minorBidi" w:eastAsia="Times New Roman" w:hAnsiTheme="minorBidi"/>
+                <w:color w:val="1F497D" w:themeColor="text2"/>
+                <w:sz w:val="20"/>
+                <w:szCs w:val="20"/>
+                <w:lang w:bidi="fa-IR"/>
+              </w:rPr>
+            </w:pPr>
+            <w:r>
+              <w:rPr>
+                <w:rFonts w:asciiTheme="minorBidi" w:eastAsia="Times New Roman" w:hAnsiTheme="minorBidi"/>
+                <w:color w:val="1F497D" w:themeColor="text2"/>
+                <w:sz w:val="20"/>
+                <w:szCs w:val="20"/>
+                <w:lang w:bidi="fa-IR"/>
+              </w:rPr>
+              <w:t>{{ standalone_spacer.lab.rheology.get('surface_down', {}).get('6', '-') }}</w:t>
+            </w:r>
+          </w:p>
+        </w:tc>
+        <w:tc>
+          <w:tcPr>
+            <w:tcW w:w="1610" w:type="dxa"/>
+            <w:shd w:val="clear" w:color="000000" w:fill="FFFFFF"/>
+          </w:tcPr>
+          <w:p>
+            <w:pPr>
+              <w:pStyle w:val="NormalTab"/>
+            </w:pPr>
+            <w:r>
+              <w:t>{{ standalone_spacer.lab.rheology.get('bhct_up', {}).get('6', '-') }}</w:t>
+            </w:r>
+          </w:p>
+        </w:tc>
+        <w:tc>
+          <w:tcPr>
+            <w:tcW w:w="1909" w:type="dxa"/>
+            <w:shd w:val="clear" w:color="000000" w:fill="FFFFFF"/>
+            <w:vAlign w:val="center"/>
+          </w:tcPr>
+          <w:p>
+            <w:pPr>
+              <w:pStyle w:val="NormalTab"/>
+            </w:pPr>
+            <w:r>
+              <w:t>{{ standalone_spacer.lab.rheology.get('bhct_down', {}).get('6', '-') }}</w:t>
+            </w:r>
+          </w:p>
+        </w:tc>
+      </w:tr>
+      <w:tr>
+        <w:trPr>
+          <w:cantSplit/>
+          <w:trHeight w:val="287"/>
+          <w:jc w:val="center"/>
+        </w:trPr>
+        <w:tc>
+          <w:tcPr>
+            <w:tcW w:w="1837" w:type="dxa"/>
+            <w:shd w:val="clear" w:color="000000" w:fill="FFFFFF"/>
+            <w:vAlign w:val="center"/>
+            <w:hideMark/>
+          </w:tcPr>
+          <w:p>
+            <w:pPr>
+              <w:pStyle w:val="NormalTab"/>
+            </w:pPr>
+            <w:r>
+              <w:t>3</w:t>
+            </w:r>
+          </w:p>
+        </w:tc>
+        <w:tc>
+          <w:tcPr>
+            <w:tcW w:w="1569" w:type="dxa"/>
+            <w:shd w:val="clear" w:color="000000" w:fill="FFFFFF"/>
+            <w:vAlign w:val="center"/>
+          </w:tcPr>
+          <w:p>
+            <w:pPr>
+              <w:spacing w:after="0" w:line="240" w:lineRule="auto"/>
+              <w:ind w:firstLine="0"/>
+              <w:jc w:val="center"/>
+              <w:rPr>
+                <w:rFonts w:asciiTheme="minorBidi" w:eastAsia="Times New Roman" w:hAnsiTheme="minorBidi"/>
+                <w:color w:val="1F497D" w:themeColor="text2"/>
+                <w:sz w:val="20"/>
+                <w:szCs w:val="20"/>
+                <w:lang w:bidi="fa-IR"/>
+              </w:rPr>
+            </w:pPr>
+            <w:r>
+              <w:rPr>
+                <w:rFonts w:asciiTheme="minorBidi" w:eastAsia="Times New Roman" w:hAnsiTheme="minorBidi"/>
+                <w:color w:val="1F497D" w:themeColor="text2"/>
+                <w:sz w:val="20"/>
+                <w:szCs w:val="20"/>
+                <w:lang w:bidi="fa-IR"/>
+              </w:rPr>
+              <w:t>{{ standalone_spacer.lab.rheology.get('surface_down', {}).get('3', '-') }}</w:t>
+            </w:r>
+          </w:p>
+        </w:tc>
+        <w:tc>
+          <w:tcPr>
+            <w:tcW w:w="1610" w:type="dxa"/>
+            <w:shd w:val="clear" w:color="000000" w:fill="FFFFFF"/>
+          </w:tcPr>
+          <w:p>
+            <w:pPr>
+              <w:pStyle w:val="NormalTab"/>
+            </w:pPr>
+            <w:r>
+              <w:t>{{ standalone_spacer.lab.rheology.get('bhct_up', {}).get('3', '-') }}</w:t>
+            </w:r>
+          </w:p>
+        </w:tc>
+        <w:tc>
+          <w:tcPr>
+            <w:tcW w:w="1909" w:type="dxa"/>
+            <w:shd w:val="clear" w:color="000000" w:fill="FFFFFF"/>
+            <w:vAlign w:val="center"/>
+          </w:tcPr>
+          <w:p>
+            <w:pPr>
+              <w:pStyle w:val="NormalTab"/>
+            </w:pPr>
+            <w:r>
+              <w:t>{{ standalone_spacer.lab.rheology.get('bhct_down', {}).get('3', '-') }}</w:t>
+            </w:r>
+          </w:p>
+        </w:tc>
+      </w:tr>
+      <w:tr>
+        <w:trPr>
+          <w:cantSplit/>
+          <w:trHeight w:val="287"/>
+          <w:jc w:val="center"/>
+        </w:trPr>
+        <w:tc>
+          <w:tcPr>
+            <w:tcW w:w="1837" w:type="dxa"/>
+            <w:shd w:val="clear" w:color="000000" w:fill="FFFFFF"/>
+            <w:vAlign w:val="center"/>
+            <w:hideMark/>
+          </w:tcPr>
+          <w:p>
+            <w:pPr>
+              <w:pStyle w:val="NormalTab"/>
+            </w:pPr>
+            <w:proofErr w:type="spellStart"/>
+            <w:r>
+              <w:t>Pv</w:t>
+            </w:r>
+            <w:proofErr w:type="spellEnd"/>
+            <w:r>
+              <w:t xml:space="preserve"> (</w:t>
+            </w:r>
+            <w:proofErr w:type="spellStart"/>
+            <w:r>
+              <w:t>cP</w:t>
+            </w:r>
+            <w:proofErr w:type="spellEnd"/>
+            <w:r>
+              <w:t>)</w:t>
+            </w:r>
+          </w:p>
+        </w:tc>
+        <w:tc>
+          <w:tcPr>
+            <w:tcW w:w="1569" w:type="dxa"/>
+            <w:shd w:val="clear" w:color="000000" w:fill="FFFFFF"/>
+            <w:vAlign w:val="center"/>
+          </w:tcPr>
+          <w:p>
+            <w:pPr>
+              <w:spacing w:after="0" w:line="240" w:lineRule="auto"/>
+              <w:ind w:firstLine="0"/>
+              <w:jc w:val="center"/>
+              <w:rPr>
+                <w:rFonts w:asciiTheme="minorBidi" w:eastAsia="Times New Roman" w:hAnsiTheme="minorBidi"/>
+                <w:color w:val="1F497D" w:themeColor="text2"/>
+                <w:sz w:val="20"/>
+                <w:szCs w:val="20"/>
+                <w:lang w:bidi="fa-IR"/>
+              </w:rPr>
+            </w:pPr>
+            <w:r>
+              <w:rPr>
+                <w:rFonts w:asciiTheme="minorBidi" w:eastAsia="Times New Roman" w:hAnsiTheme="minorBidi"/>
+                <w:color w:val="1F497D" w:themeColor="text2"/>
+                <w:sz w:val="20"/>
+                <w:szCs w:val="20"/>
+                <w:lang w:bidi="fa-IR"/>
+              </w:rPr>
+              <w:t>{{ standalone_spacer.lab.rheology.get('surface_down', {}).get('pv_cp', '-') }}</w:t>
+            </w:r>
+          </w:p>
+        </w:tc>
+        <w:tc>
+          <w:tcPr>
+            <w:tcW w:w="1610" w:type="dxa"/>
+            <w:shd w:val="clear" w:color="000000" w:fill="FFFFFF"/>
+          </w:tcPr>
+          <w:p>
+            <w:pPr>
+              <w:pStyle w:val="NormalTab"/>
+            </w:pPr>
+            <w:r>
+              <w:t>{{ standalone_spacer.lab.rheology.get('bhct_up', {}).get('pv_cp', '-') }}</w:t>
+            </w:r>
+          </w:p>
+        </w:tc>
+        <w:tc>
+          <w:tcPr>
+            <w:tcW w:w="1909" w:type="dxa"/>
+            <w:shd w:val="clear" w:color="000000" w:fill="FFFFFF"/>
+            <w:vAlign w:val="center"/>
+          </w:tcPr>
+          <w:p>
+            <w:pPr>
+              <w:pStyle w:val="NormalTab"/>
+            </w:pPr>
+            <w:r>
+              <w:t>{{ standalone_spacer.lab.rheology.get('bhct_down', {}).get('pv_cp', '-') }}</w:t>
+            </w:r>
+          </w:p>
+        </w:tc>
+      </w:tr>
+      <w:tr>
+        <w:trPr>
+          <w:cantSplit/>
+          <w:trHeight w:val="287"/>
+          <w:jc w:val="center"/>
+        </w:trPr>
+        <w:tc>
+          <w:tcPr>
+            <w:tcW w:w="1837" w:type="dxa"/>
+            <w:shd w:val="clear" w:color="000000" w:fill="FFFFFF"/>
+            <w:vAlign w:val="center"/>
+            <w:hideMark/>
+          </w:tcPr>
+          <w:p>
+            <w:pPr>
+              <w:pStyle w:val="NormalTab"/>
+            </w:pPr>
+            <w:r>
+              <w:t>Ty (</w:t>
+            </w:r>
+            <w:proofErr w:type="spellStart"/>
+            <w:r>
+              <w:t>lbf</w:t>
+            </w:r>
+            <w:proofErr w:type="spellEnd"/>
+            <w:r>
+              <w:t>/100ft</w:t>
+            </w:r>
+            <w:r>
+              <w:rPr>
+                <w:vertAlign w:val="superscript"/>
+              </w:rPr>
+              <w:t>2</w:t>
+            </w:r>
+            <w:r>
+              <w:t>)</w:t>
+            </w:r>
+          </w:p>
+        </w:tc>
+        <w:tc>
+          <w:tcPr>
+            <w:tcW w:w="1569" w:type="dxa"/>
+            <w:shd w:val="clear" w:color="000000" w:fill="FFFFFF"/>
+            <w:vAlign w:val="center"/>
+          </w:tcPr>
+          <w:p>
+            <w:pPr>
+              <w:spacing w:after="0" w:line="240" w:lineRule="auto"/>
+              <w:ind w:firstLine="0"/>
+              <w:jc w:val="center"/>
+              <w:rPr>
+                <w:rFonts w:asciiTheme="minorBidi" w:eastAsia="Times New Roman" w:hAnsiTheme="minorBidi"/>
+                <w:color w:val="1F497D" w:themeColor="text2"/>
+                <w:sz w:val="20"/>
+                <w:szCs w:val="20"/>
+                <w:lang w:bidi="fa-IR"/>
+              </w:rPr>
+            </w:pPr>
+            <w:r>
+              <w:rPr>
+                <w:rFonts w:asciiTheme="minorBidi" w:eastAsia="Times New Roman" w:hAnsiTheme="minorBidi"/>
+                <w:color w:val="1F497D" w:themeColor="text2"/>
+                <w:sz w:val="20"/>
+                <w:szCs w:val="20"/>
+                <w:lang w:bidi="fa-IR"/>
+              </w:rPr>
+              <w:t>{{ standalone_spacer.lab.rheology.get('surface_down', {}).get('ty_lbf_100ft2', '-') }}</w:t>
+            </w:r>
+          </w:p>
+        </w:tc>
+        <w:tc>
+          <w:tcPr>
+            <w:tcW w:w="1610" w:type="dxa"/>
+            <w:shd w:val="clear" w:color="000000" w:fill="FFFFFF"/>
+          </w:tcPr>
+          <w:p>
+            <w:pPr>
+              <w:pStyle w:val="NormalTab"/>
+            </w:pPr>
+            <w:r>
+              <w:t>{{ standalone_spacer.lab.rheology.get('bhct_up', {}).get('ty_lbf_100ft2', '-') }}</w:t>
+            </w:r>
+          </w:p>
+        </w:tc>
+        <w:tc>
+          <w:tcPr>
+            <w:tcW w:w="1909" w:type="dxa"/>
+            <w:shd w:val="clear" w:color="000000" w:fill="FFFFFF"/>
+            <w:vAlign w:val="center"/>
+          </w:tcPr>
+          <w:p>
+            <w:pPr>
+              <w:pStyle w:val="NormalTab"/>
+            </w:pPr>
+            <w:r>
+              <w:t>{{ standalone_spacer.lab.rheology.get('bhct_down', {}).get('ty_lbf_100ft2', '-') }}</w:t>
+            </w:r>
+          </w:p>
+        </w:tc>
+      </w:tr>
+      <w:tr>
+        <w:trPr>
+          <w:cantSplit/>
+          <w:trHeight w:val="287"/>
+          <w:jc w:val="center"/>
+        </w:trPr>
+        <w:tc>
+          <w:tcPr>
+            <w:tcW w:w="1837" w:type="dxa"/>
+            <w:shd w:val="clear" w:color="000000" w:fill="FFFFFF"/>
+            <w:vAlign w:val="center"/>
+            <w:hideMark/>
+          </w:tcPr>
+          <w:p>
+            <w:pPr>
+              <w:pStyle w:val="NormalTab"/>
+            </w:pPr>
+            <w:r>
+              <w:t>10 Sec Gel (deg)</w:t>
+            </w:r>
+          </w:p>
+        </w:tc>
+        <w:tc>
+          <w:tcPr>
+            <w:tcW w:w="1569" w:type="dxa"/>
+            <w:shd w:val="clear" w:color="000000" w:fill="FFFFFF"/>
+            <w:vAlign w:val="center"/>
+          </w:tcPr>
+          <w:p>
+            <w:pPr>
+              <w:pStyle w:val="NormalTab"/>
+            </w:pPr>
+            <w:r>
+              <w:t>{{ standalone_spacer.lab.rheology.get('surface_down', {}).get('gel_10_sec', '-') }}</w:t>
+            </w:r>
+          </w:p>
+        </w:tc>
+        <w:tc>
+          <w:tcPr>
+            <w:tcW w:w="1610" w:type="dxa"/>
+            <w:shd w:val="clear" w:color="000000" w:fill="FFFFFF"/>
+            <w:vAlign w:val="center"/>
+          </w:tcPr>
+          <w:p>
+            <w:pPr>
+              <w:pStyle w:val="NormalTab"/>
+            </w:pPr>
+            <w:r>
+              <w:t>{{ standalone_spacer.lab.rheology.get('bhct_up', {}).get('gel_10_sec', '-') }}</w:t>
+            </w:r>
+          </w:p>
+        </w:tc>
+        <w:tc>
+          <w:tcPr>
+            <w:tcW w:w="1909" w:type="dxa"/>
+            <w:shd w:val="clear" w:color="000000" w:fill="FFFFFF"/>
+            <w:vAlign w:val="center"/>
+          </w:tcPr>
+          <w:p>
+            <w:pPr>
+              <w:pStyle w:val="NormalTab"/>
+            </w:pPr>
+            <w:r>
+              <w:t>{{ standalone_spacer.lab.rheology.get('bhct_down', {}).get('gel_10_sec', '-') }}</w:t>
+            </w:r>
+          </w:p>
+        </w:tc>
+      </w:tr>
+      <w:tr>
+        <w:trPr>
+          <w:cantSplit/>
+          <w:trHeight w:val="287"/>
+          <w:jc w:val="center"/>
+        </w:trPr>
+        <w:tc>
+          <w:tcPr>
+            <w:tcW w:w="1837" w:type="dxa"/>
+            <w:shd w:val="clear" w:color="000000" w:fill="FFFFFF"/>
+            <w:vAlign w:val="center"/>
+            <w:hideMark/>
+          </w:tcPr>
+          <w:p>
+            <w:pPr>
+              <w:pStyle w:val="NormalTab"/>
+            </w:pPr>
+            <w:r>
+              <w:t>10 Min Gel (deg)</w:t>
+            </w:r>
+          </w:p>
+        </w:tc>
+        <w:tc>
+          <w:tcPr>
+            <w:tcW w:w="1569" w:type="dxa"/>
+            <w:shd w:val="clear" w:color="000000" w:fill="FFFFFF"/>
+            <w:vAlign w:val="center"/>
+          </w:tcPr>
+          <w:p>
+            <w:pPr>
+              <w:pStyle w:val="NormalTab"/>
+            </w:pPr>
+            <w:r>
+              <w:t>{{ standalone_spacer.lab.rheology.get('surface_down', {}).get('gel_10_min', '-') }}</w:t>
+            </w:r>
+          </w:p>
+        </w:tc>
+        <w:tc>
+          <w:tcPr>
+            <w:tcW w:w="1610" w:type="dxa"/>
+            <w:shd w:val="clear" w:color="000000" w:fill="FFFFFF"/>
+            <w:vAlign w:val="center"/>
+          </w:tcPr>
+          <w:p>
+            <w:pPr>
+              <w:pStyle w:val="NormalTab"/>
+            </w:pPr>
+            <w:r>
+              <w:t>{{ standalone_spacer.lab.rheology.get('bhct_up', {}).get('gel_10_min', '-') }}</w:t>
+            </w:r>
+          </w:p>
+        </w:tc>
+        <w:tc>
+          <w:tcPr>
+            <w:tcW w:w="1909" w:type="dxa"/>
+            <w:shd w:val="clear" w:color="000000" w:fill="FFFFFF"/>
+            <w:vAlign w:val="center"/>
+          </w:tcPr>
+          <w:p>
+            <w:pPr>
+              <w:pStyle w:val="NormalTab"/>
+            </w:pPr>
+            <w:r>
+              <w:t>{{ standalone_spacer.lab.rheology.get('bhct_down', {}).get('gel_10_min', '-') }}</w:t>
+            </w:r>
+          </w:p>
+        </w:tc>
+      </w:tr>
+    </w:tbl>
+    <w:p>
+      <w:r>
+        <w:t>{%p endif %}</w:t>
       </w:r>
     </w:p>
     <w:p>

</xml_diff>

<commit_message>
fix(word): finish Post-B4 presentation and guardrail checks
Neutralize only Section IX sample cells while preserving all other DOCX parts.
Normalize missing Hardware values only in the Word context and display CT
procedure durations once in decimal minutes without altering source arithmetic.

Exclude only the volatile generated timestamp from the chemical-draft context
comparison; retain all other protected assertions and exact identity checks.

Verified 428 retained focused passes, 38 permanent guardrails, and 217 relevant
passes plus 18 subtests. Representative DOCX/PDF structure and page comparisons
passed. Full Repository Regression remains deferred to Round 13B certification.
</commit_message>
<xml_diff>
--- a/master_template.docx
+++ b/master_template.docx
@@ -22583,7 +22583,7 @@
               </w:rPr>
             </w:pPr>
             <w:r>
-              <w:t>0.0 m</w:t>
+              <w:t>-</w:t>
             </w:r>
           </w:p>
         </w:tc>
@@ -22631,7 +22631,7 @@
               </w:rPr>
             </w:pPr>
             <w:r>
-              <w:t>75</w:t>
+              <w:t>-</w:t>
             </w:r>
           </w:p>
         </w:tc>
@@ -22682,7 +22682,7 @@
               </w:rPr>
             </w:pPr>
             <w:r>
-              <w:t>3286.9 m</w:t>
+              <w:t>-</w:t>
             </w:r>
           </w:p>
         </w:tc>
@@ -22730,7 +22730,7 @@
               </w:rPr>
             </w:pPr>
             <w:r>
-              <w:t>43</w:t>
+              <w:t>-</w:t>
             </w:r>
           </w:p>
         </w:tc>
@@ -22781,7 +22781,7 @@
               </w:rPr>
             </w:pPr>
             <w:r>
-              <w:t>3293.0 m</w:t>
+              <w:t>-</w:t>
             </w:r>
           </w:p>
         </w:tc>
@@ -22829,7 +22829,7 @@
               </w:rPr>
             </w:pPr>
             <w:r>
-              <w:t>32</w:t>
+              <w:t>-</w:t>
             </w:r>
           </w:p>
         </w:tc>
@@ -23076,7 +23076,7 @@
               </w:rPr>
             </w:pPr>
             <w:r>
-              <w:t>2122.6</w:t>
+              <w:t>-</w:t>
             </w:r>
           </w:p>
         </w:tc>
@@ -23100,7 +23100,7 @@
               </w:rPr>
             </w:pPr>
             <w:r>
-              <w:t>43</w:t>
+              <w:t>-</w:t>
             </w:r>
           </w:p>
         </w:tc>
@@ -23124,7 +23124,7 @@
               </w:rPr>
             </w:pPr>
             <w:r>
-              <w:t>1/4</w:t>
+              <w:t>-</w:t>
             </w:r>
           </w:p>
         </w:tc>
@@ -23148,7 +23148,7 @@
               </w:rPr>
             </w:pPr>
             <w:r>
-              <w:t>Rigid</w:t>
+              <w:t>-</w:t>
             </w:r>
           </w:p>
         </w:tc>
@@ -23172,7 +23172,7 @@
               </w:rPr>
             </w:pPr>
             <w:r>
-              <w:t>100.0</w:t>
+              <w:t>-</w:t>
             </w:r>
           </w:p>
         </w:tc>
@@ -23196,7 +23196,7 @@
               </w:rPr>
             </w:pPr>
             <w:r>
-              <w:t>2116.5</w:t>
+              <w:t>-</w:t>
             </w:r>
           </w:p>
         </w:tc>
@@ -23226,7 +23226,7 @@
               </w:rPr>
             </w:pPr>
             <w:r>
-              <w:t>3293.0</w:t>
+              <w:t>-</w:t>
             </w:r>
           </w:p>
         </w:tc>
@@ -23250,7 +23250,7 @@
               </w:rPr>
             </w:pPr>
             <w:r>
-              <w:t>32</w:t>
+              <w:t>-</w:t>
             </w:r>
           </w:p>
         </w:tc>
@@ -23274,7 +23274,7 @@
               </w:rPr>
             </w:pPr>
             <w:r>
-              <w:t>1/3</w:t>
+              <w:t>-</w:t>
             </w:r>
           </w:p>
         </w:tc>
@@ -23297,7 +23297,7 @@
               </w:rPr>
             </w:pPr>
             <w:r>
-              <w:t>Spring</w:t>
+              <w:t>-</w:t>
             </w:r>
           </w:p>
         </w:tc>
@@ -23321,7 +23321,7 @@
               </w:rPr>
             </w:pPr>
             <w:r>
-              <w:t>100.0</w:t>
+              <w:t>-</w:t>
             </w:r>
           </w:p>
         </w:tc>
@@ -23345,7 +23345,7 @@
               </w:rPr>
             </w:pPr>
             <w:r>
-              <w:t>3293.0</w:t>
+              <w:t>-</w:t>
             </w:r>
           </w:p>
         </w:tc>

</xml_diff>

<commit_message>
fix(uat14c): finalize spacer lab and thickening presentation
</commit_message>
<xml_diff>
--- a/master_template.docx
+++ b/master_template.docx
@@ -18669,7 +18669,7 @@
               <w:pStyle w:val="NormalTab"/>
             </w:pPr>
             <w:r>
-              <w:t>Enter Time</w:t>
+              <w:t>Initial Temp</w:t>
             </w:r>
             <w:r>
               <w:br/>
@@ -18677,7 +18677,7 @@
             </w:r>
             <w:proofErr w:type="spellStart"/>
             <w:r>
-              <w:t>hr:mm</w:t>
+              <w:t>(degF)</w:t>
             </w:r>
             <w:proofErr w:type="spellEnd"/>
             <w:r>
@@ -18871,7 +18871,7 @@
               <w:pStyle w:val="NormalTab"/>
             </w:pPr>
             <w:r>
-              <w:t xml:space="preserve">{{ s.lab.thickening_enter_time }}</w:t>
+              <w:t xml:space="preserve">70</w:t>
             </w:r>
           </w:p>
         </w:tc>
@@ -18886,7 +18886,7 @@
               <w:pStyle w:val="NormalTab"/>
             </w:pPr>
             <w:r>
-              <w:t xml:space="preserve">-</w:t>
+              <w:t xml:space="preserve">Surface</w:t>
             </w:r>
           </w:p>
         </w:tc>

</xml_diff>